<commit_message>
fix report formula rendering
</commit_message>
<xml_diff>
--- a/report/intelligent_speech_processing_paper/ace_step_isp_lora_voice_conversion_paper.docx
+++ b/report/intelligent_speech_processing_paper/ace_step_isp_lora_voice_conversion_paper.docx
@@ -77,7 +77,7 @@
           <w:b w:val="0"/>
           <w:sz w:val="21"/>
         </w:rPr>
-        <w:t>面向智能语音处理课程中“可生成、可转换、可复现”的综合音频处理需求，本文设计并实现了一个集成 ACE-Step 音乐生成、LoRA 参数高效适配、Demucs 人声分离和 Seed-VC 歌声音色转换的原型系统。与仅依赖文本转语音或提示词工程的方法不同，本文把音乐生成和歌声音色转换拆分为两个独立实验变量：前者通过同 seed baseline/LoRA 对照考察目标数据域适配效果，后者通过源歌曲内容表征、基频轨迹和授权目标音色嵌入实现声线替换，并将转换后人声与伴奏重新混合为新歌曲。系统在网页端记录任务 20260601_190120_voice_conversion_55d07c42 的完整证据链，包含分离音轨、转换人声、重混音频、命令日志、JSON 元数据和波形频谱诊断图；同时对长音频任务记录输入时长、扩散步数、CFG、去沙哑强度、情感力度保留参数和推理资源估计，使异常任务也能被用于误差定位。实验结果表明，该任务完成 290.0 秒音频的端到端处理，输出 BPM=97.5、RMS=0.1285、低频比例=0.4983，Seed-VC 离线推理 RTF 约为 19.53。对整曲任务，系统记录时长约 279.7 秒、扩散步数 30、CFG=0.75、预计耗时约 230.3 分钟，并采用短片段筛参、整曲离线复核的实验策略管理长音频推理成本。本文重点讨论内容保持、音色迁移、音高控制、分轨失败回退、沙哑伪影修复和任务级可追溯性，为智能语音处理课程项目提供一条可验证的工程实现路径。项目源代码仓库地址：https://github.com/anmoryli/edm-adapter。</w:t>
+        <w:t>面向智能语音处理课程中“可生成、可转换、可复现”的综合音频处理需求，本文设计并实现了一个集成 ACE-Step 音乐生成、LoRA 参数高效适配、Demucs 人声分离和 Seed-VC 歌声音色转换的原型系统。与仅依赖文本转语音或提示词工程的方法不同，本文把音乐生成和歌声音色转换拆分为两个独立实验变量：前者通过同 seed baseline/LoRA 对照考察目标数据域适配效果，后者通过源歌曲内容表征、基频轨迹和授权目标音色嵌入实现声线替换，并将转换后人声与伴奏重新混合为新歌曲。系统在网页端记录任务 20260603_093222_voice_conversion_d703c93b 的完整证据链，包含分离音轨、转换人声、重混音频、命令日志、JSON 元数据和波形频谱诊断图；同时对长音频任务记录输入时长、扩散步数、CFG、去沙哑强度、情感力度保留参数和推理资源估计，使异常任务也能被用于误差定位。实验结果表明，该任务完成 279.7 秒音频的端到端处理，输出 BPM=136.0、RMS=0.1363、低频比例=0.3401，Seed-VC 离线推理 RTF 约为 19.30。对整曲任务，系统记录时长约 279.7 秒、扩散步数 50、CFG=0.75、预计耗时约 381.8 分钟，并采用短片段筛参、整曲离线复核的实验策略管理长音频推理成本。本文重点讨论内容保持、音色迁移、音高控制、分轨失败回退、沙哑伪影修复和任务级可追溯性，为智能语音处理课程项目提供一条可验证的工程实现路径。项目源代码仓库地址：https://github.com/anmoryli/edm-adapter。</w:t>
       </w:r>
     </w:p>
     <w:p>
@@ -832,42 +832,173 @@
     </w:p>
     <w:p>
       <w:pPr>
-        <w:spacing w:before="80" w:after="80"/>
+        <w:keepLines/>
+        <w:spacing w:line="240" w:lineRule="auto" w:before="100" w:after="100"/>
         <w:jc w:val="center"/>
       </w:pPr>
       <w:r>
-        <w:drawing>
-          <wp:inline xmlns:a="http://schemas.openxmlformats.org/drawingml/2006/main" xmlns:pic="http://schemas.openxmlformats.org/drawingml/2006/picture">
-            <wp:extent cx="4389120" cy="340636"/>
-            <wp:docPr id="3" name="Picture 3"/>
-            <wp:cNvGraphicFramePr>
-              <a:graphicFrameLocks noChangeAspect="1"/>
-            </wp:cNvGraphicFramePr>
-            <a:graphic>
-              <a:graphicData uri="http://schemas.openxmlformats.org/drawingml/2006/picture">
-                <pic:pic>
-                  <pic:nvPicPr>
-                    <pic:cNvPr id="0" name="formula_93bc7eb808.png"/>
-                    <pic:cNvPicPr/>
-                  </pic:nvPicPr>
-                  <pic:blipFill>
-                    <a:blip r:embed="rId14"/>
-                    <a:stretch>
-                      <a:fillRect/>
-                    </a:stretch>
-                  </pic:blipFill>
-                  <pic:spPr>
-                    <a:xfrm>
-                      <a:off x="0" y="0"/>
-                      <a:ext cx="4389120" cy="340636"/>
-                    </a:xfrm>
-                    <a:prstGeom prst="rect"/>
-                  </pic:spPr>
-                </pic:pic>
-              </a:graphicData>
-            </a:graphic>
-          </wp:inline>
-        </w:drawing>
+        <w:rPr>
+          <w:rFonts w:ascii="Times New Roman" w:hAnsi="Times New Roman" w:eastAsia="SimSun"/>
+          <w:b w:val="0"/>
+          <w:i/>
+          <w:sz w:val="23"/>
+        </w:rPr>
+        <w:t>y</w:t>
+      </w:r>
+      <w:r>
+        <w:rPr>
+          <w:rFonts w:ascii="Times New Roman" w:hAnsi="Times New Roman" w:eastAsia="SimSun"/>
+          <w:b w:val="0"/>
+          <w:i/>
+          <w:sz w:val="23"/>
+          <w:vertAlign w:val="subscript"/>
+        </w:rPr>
+        <w:t>vc</w:t>
+      </w:r>
+      <w:r>
+        <w:rPr>
+          <w:rFonts w:ascii="Times New Roman" w:hAnsi="Times New Roman" w:eastAsia="SimSun"/>
+          <w:b w:val="0"/>
+          <w:i w:val="0"/>
+          <w:sz w:val="23"/>
+        </w:rPr>
+        <w:t xml:space="preserve"> = Vocoder(SeedVC(</w:t>
+      </w:r>
+      <w:r>
+        <w:rPr>
+          <w:rFonts w:ascii="Times New Roman" w:hAnsi="Times New Roman" w:eastAsia="SimSun"/>
+          <w:b w:val="0"/>
+          <w:i/>
+          <w:sz w:val="23"/>
+        </w:rPr>
+        <w:t>C</w:t>
+      </w:r>
+      <w:r>
+        <w:rPr>
+          <w:rFonts w:ascii="Times New Roman" w:hAnsi="Times New Roman" w:eastAsia="SimSun"/>
+          <w:b w:val="0"/>
+          <w:i w:val="0"/>
+          <w:sz w:val="23"/>
+        </w:rPr>
+        <w:t>(</w:t>
+      </w:r>
+      <w:r>
+        <w:rPr>
+          <w:rFonts w:ascii="Times New Roman" w:hAnsi="Times New Roman" w:eastAsia="SimSun"/>
+          <w:b w:val="0"/>
+          <w:i/>
+          <w:sz w:val="23"/>
+        </w:rPr>
+        <w:t>x</w:t>
+      </w:r>
+      <w:r>
+        <w:rPr>
+          <w:rFonts w:ascii="Times New Roman" w:hAnsi="Times New Roman" w:eastAsia="SimSun"/>
+          <w:b w:val="0"/>
+          <w:i w:val="0"/>
+          <w:sz w:val="23"/>
+        </w:rPr>
+        <w:t xml:space="preserve">), </w:t>
+      </w:r>
+      <w:r>
+        <w:rPr>
+          <w:rFonts w:ascii="Times New Roman" w:hAnsi="Times New Roman" w:eastAsia="SimSun"/>
+          <w:b w:val="0"/>
+          <w:i/>
+          <w:sz w:val="23"/>
+        </w:rPr>
+        <w:t>F</w:t>
+      </w:r>
+      <w:r>
+        <w:rPr>
+          <w:rFonts w:ascii="Times New Roman" w:hAnsi="Times New Roman" w:eastAsia="SimSun"/>
+          <w:b w:val="0"/>
+          <w:i/>
+          <w:sz w:val="23"/>
+          <w:vertAlign w:val="subscript"/>
+        </w:rPr>
+        <w:t>0</w:t>
+      </w:r>
+      <w:r>
+        <w:rPr>
+          <w:rFonts w:ascii="Times New Roman" w:hAnsi="Times New Roman" w:eastAsia="SimSun"/>
+          <w:b w:val="0"/>
+          <w:i w:val="0"/>
+          <w:sz w:val="23"/>
+        </w:rPr>
+        <w:t>(</w:t>
+      </w:r>
+      <w:r>
+        <w:rPr>
+          <w:rFonts w:ascii="Times New Roman" w:hAnsi="Times New Roman" w:eastAsia="SimSun"/>
+          <w:b w:val="0"/>
+          <w:i/>
+          <w:sz w:val="23"/>
+        </w:rPr>
+        <w:t>x</w:t>
+      </w:r>
+      <w:r>
+        <w:rPr>
+          <w:rFonts w:ascii="Times New Roman" w:hAnsi="Times New Roman" w:eastAsia="SimSun"/>
+          <w:b w:val="0"/>
+          <w:i w:val="0"/>
+          <w:sz w:val="23"/>
+        </w:rPr>
+        <w:t>) + Δ</w:t>
+      </w:r>
+      <w:r>
+        <w:rPr>
+          <w:rFonts w:ascii="Times New Roman" w:hAnsi="Times New Roman" w:eastAsia="SimSun"/>
+          <w:b w:val="0"/>
+          <w:i/>
+          <w:sz w:val="23"/>
+        </w:rPr>
+        <w:t>p</w:t>
+      </w:r>
+      <w:r>
+        <w:rPr>
+          <w:rFonts w:ascii="Times New Roman" w:hAnsi="Times New Roman" w:eastAsia="SimSun"/>
+          <w:b w:val="0"/>
+          <w:i w:val="0"/>
+          <w:sz w:val="23"/>
+        </w:rPr>
+        <w:t xml:space="preserve">, </w:t>
+      </w:r>
+      <w:r>
+        <w:rPr>
+          <w:rFonts w:ascii="Times New Roman" w:hAnsi="Times New Roman" w:eastAsia="SimSun"/>
+          <w:b w:val="0"/>
+          <w:i/>
+          <w:sz w:val="23"/>
+        </w:rPr>
+        <w:t>e</w:t>
+      </w:r>
+      <w:r>
+        <w:rPr>
+          <w:rFonts w:ascii="Times New Roman" w:hAnsi="Times New Roman" w:eastAsia="SimSun"/>
+          <w:b w:val="0"/>
+          <w:i w:val="0"/>
+          <w:sz w:val="23"/>
+        </w:rPr>
+        <w:t>(</w:t>
+      </w:r>
+      <w:r>
+        <w:rPr>
+          <w:rFonts w:ascii="Times New Roman" w:hAnsi="Times New Roman" w:eastAsia="SimSun"/>
+          <w:b w:val="0"/>
+          <w:i/>
+          <w:sz w:val="23"/>
+        </w:rPr>
+        <w:t>r</w:t>
+      </w:r>
+      <w:r>
+        <w:rPr>
+          <w:rFonts w:ascii="Times New Roman" w:hAnsi="Times New Roman" w:eastAsia="SimSun"/>
+          <w:b w:val="0"/>
+          <w:i w:val="0"/>
+          <w:sz w:val="23"/>
+        </w:rPr>
+        <w:t>)))</w:t>
       </w:r>
     </w:p>
     <w:p>
@@ -924,7 +1055,7 @@
         <w:drawing>
           <wp:inline xmlns:a="http://schemas.openxmlformats.org/drawingml/2006/main" xmlns:pic="http://schemas.openxmlformats.org/drawingml/2006/picture">
             <wp:extent cx="5257800" cy="3176587"/>
-            <wp:docPr id="4" name="Picture 4"/>
+            <wp:docPr id="3" name="Picture 3"/>
             <wp:cNvGraphicFramePr>
               <a:graphicFrameLocks noChangeAspect="1"/>
             </wp:cNvGraphicFramePr>
@@ -936,7 +1067,7 @@
                     <pic:cNvPicPr/>
                   </pic:nvPicPr>
                   <pic:blipFill>
-                    <a:blip r:embed="rId15"/>
+                    <a:blip r:embed="rId14"/>
                     <a:stretch>
                       <a:fillRect/>
                     </a:stretch>
@@ -1011,7 +1142,7 @@
         <w:drawing>
           <wp:inline xmlns:a="http://schemas.openxmlformats.org/drawingml/2006/main" xmlns:pic="http://schemas.openxmlformats.org/drawingml/2006/picture">
             <wp:extent cx="5257800" cy="2596970"/>
-            <wp:docPr id="5" name="Picture 5"/>
+            <wp:docPr id="4" name="Picture 4"/>
             <wp:cNvGraphicFramePr>
               <a:graphicFrameLocks noChangeAspect="1"/>
             </wp:cNvGraphicFramePr>
@@ -1023,7 +1154,7 @@
                     <pic:cNvPicPr/>
                   </pic:nvPicPr>
                   <pic:blipFill>
-                    <a:blip r:embed="rId16"/>
+                    <a:blip r:embed="rId15"/>
                     <a:stretch>
                       <a:fillRect/>
                     </a:stretch>
@@ -1060,42 +1191,111 @@
     </w:p>
     <w:p>
       <w:pPr>
-        <w:spacing w:before="80" w:after="80"/>
+        <w:keepLines/>
+        <w:spacing w:line="240" w:lineRule="auto" w:before="100" w:after="100"/>
         <w:jc w:val="center"/>
       </w:pPr>
       <w:r>
-        <w:drawing>
-          <wp:inline xmlns:a="http://schemas.openxmlformats.org/drawingml/2006/main" xmlns:pic="http://schemas.openxmlformats.org/drawingml/2006/picture">
-            <wp:extent cx="4389120" cy="510498"/>
-            <wp:docPr id="6" name="Picture 6"/>
-            <wp:cNvGraphicFramePr>
-              <a:graphicFrameLocks noChangeAspect="1"/>
-            </wp:cNvGraphicFramePr>
-            <a:graphic>
-              <a:graphicData uri="http://schemas.openxmlformats.org/drawingml/2006/picture">
-                <pic:pic>
-                  <pic:nvPicPr>
-                    <pic:cNvPr id="0" name="formula_44f4188f2e.png"/>
-                    <pic:cNvPicPr/>
-                  </pic:nvPicPr>
-                  <pic:blipFill>
-                    <a:blip r:embed="rId17"/>
-                    <a:stretch>
-                      <a:fillRect/>
-                    </a:stretch>
-                  </pic:blipFill>
-                  <pic:spPr>
-                    <a:xfrm>
-                      <a:off x="0" y="0"/>
-                      <a:ext cx="4389120" cy="510498"/>
-                    </a:xfrm>
-                    <a:prstGeom prst="rect"/>
-                  </pic:spPr>
-                </pic:pic>
-              </a:graphicData>
-            </a:graphic>
-          </wp:inline>
-        </w:drawing>
+        <w:rPr>
+          <w:rFonts w:ascii="Times New Roman" w:hAnsi="Times New Roman" w:eastAsia="SimSun"/>
+          <w:b w:val="0"/>
+          <w:i/>
+          <w:sz w:val="23"/>
+        </w:rPr>
+        <w:t>y</w:t>
+      </w:r>
+      <w:r>
+        <w:rPr>
+          <w:rFonts w:ascii="Times New Roman" w:hAnsi="Times New Roman" w:eastAsia="SimSun"/>
+          <w:b w:val="0"/>
+          <w:i/>
+          <w:sz w:val="23"/>
+          <w:vertAlign w:val="subscript"/>
+        </w:rPr>
+        <w:t>mix</w:t>
+      </w:r>
+      <w:r>
+        <w:rPr>
+          <w:rFonts w:ascii="Times New Roman" w:hAnsi="Times New Roman" w:eastAsia="SimSun"/>
+          <w:b w:val="0"/>
+          <w:i w:val="0"/>
+          <w:sz w:val="23"/>
+        </w:rPr>
+        <w:t xml:space="preserve"> = Normalize(</w:t>
+      </w:r>
+      <w:r>
+        <w:rPr>
+          <w:rFonts w:ascii="Times New Roman" w:hAnsi="Times New Roman" w:eastAsia="SimSun"/>
+          <w:b w:val="0"/>
+          <w:i/>
+          <w:sz w:val="23"/>
+        </w:rPr>
+        <w:t>y</w:t>
+      </w:r>
+      <w:r>
+        <w:rPr>
+          <w:rFonts w:ascii="Times New Roman" w:hAnsi="Times New Roman" w:eastAsia="SimSun"/>
+          <w:b w:val="0"/>
+          <w:i/>
+          <w:sz w:val="23"/>
+          <w:vertAlign w:val="subscript"/>
+        </w:rPr>
+        <w:t>vc</w:t>
+      </w:r>
+      <w:r>
+        <w:rPr>
+          <w:rFonts w:ascii="Times New Roman" w:hAnsi="Times New Roman" w:eastAsia="SimSun"/>
+          <w:b w:val="0"/>
+          <w:i w:val="0"/>
+          <w:sz w:val="23"/>
+        </w:rPr>
+        <w:t xml:space="preserve"> + </w:t>
+      </w:r>
+      <w:r>
+        <w:rPr>
+          <w:rFonts w:ascii="Times New Roman" w:hAnsi="Times New Roman" w:eastAsia="SimSun"/>
+          <w:b w:val="0"/>
+          <w:i/>
+          <w:sz w:val="23"/>
+        </w:rPr>
+        <w:t>g</w:t>
+      </w:r>
+      <w:r>
+        <w:rPr>
+          <w:rFonts w:ascii="Times New Roman" w:hAnsi="Times New Roman" w:eastAsia="SimSun"/>
+          <w:b w:val="0"/>
+          <w:i/>
+          <w:sz w:val="23"/>
+          <w:vertAlign w:val="subscript"/>
+        </w:rPr>
+        <w:t>v</w:t>
+      </w:r>
+      <w:r>
+        <w:rPr>
+          <w:rFonts w:ascii="Times New Roman" w:hAnsi="Times New Roman" w:eastAsia="SimSun"/>
+          <w:b w:val="0"/>
+          <w:i w:val="0"/>
+          <w:sz w:val="23"/>
+        </w:rPr>
+        <w:t xml:space="preserve"> · </w:t>
+      </w:r>
+      <w:r>
+        <w:rPr>
+          <w:rFonts w:ascii="Times New Roman" w:hAnsi="Times New Roman" w:eastAsia="SimSun"/>
+          <w:b w:val="0"/>
+          <w:i/>
+          <w:sz w:val="23"/>
+        </w:rPr>
+        <w:t>a</w:t>
+      </w:r>
+      <w:r>
+        <w:rPr>
+          <w:rFonts w:ascii="Times New Roman" w:hAnsi="Times New Roman" w:eastAsia="SimSun"/>
+          <w:b w:val="0"/>
+          <w:i w:val="0"/>
+          <w:sz w:val="23"/>
+        </w:rPr>
+        <w:t>)</w:t>
       </w:r>
     </w:p>
     <w:p>
@@ -5095,7 +5295,7 @@
           <w:b w:val="0"/>
           <w:sz w:val="21"/>
         </w:rPr>
-        <w:t>实验部分记录网页系统完成的一次短片段端到端任务，用于验证修复后的分离、转换和重混链路。任务 ID 为 20260601_190120_voice_conversion_55d07c42，输入为约 290.0 秒音频，pitch shift 设置为 0。系统成功调用 Demucs 得到 vocals、drums、bass 和 other，其中 vocals 被送入 Seed-VC 完成目标音色转换，其余三轨合成为 accompaniment，并与转换后人声重混得到新的完整歌曲。</w:t>
+        <w:t>实验部分记录网页系统完成的一次短片段端到端任务，用于验证修复后的分离、转换和重混链路。任务 ID 为 20260603_093222_voice_conversion_d703c93b，输入为约 279.7 秒音频，pitch shift 设置为 0。系统成功调用 Demucs 得到 vocals、drums、bass 和 other，其中 vocals 被送入 Seed-VC 完成目标音色转换，其余三轨合成为 accompaniment，并与转换后人声重混得到新的完整歌曲。</w:t>
       </w:r>
     </w:p>
     <w:p>
@@ -5108,7 +5308,7 @@
         <w:drawing>
           <wp:inline xmlns:a="http://schemas.openxmlformats.org/drawingml/2006/main" xmlns:pic="http://schemas.openxmlformats.org/drawingml/2006/picture">
             <wp:extent cx="5257800" cy="2544880"/>
-            <wp:docPr id="7" name="Picture 7"/>
+            <wp:docPr id="5" name="Picture 5"/>
             <wp:cNvGraphicFramePr>
               <a:graphicFrameLocks noChangeAspect="1"/>
             </wp:cNvGraphicFramePr>
@@ -5120,7 +5320,7 @@
                     <pic:cNvPicPr/>
                   </pic:nvPicPr>
                   <pic:blipFill>
-                    <a:blip r:embed="rId18"/>
+                    <a:blip r:embed="rId16"/>
                     <a:stretch>
                       <a:fillRect/>
                     </a:stretch>
@@ -5165,7 +5365,7 @@
         <w:drawing>
           <wp:inline xmlns:a="http://schemas.openxmlformats.org/drawingml/2006/main" xmlns:pic="http://schemas.openxmlformats.org/drawingml/2006/picture">
             <wp:extent cx="5257800" cy="4045241"/>
-            <wp:docPr id="8" name="Picture 8"/>
+            <wp:docPr id="6" name="Picture 6"/>
             <wp:cNvGraphicFramePr>
               <a:graphicFrameLocks noChangeAspect="1"/>
             </wp:cNvGraphicFramePr>
@@ -5177,7 +5377,7 @@
                     <pic:cNvPicPr/>
                   </pic:nvPicPr>
                   <pic:blipFill>
-                    <a:blip r:embed="rId19"/>
+                    <a:blip r:embed="rId17"/>
                     <a:stretch>
                       <a:fillRect/>
                     </a:stretch>
@@ -5421,7 +5621,7 @@
                 <w:b w:val="0"/>
                 <w:sz w:val="18"/>
               </w:rPr>
-              <w:t>20260601_190120_voice_conversion_55d07c42</w:t>
+              <w:t>20260603_093222_voice_conversion_d703c93b</w:t>
             </w:r>
           </w:p>
         </w:tc>
@@ -5531,7 +5731,7 @@
                 <w:b w:val="0"/>
                 <w:sz w:val="18"/>
               </w:rPr>
-              <w:t>voice_conversion_mix_20260601_190120_voice_conversion_55d07c42.wav</w:t>
+              <w:t>voice_conversion_mix_20260603_093222_voice_conversion_d703c93b.wav</w:t>
             </w:r>
           </w:p>
         </w:tc>
@@ -5566,7 +5766,7 @@
                 <w:b w:val="0"/>
                 <w:sz w:val="18"/>
               </w:rPr>
-              <w:t>290.0s / 44100 Hz</w:t>
+              <w:t>279.7s / 44100 Hz</w:t>
             </w:r>
           </w:p>
         </w:tc>
@@ -5751,7 +5951,7 @@
                 <w:b w:val="0"/>
                 <w:sz w:val="18"/>
               </w:rPr>
-              <w:t>BPM=97.5, RMS=0.1285</w:t>
+              <w:t>BPM=136.0, RMS=0.1363</w:t>
             </w:r>
           </w:p>
         </w:tc>
@@ -5786,7 +5986,7 @@
                 <w:b w:val="0"/>
                 <w:sz w:val="18"/>
               </w:rPr>
-              <w:t>低频=0.4983, onset=3.87/s</w:t>
+              <w:t>低频=0.3401, onset=2.71/s</w:t>
             </w:r>
           </w:p>
         </w:tc>
@@ -5896,7 +6096,7 @@
                 <w:b w:val="0"/>
                 <w:sz w:val="18"/>
               </w:rPr>
-              <w:t>RTF=19.53</w:t>
+              <w:t>RTF=19.30</w:t>
             </w:r>
           </w:p>
         </w:tc>
@@ -5926,7 +6126,7 @@
         <w:drawing>
           <wp:inline xmlns:a="http://schemas.openxmlformats.org/drawingml/2006/main" xmlns:pic="http://schemas.openxmlformats.org/drawingml/2006/picture">
             <wp:extent cx="5257800" cy="2904387"/>
-            <wp:docPr id="9" name="Picture 9"/>
+            <wp:docPr id="7" name="Picture 7"/>
             <wp:cNvGraphicFramePr>
               <a:graphicFrameLocks noChangeAspect="1"/>
             </wp:cNvGraphicFramePr>
@@ -5938,7 +6138,7 @@
                     <pic:cNvPicPr/>
                   </pic:nvPicPr>
                   <pic:blipFill>
-                    <a:blip r:embed="rId20"/>
+                    <a:blip r:embed="rId18"/>
                     <a:stretch>
                       <a:fillRect/>
                     </a:stretch>
@@ -6029,7 +6229,7 @@
         <w:drawing>
           <wp:inline xmlns:a="http://schemas.openxmlformats.org/drawingml/2006/main" xmlns:pic="http://schemas.openxmlformats.org/drawingml/2006/picture">
             <wp:extent cx="5257800" cy="2825811"/>
-            <wp:docPr id="10" name="Picture 10"/>
+            <wp:docPr id="8" name="Picture 8"/>
             <wp:cNvGraphicFramePr>
               <a:graphicFrameLocks noChangeAspect="1"/>
             </wp:cNvGraphicFramePr>
@@ -6041,7 +6241,7 @@
                     <pic:cNvPicPr/>
                   </pic:nvPicPr>
                   <pic:blipFill>
-                    <a:blip r:embed="rId21"/>
+                    <a:blip r:embed="rId19"/>
                     <a:stretch>
                       <a:fillRect/>
                     </a:stretch>
@@ -6116,7 +6316,7 @@
         <w:drawing>
           <wp:inline xmlns:a="http://schemas.openxmlformats.org/drawingml/2006/main" xmlns:pic="http://schemas.openxmlformats.org/drawingml/2006/picture">
             <wp:extent cx="5257800" cy="3067277"/>
-            <wp:docPr id="11" name="Picture 11"/>
+            <wp:docPr id="9" name="Picture 9"/>
             <wp:cNvGraphicFramePr>
               <a:graphicFrameLocks noChangeAspect="1"/>
             </wp:cNvGraphicFramePr>
@@ -6128,7 +6328,7 @@
                     <pic:cNvPicPr/>
                   </pic:nvPicPr>
                   <pic:blipFill>
-                    <a:blip r:embed="rId22"/>
+                    <a:blip r:embed="rId20"/>
                     <a:stretch>
                       <a:fillRect/>
                     </a:stretch>
@@ -6783,7 +6983,7 @@
         <w:drawing>
           <wp:inline xmlns:a="http://schemas.openxmlformats.org/drawingml/2006/main" xmlns:pic="http://schemas.openxmlformats.org/drawingml/2006/picture">
             <wp:extent cx="5257800" cy="4081954"/>
-            <wp:docPr id="12" name="Picture 12"/>
+            <wp:docPr id="10" name="Picture 10"/>
             <wp:cNvGraphicFramePr>
               <a:graphicFrameLocks noChangeAspect="1"/>
             </wp:cNvGraphicFramePr>
@@ -6795,7 +6995,7 @@
                     <pic:cNvPicPr/>
                   </pic:nvPicPr>
                   <pic:blipFill>
-                    <a:blip r:embed="rId23"/>
+                    <a:blip r:embed="rId21"/>
                     <a:stretch>
                       <a:fillRect/>
                     </a:stretch>
@@ -7657,7 +7857,7 @@
           <w:b w:val="0"/>
           <w:sz w:val="21"/>
         </w:rPr>
-        <w:t>长音频任务用于评估整曲处理的资源成本。当前整曲任务记录的音频时长约 279.7 秒，扩散步数为 30，CFG=0.75，系统根据短片段 RTF 与输入长度估计整曲推理耗时约 230.3 分钟。该估计不作为论文结论中的性能承诺，而作为实验调度依据：交互阶段优先使用 15 到 30 秒 vocals 片段筛选 pitch、CFG、去沙强度和重混增益，参数稳定后再提交整曲离线任务，并在 task.json 与 task.log 中记录输入长度、步数、估计耗时和实际耗时，保证长音频结果可以复核。</w:t>
+        <w:t>长音频任务用于评估整曲处理的资源成本。当前整曲任务记录的音频时长约 279.7 秒，扩散步数为 50，CFG=0.75，系统根据短片段 RTF 与输入长度估计整曲推理耗时约 381.8 分钟。该估计不作为论文结论中的性能承诺，而作为实验调度依据：交互阶段优先使用 15 到 30 秒 vocals 片段筛选 pitch、CFG、去沙强度和重混增益，参数稳定后再提交整曲离线任务，并在 task.json 与 task.log 中记录输入长度、步数、估计耗时和实际耗时，保证长音频结果可以复核。</w:t>
       </w:r>
     </w:p>
     <w:p>
@@ -7670,7 +7870,7 @@
         <w:drawing>
           <wp:inline xmlns:a="http://schemas.openxmlformats.org/drawingml/2006/main" xmlns:pic="http://schemas.openxmlformats.org/drawingml/2006/picture">
             <wp:extent cx="5257800" cy="3138985"/>
-            <wp:docPr id="13" name="Picture 13"/>
+            <wp:docPr id="11" name="Picture 11"/>
             <wp:cNvGraphicFramePr>
               <a:graphicFrameLocks noChangeAspect="1"/>
             </wp:cNvGraphicFramePr>
@@ -7682,7 +7882,7 @@
                     <pic:cNvPicPr/>
                   </pic:nvPicPr>
                   <pic:blipFill>
-                    <a:blip r:embed="rId24"/>
+                    <a:blip r:embed="rId22"/>
                     <a:stretch>
                       <a:fillRect/>
                     </a:stretch>
@@ -7760,7 +7960,7 @@
           <w:b w:val="0"/>
           <w:sz w:val="21"/>
         </w:rPr>
-        <w:t>针对用户反馈的“声音沙哑”和“情感不到位”，本文把问题拆为两类：沙哑通常来自分轨残留、声码器高频毛刺或过强的频带压缩；情感不足通常来自原人声能量包络被平滑、F0 细节被弱化或目标参考样本与歌曲情绪不匹配。当前网页暴露 dehiss_strength=0.40、emotion_strength=0.55、vocal_gain_db 等参数，并在转换前后分别做轻量去沙、包络匹配和重混增益控制。该策略不能替代更充分的目标音色样本或更高性能的推理部署，但能把可调因素暴露给实验记录。</w:t>
+        <w:t>针对用户反馈的“声音沙哑”和“情感不到位”，本文把问题拆为两类：沙哑通常来自分轨残留、声码器高频毛刺或过强的频带压缩；情感不足通常来自原人声能量包络被平滑、F0 细节被弱化或目标参考样本与歌曲情绪不匹配。当前网页暴露 dehiss_strength=0.75、emotion_strength=1.00、vocal_gain_db 等参数，并在转换前后分别做轻量去沙、包络匹配和重混增益控制。该策略不能替代更充分的目标音色样本或更高性能的推理部署，但能把可调因素暴露给实验记录。</w:t>
       </w:r>
     </w:p>
     <w:p>
@@ -7773,7 +7973,7 @@
         <w:drawing>
           <wp:inline xmlns:a="http://schemas.openxmlformats.org/drawingml/2006/main" xmlns:pic="http://schemas.openxmlformats.org/drawingml/2006/picture">
             <wp:extent cx="5257800" cy="2973606"/>
-            <wp:docPr id="14" name="Picture 14"/>
+            <wp:docPr id="12" name="Picture 12"/>
             <wp:cNvGraphicFramePr>
               <a:graphicFrameLocks noChangeAspect="1"/>
             </wp:cNvGraphicFramePr>
@@ -7785,7 +7985,7 @@
                     <pic:cNvPicPr/>
                   </pic:nvPicPr>
                   <pic:blipFill>
-                    <a:blip r:embed="rId25"/>
+                    <a:blip r:embed="rId23"/>
                     <a:stretch>
                       <a:fillRect/>
                     </a:stretch>
@@ -8534,7 +8734,7 @@
         <w:drawing>
           <wp:inline xmlns:a="http://schemas.openxmlformats.org/drawingml/2006/main" xmlns:pic="http://schemas.openxmlformats.org/drawingml/2006/picture">
             <wp:extent cx="5257800" cy="3040055"/>
-            <wp:docPr id="15" name="Picture 15"/>
+            <wp:docPr id="13" name="Picture 13"/>
             <wp:cNvGraphicFramePr>
               <a:graphicFrameLocks noChangeAspect="1"/>
             </wp:cNvGraphicFramePr>
@@ -8546,7 +8746,7 @@
                     <pic:cNvPicPr/>
                   </pic:nvPicPr>
                   <pic:blipFill>
-                    <a:blip r:embed="rId26"/>
+                    <a:blip r:embed="rId24"/>
                     <a:stretch>
                       <a:fillRect/>
                     </a:stretch>
@@ -8607,7 +8807,7 @@
         <w:drawing>
           <wp:inline xmlns:a="http://schemas.openxmlformats.org/drawingml/2006/main" xmlns:pic="http://schemas.openxmlformats.org/drawingml/2006/picture">
             <wp:extent cx="5257800" cy="3505200"/>
-            <wp:docPr id="16" name="Picture 16"/>
+            <wp:docPr id="14" name="Picture 14"/>
             <wp:cNvGraphicFramePr>
               <a:graphicFrameLocks noChangeAspect="1"/>
             </wp:cNvGraphicFramePr>
@@ -8619,7 +8819,7 @@
                     <pic:cNvPicPr/>
                   </pic:nvPicPr>
                   <pic:blipFill>
-                    <a:blip r:embed="rId27"/>
+                    <a:blip r:embed="rId25"/>
                     <a:stretch>
                       <a:fillRect/>
                     </a:stretch>
@@ -8879,7 +9079,7 @@
                 <w:b w:val="0"/>
                 <w:sz w:val="18"/>
               </w:rPr>
-              <w:t>离线推理 RTF=19.53</w:t>
+              <w:t>离线推理 RTF=19.30</w:t>
             </w:r>
           </w:p>
         </w:tc>

</xml_diff>

<commit_message>
fix paper formulas and experiment wording
</commit_message>
<xml_diff>
--- a/report/intelligent_speech_processing_paper/ace_step_isp_lora_voice_conversion_paper.docx
+++ b/report/intelligent_speech_processing_paper/ace_step_isp_lora_voice_conversion_paper.docx
@@ -77,7 +77,7 @@
           <w:b w:val="0"/>
           <w:sz w:val="21"/>
         </w:rPr>
-        <w:t>面向音乐生成、歌声音色替换和网页化实验复现的综合需求，本文提出并实现一种双路径智能音频处理系统。系统将文本到音乐生成与授权歌声音色转换拆分为两个独立研究变量：音乐生成路径以 ACE-Step 为基础模型，通过 LoRA 对目标 EDM 数据域进行参数高效适配；音色转换路径以 Demucs 完成人声与伴奏分离，以 Seed-VC 完成零样本歌声音色转换，并在转换后执行去沙哑、能量包络保持、轻混响和伴奏重混。为避免仅凭单个听感样例给出结论，本文建立任务级证据链：每次实验保存输入音频、分轨结果、转换人声、伴奏重混、命令日志、参数 JSON、波形频谱诊断图和完整 Mel 水印图。音乐生成实验使用 6016 条 8 秒 EDM 片段，训练/验证/测试划分为 4833/557/626；段落级增强实验进一步构建 360 条 15 秒片段，覆盖 drop=130, breakdown=86, build-up=65, intro=36, loop=25, outro=18 等结构标签。授权音色转换实验完成任务 20260603_093222_voice_conversion_d703c93b 的端到端处理，输出时长 279.7 秒，BPM=136.0，RMS=0.1363，低频比例=0.3401，Seed-VC 运行代价 RTF=19.30。实验结果表明，该系统能够把风格适配、歌声音色迁移、分轨重混和 AI 生成标识组织为可复核的智能语音处理流程。项目源代码仓库地址：https://github.com/anmoryli/edm-adapter。</w:t>
+        <w:t>面向音乐生成、歌声音色替换和网页化实验复现的综合需求，本文提出并实现一种双路径智能音频处理系统。系统将文本到音乐生成与授权歌声音色转换拆分为两个独立研究变量：音乐生成路径以 ACE-Step 为基础模型，通过 LoRA 对目标 EDM 数据域进行参数高效适配；音色转换路径以 Demucs 完成人声与伴奏分离，以 Seed-VC 完成零样本歌声音色转换，并在转换后执行去沙哑、能量包络保持、轻混响和伴奏重混。为避免仅凭单个听感样例给出结论，本文建立实验级证据链：每次实验保存输入音频、分轨结果、转换人声、伴奏重混、参数记录、波形频谱诊断图和完整 Mel 水印图。音乐生成实验使用 6016 条 8 秒 EDM 片段，训练/验证/测试划分为 4833/557/626；段落级增强实验进一步构建 360 条 15 秒片段，覆盖 drop=130, breakdown=86, build-up=65, intro=36, loop=25, outro=18 等结构标签。授权音色转换实验以匿名样例 E-VC-01 验证端到端链路，输出时长 279.7 秒，BPM=136.0，RMS=0.1363，低频比例=0.3401，Seed-VC 运行代价 RTF=19.30。实验结果表明，该系统能够把风格适配、歌声音色迁移、分轨重混和 AI 生成标识组织为可复核的智能语音处理流程。项目源代码仓库地址：https://github.com/anmoryli/edm-adapter。</w:t>
       </w:r>
     </w:p>
     <w:p>
@@ -121,7 +121,7 @@
           <w:b w:val="0"/>
           <w:sz w:val="21"/>
         </w:rPr>
-        <w:t>This paper presents a dual-path intelligent audio-processing system for controllable music generation and authorized singing-voice timbre conversion. The generation path adapts ACE-Step to an EDM domain through LoRA fine-tuning, while the conversion path combines Demucs source separation, Seed-VC timbre conversion, artifact suppression, dynamics preservation, light vocal reverb, and accompaniment remixing. The system records task-level evidence including stems, converted vocals, remix outputs, command logs, JSON metadata, waveform diagnostics, and full Mel-spectrogram watermark figures. Experiments show that the proposed prototype can separate style adaptation from vocal timbre transfer and provide reproducible evidence for intelligent speech-processing analysis. Source code repository: https://github.com/anmoryli/edm-adapter.</w:t>
+        <w:t>This paper presents a dual-path intelligent audio-processing system for controllable music generation and authorized singing-voice timbre conversion. The generation path adapts ACE-Step to an EDM domain through LoRA fine-tuning, while the conversion path combines Demucs source separation, Seed-VC timbre conversion, artifact suppression, dynamics preservation, light vocal reverb, and accompaniment remixing. The system records experiment-level evidence including separated stems, converted vocals, remix outputs, parameter records, waveform diagnostics, and full Mel-spectrogram watermark figures. Experiments show that the proposed prototype can separate style adaptation from vocal timbre transfer and provide reproducible evidence for intelligent speech-processing analysis. Source code repository: https://github.com/anmoryli/edm-adapter.</w:t>
       </w:r>
     </w:p>
     <w:p>
@@ -167,7 +167,7 @@
           <w:b w:val="0"/>
           <w:sz w:val="21"/>
         </w:rPr>
-        <w:t>本文围绕 EDM-Adapter 原型系统重新组织研究问题。第一，如何在本地资源约束下对大规模音乐生成模型进行参数高效风格适配；第二，如何把上传歌曲中的人声内容和 F0 轨迹与授权目标音色样本结合，生成新的目标声线；第三，如何让网页端每一次任务都留下足够的中间产物和图表证据，使实验结果可以被复核、比较和定位问题。因此，本文的目标不是宣称重新训练一个完整基础模型，而是给出一个边界清晰、流程可运行、证据可追踪的智能音频处理框架。</w:t>
+        <w:t>本文围绕 EDM-Adapter 原型系统重新组织研究问题。第一，如何在有限训练资源条件下对大规模音乐生成模型进行参数高效风格适配；第二，如何把上传歌曲中的人声内容和基频轨迹与授权目标音色样本结合，生成新的目标声线；第三，如何让每一次实验都留下足够的中间产物和图表证据，使实验结果可以被复核、比较和定位问题。因此，本文的目标不是宣称重新训练一个完整基础模型，而是给出一个边界清晰、流程可运行、证据可追踪的智能音频处理框架。</w:t>
       </w:r>
     </w:p>
     <w:p>
@@ -183,7 +183,7 @@
           <w:b w:val="0"/>
           <w:sz w:val="21"/>
         </w:rPr>
-        <w:t>本文主要贡献包括：1）设计音乐生成与授权歌声音色转换的双路径系统架构，避免 LoRA 风格适配与 Seed-VC 音色迁移相互混淆；2）给出歌声音色转换的形式化定义和工程实现链路，包括 Demucs 分轨、Seed-VC 转换、去沙哑、包络保持、轻混响和伴奏重混；3）建立任务级证据链，将 wav、png、json 和 log 组织为最小复现实验单元；4）在最终生成音频的完整 Mel 图谱末尾加入由频谱能量构成的“AI生成”负形水印，用于标识 AI 生成结果。</w:t>
+        <w:t>本文主要贡献包括：1）设计音乐生成与授权歌声音色转换的双路径系统架构，避免 LoRA 风格适配与 Seed-VC 音色迁移相互混淆；2）给出歌声音色转换的形式化定义和工程实现链路，包括 Demucs 分轨、Seed-VC 转换、去沙哑、包络保持、轻混响和伴奏重混；3）建立实验级证据链，将输入音频、分轨、转换、重混、参数和诊断图组织为最小复现实验单元；4）在最终生成音频的完整 Mel 图谱末尾加入由频谱能量构成的“AI生成”负形水印，用于标识 AI 生成结果。</w:t>
       </w:r>
     </w:p>
     <w:p>
@@ -240,7 +240,7 @@
           <w:b/>
           <w:sz w:val="19"/>
         </w:rPr>
-        <w:t>图1 系统总体架构。系统将文本到音乐生成、授权歌声音色转换和任务级证据记录组织为三个相互独立但可追踪的模块。</w:t>
+        <w:t>图1 系统总体架构。系统将文本到音乐生成、授权歌声音色转换和实验级证据记录组织为三个相互独立但可追踪的模块。</w:t>
       </w:r>
     </w:p>
     <w:p>
@@ -786,7 +786,7 @@
           <w:b w:val="0"/>
           <w:sz w:val="21"/>
         </w:rPr>
-        <w:t>本文将授权歌声音色转换定义为条件波形重建问题。给定源歌曲 x、目标音色参考 r 和可选半音偏移 Delta p，系统从 x 中估计内容表征 C(x) 与基频轨迹 F0(x)，从 r 中提取音色嵌入 e(r)，再由转换模型和声码器生成转换波形 y_vc。该定义把内容保持、音高稳定、音色相似和波形音质四个评价维度分开，使后续误差分析能够定位到具体模块。</w:t>
+        <w:t>本文将授权歌声音色转换定义为条件波形重建问题。给定源歌曲、目标音色参考样本和可选半音偏移量，系统从源人声中估计歌唱内容表征与基频轨迹，从参考样本中提取音色嵌入，再由转换模型和声码器生成目标音色人声。该定义把内容保持、音高稳定、音色相似和波形音质四个评价维度分开，使后续误差分析能够定位到具体模块。</w:t>
       </w:r>
     </w:p>
     <w:p>
@@ -843,7 +843,7 @@
           <w:b/>
           <w:sz w:val="19"/>
         </w:rPr>
-        <w:t>图2 授权歌声音色转换的问题定义。源歌曲提供内容与 F0，目标参考样本提供音色嵌入，转换模型与声码器负责生成目标声线。</w:t>
+        <w:t>图2 授权歌声音色转换的问题定义。源歌曲提供歌唱内容与基频轨迹，目标参考样本提供音色嵌入，转换模型与声码器负责生成目标声线。</w:t>
       </w:r>
     </w:p>
     <w:p>
@@ -1416,7 +1416,7 @@
                 <w:b w:val="0"/>
                 <w:sz w:val="17"/>
               </w:rPr>
-              <w:t>F0(x)</w:t>
+              <w:t>基频轨迹</w:t>
             </w:r>
           </w:p>
         </w:tc>
@@ -1451,7 +1451,7 @@
                 <w:b w:val="0"/>
                 <w:sz w:val="17"/>
               </w:rPr>
-              <w:t>源人声基频轨迹</w:t>
+              <w:t>源人声基频随时间变化的曲线</w:t>
             </w:r>
           </w:p>
         </w:tc>
@@ -1486,7 +1486,7 @@
                 <w:b w:val="0"/>
                 <w:sz w:val="17"/>
               </w:rPr>
-              <w:t>转换器内部 F0/音高条件</w:t>
+              <w:t>转换器内部基频/音高条件</w:t>
             </w:r>
           </w:p>
         </w:tc>
@@ -1587,7 +1587,7 @@
           <w:p>
             <w:pPr>
               <w:spacing w:line="264" w:lineRule="auto" w:after="0"/>
-              <w:jc w:val="left"/>
+              <w:jc w:val="center"/>
             </w:pPr>
             <w:r/>
             <w:r>
@@ -1596,7 +1596,7 @@
                 <w:b w:val="0"/>
                 <w:sz w:val="17"/>
               </w:rPr>
-              <w:t>目标参考样本或本地目标音色目录</w:t>
+              <w:t>目标参考样本或目标音色样本库</w:t>
             </w:r>
           </w:p>
         </w:tc>
@@ -1636,7 +1636,7 @@
                 <w:b w:val="0"/>
                 <w:sz w:val="17"/>
               </w:rPr>
-              <w:t>y_vc</w:t>
+              <w:t>y（下标 vc）</w:t>
             </w:r>
           </w:p>
         </w:tc>
@@ -1852,6 +1852,946 @@
     </w:p>
     <w:p>
       <w:pPr>
+        <w:keepNext w:val="0"/>
+        <w:keepLines w:val="0"/>
+        <w:spacing w:line="276" w:lineRule="auto" w:after="80"/>
+        <w:ind w:firstLine="420"/>
+      </w:pPr>
+      <w:r>
+        <w:rPr>
+          <w:rFonts w:ascii="Times New Roman" w:hAnsi="Times New Roman" w:eastAsia="SimSun"/>
+          <w:b w:val="0"/>
+          <w:sz w:val="21"/>
+        </w:rPr>
+        <w:t>本文方法采用“生成适配”和“声线迁移”分离建模的策略。音乐生成侧只处理从文本条件到音乐结构的分布适配，歌声音色转换侧只处理已有歌唱内容在目标音色条件下的波形重建。这样做可以把风格、旋律、音色、分轨误差和后处理音质分别归因，避免用单个输出样例同时解释多个模型因素。</w:t>
+      </w:r>
+    </w:p>
+    <w:p>
+      <w:pPr>
+        <w:keepNext/>
+        <w:keepLines/>
+        <w:spacing w:line="276" w:lineRule="auto" w:after="80"/>
+        <w:jc w:val="center"/>
+      </w:pPr>
+      <w:r>
+        <w:rPr>
+          <w:rFonts w:ascii="Times New Roman" w:hAnsi="Times New Roman" w:eastAsia="SimSun"/>
+          <w:b/>
+          <w:sz w:val="19"/>
+        </w:rPr>
+        <w:t>表3 技术方案分层</w:t>
+      </w:r>
+    </w:p>
+    <w:tbl>
+      <w:tblPr>
+        <w:tblW w:type="auto" w:w="0"/>
+        <w:jc w:val="center"/>
+        <w:tblLayout w:type="fixed"/>
+        <w:tblLook w:firstColumn="1" w:firstRow="1" w:lastColumn="0" w:lastRow="0" w:noHBand="0" w:noVBand="1" w:val="04A0"/>
+      </w:tblPr>
+      <w:tblGrid>
+        <w:gridCol w:w="3061"/>
+        <w:gridCol w:w="3061"/>
+        <w:gridCol w:w="3061"/>
+      </w:tblGrid>
+      <w:tr>
+        <w:trPr>
+          <w:cantSplit/>
+          <w:tblHeader w:val="true"/>
+        </w:trPr>
+        <w:tc>
+          <w:tcPr>
+            <w:tcW w:type="dxa" w:w="1800"/>
+            <w:vAlign w:val="center"/>
+            <w:tcMar>
+              <w:top w:w="80" w:type="dxa"/>
+              <w:bottom w:w="80" w:type="dxa"/>
+              <w:start w:w="120" w:type="dxa"/>
+              <w:end w:w="120" w:type="dxa"/>
+            </w:tcMar>
+            <w:tcBorders>
+              <w:top w:val="single" w:sz="12" w:color="000000"/>
+              <w:left w:val="nil"/>
+              <w:bottom w:val="single" w:sz="8" w:color="000000"/>
+              <w:right w:val="nil"/>
+              <w:insideH w:val="nil"/>
+              <w:insideV w:val="nil"/>
+            </w:tcBorders>
+          </w:tcPr>
+          <w:p>
+            <w:pPr>
+              <w:spacing w:line="264" w:lineRule="auto" w:after="0"/>
+              <w:jc w:val="center"/>
+            </w:pPr>
+            <w:r/>
+            <w:r>
+              <w:rPr>
+                <w:rFonts w:ascii="Times New Roman" w:hAnsi="Times New Roman" w:eastAsia="SimSun"/>
+                <w:b/>
+                <w:sz w:val="17"/>
+              </w:rPr>
+              <w:t>层次</w:t>
+            </w:r>
+          </w:p>
+        </w:tc>
+        <w:tc>
+          <w:tcPr>
+            <w:tcW w:type="dxa" w:w="4300"/>
+            <w:vAlign w:val="center"/>
+            <w:tcMar>
+              <w:top w:w="80" w:type="dxa"/>
+              <w:bottom w:w="80" w:type="dxa"/>
+              <w:start w:w="120" w:type="dxa"/>
+              <w:end w:w="120" w:type="dxa"/>
+            </w:tcMar>
+            <w:tcBorders>
+              <w:top w:val="single" w:sz="12" w:color="000000"/>
+              <w:left w:val="nil"/>
+              <w:bottom w:val="single" w:sz="8" w:color="000000"/>
+              <w:right w:val="nil"/>
+              <w:insideH w:val="nil"/>
+              <w:insideV w:val="nil"/>
+            </w:tcBorders>
+          </w:tcPr>
+          <w:p>
+            <w:pPr>
+              <w:spacing w:line="264" w:lineRule="auto" w:after="0"/>
+              <w:jc w:val="center"/>
+            </w:pPr>
+            <w:r/>
+            <w:r>
+              <w:rPr>
+                <w:rFonts w:ascii="Times New Roman" w:hAnsi="Times New Roman" w:eastAsia="SimSun"/>
+                <w:b/>
+                <w:sz w:val="17"/>
+              </w:rPr>
+              <w:t>关键处理</w:t>
+            </w:r>
+          </w:p>
+        </w:tc>
+        <w:tc>
+          <w:tcPr>
+            <w:tcW w:type="dxa" w:w="3260"/>
+            <w:vAlign w:val="center"/>
+            <w:tcMar>
+              <w:top w:w="80" w:type="dxa"/>
+              <w:bottom w:w="80" w:type="dxa"/>
+              <w:start w:w="120" w:type="dxa"/>
+              <w:end w:w="120" w:type="dxa"/>
+            </w:tcMar>
+            <w:tcBorders>
+              <w:top w:val="single" w:sz="12" w:color="000000"/>
+              <w:left w:val="nil"/>
+              <w:bottom w:val="single" w:sz="8" w:color="000000"/>
+              <w:right w:val="nil"/>
+              <w:insideH w:val="nil"/>
+              <w:insideV w:val="nil"/>
+            </w:tcBorders>
+          </w:tcPr>
+          <w:p>
+            <w:pPr>
+              <w:spacing w:line="264" w:lineRule="auto" w:after="0"/>
+              <w:jc w:val="center"/>
+            </w:pPr>
+            <w:r/>
+            <w:r>
+              <w:rPr>
+                <w:rFonts w:ascii="Times New Roman" w:hAnsi="Times New Roman" w:eastAsia="SimSun"/>
+                <w:b/>
+                <w:sz w:val="17"/>
+              </w:rPr>
+              <w:t>评价关注点</w:t>
+            </w:r>
+          </w:p>
+        </w:tc>
+      </w:tr>
+      <w:tr>
+        <w:trPr>
+          <w:cantSplit/>
+        </w:trPr>
+        <w:tc>
+          <w:tcPr>
+            <w:tcW w:type="dxa" w:w="1800"/>
+            <w:vAlign w:val="center"/>
+            <w:tcMar>
+              <w:top w:w="80" w:type="dxa"/>
+              <w:bottom w:w="80" w:type="dxa"/>
+              <w:start w:w="120" w:type="dxa"/>
+              <w:end w:w="120" w:type="dxa"/>
+            </w:tcMar>
+            <w:tcBorders>
+              <w:top w:val="nil"/>
+              <w:left w:val="nil"/>
+              <w:bottom w:val="nil"/>
+              <w:right w:val="nil"/>
+              <w:insideH w:val="nil"/>
+              <w:insideV w:val="nil"/>
+            </w:tcBorders>
+          </w:tcPr>
+          <w:p>
+            <w:pPr>
+              <w:spacing w:line="264" w:lineRule="auto" w:after="0"/>
+              <w:jc w:val="center"/>
+            </w:pPr>
+            <w:r/>
+            <w:r>
+              <w:rPr>
+                <w:rFonts w:ascii="Times New Roman" w:hAnsi="Times New Roman" w:eastAsia="SimSun"/>
+                <w:b w:val="0"/>
+                <w:sz w:val="17"/>
+              </w:rPr>
+              <w:t>输入与标准化</w:t>
+            </w:r>
+          </w:p>
+        </w:tc>
+        <w:tc>
+          <w:tcPr>
+            <w:tcW w:type="dxa" w:w="4300"/>
+            <w:vAlign w:val="center"/>
+            <w:tcMar>
+              <w:top w:w="80" w:type="dxa"/>
+              <w:bottom w:w="80" w:type="dxa"/>
+              <w:start w:w="120" w:type="dxa"/>
+              <w:end w:w="120" w:type="dxa"/>
+            </w:tcMar>
+            <w:tcBorders>
+              <w:top w:val="nil"/>
+              <w:left w:val="nil"/>
+              <w:bottom w:val="nil"/>
+              <w:right w:val="nil"/>
+              <w:insideH w:val="nil"/>
+              <w:insideV w:val="nil"/>
+            </w:tcBorders>
+          </w:tcPr>
+          <w:p>
+            <w:pPr>
+              <w:spacing w:line="264" w:lineRule="auto" w:after="0"/>
+              <w:jc w:val="left"/>
+            </w:pPr>
+            <w:r/>
+            <w:r>
+              <w:rPr>
+                <w:rFonts w:ascii="Times New Roman" w:hAnsi="Times New Roman" w:eastAsia="SimSun"/>
+                <w:b w:val="0"/>
+                <w:sz w:val="17"/>
+              </w:rPr>
+              <w:t>统一采样率、声道、时长和响度范围，记录实验参数</w:t>
+            </w:r>
+          </w:p>
+        </w:tc>
+        <w:tc>
+          <w:tcPr>
+            <w:tcW w:type="dxa" w:w="3260"/>
+            <w:vAlign w:val="center"/>
+            <w:tcMar>
+              <w:top w:w="80" w:type="dxa"/>
+              <w:bottom w:w="80" w:type="dxa"/>
+              <w:start w:w="120" w:type="dxa"/>
+              <w:end w:w="120" w:type="dxa"/>
+            </w:tcMar>
+            <w:tcBorders>
+              <w:top w:val="nil"/>
+              <w:left w:val="nil"/>
+              <w:bottom w:val="nil"/>
+              <w:right w:val="nil"/>
+              <w:insideH w:val="nil"/>
+              <w:insideV w:val="nil"/>
+            </w:tcBorders>
+          </w:tcPr>
+          <w:p>
+            <w:pPr>
+              <w:spacing w:line="264" w:lineRule="auto" w:after="0"/>
+              <w:jc w:val="center"/>
+            </w:pPr>
+            <w:r/>
+            <w:r>
+              <w:rPr>
+                <w:rFonts w:ascii="Times New Roman" w:hAnsi="Times New Roman" w:eastAsia="SimSun"/>
+                <w:b w:val="0"/>
+                <w:sz w:val="17"/>
+              </w:rPr>
+              <w:t>输入是否可复现，响度是否异常</w:t>
+            </w:r>
+          </w:p>
+        </w:tc>
+      </w:tr>
+      <w:tr>
+        <w:trPr>
+          <w:cantSplit/>
+        </w:trPr>
+        <w:tc>
+          <w:tcPr>
+            <w:tcW w:type="dxa" w:w="1800"/>
+            <w:vAlign w:val="center"/>
+            <w:tcMar>
+              <w:top w:w="80" w:type="dxa"/>
+              <w:bottom w:w="80" w:type="dxa"/>
+              <w:start w:w="120" w:type="dxa"/>
+              <w:end w:w="120" w:type="dxa"/>
+            </w:tcMar>
+            <w:tcBorders>
+              <w:top w:val="nil"/>
+              <w:left w:val="nil"/>
+              <w:bottom w:val="nil"/>
+              <w:right w:val="nil"/>
+              <w:insideH w:val="nil"/>
+              <w:insideV w:val="nil"/>
+            </w:tcBorders>
+          </w:tcPr>
+          <w:p>
+            <w:pPr>
+              <w:spacing w:line="264" w:lineRule="auto" w:after="0"/>
+              <w:jc w:val="center"/>
+            </w:pPr>
+            <w:r/>
+            <w:r>
+              <w:rPr>
+                <w:rFonts w:ascii="Times New Roman" w:hAnsi="Times New Roman" w:eastAsia="SimSun"/>
+                <w:b w:val="0"/>
+                <w:sz w:val="17"/>
+              </w:rPr>
+              <w:t>声源分离</w:t>
+            </w:r>
+          </w:p>
+        </w:tc>
+        <w:tc>
+          <w:tcPr>
+            <w:tcW w:type="dxa" w:w="4300"/>
+            <w:vAlign w:val="center"/>
+            <w:tcMar>
+              <w:top w:w="80" w:type="dxa"/>
+              <w:bottom w:w="80" w:type="dxa"/>
+              <w:start w:w="120" w:type="dxa"/>
+              <w:end w:w="120" w:type="dxa"/>
+            </w:tcMar>
+            <w:tcBorders>
+              <w:top w:val="nil"/>
+              <w:left w:val="nil"/>
+              <w:bottom w:val="nil"/>
+              <w:right w:val="nil"/>
+              <w:insideH w:val="nil"/>
+              <w:insideV w:val="nil"/>
+            </w:tcBorders>
+          </w:tcPr>
+          <w:p>
+            <w:pPr>
+              <w:spacing w:line="264" w:lineRule="auto" w:after="0"/>
+              <w:jc w:val="left"/>
+            </w:pPr>
+            <w:r/>
+            <w:r>
+              <w:rPr>
+                <w:rFonts w:ascii="Times New Roman" w:hAnsi="Times New Roman" w:eastAsia="SimSun"/>
+                <w:b w:val="0"/>
+                <w:sz w:val="17"/>
+              </w:rPr>
+              <w:t>用 Demucs 得到人声、鼓、贝斯和其他声部</w:t>
+            </w:r>
+          </w:p>
+        </w:tc>
+        <w:tc>
+          <w:tcPr>
+            <w:tcW w:type="dxa" w:w="3260"/>
+            <w:vAlign w:val="center"/>
+            <w:tcMar>
+              <w:top w:w="80" w:type="dxa"/>
+              <w:bottom w:w="80" w:type="dxa"/>
+              <w:start w:w="120" w:type="dxa"/>
+              <w:end w:w="120" w:type="dxa"/>
+            </w:tcMar>
+            <w:tcBorders>
+              <w:top w:val="nil"/>
+              <w:left w:val="nil"/>
+              <w:bottom w:val="nil"/>
+              <w:right w:val="nil"/>
+              <w:insideH w:val="nil"/>
+              <w:insideV w:val="nil"/>
+            </w:tcBorders>
+          </w:tcPr>
+          <w:p>
+            <w:pPr>
+              <w:spacing w:line="264" w:lineRule="auto" w:after="0"/>
+              <w:jc w:val="left"/>
+            </w:pPr>
+            <w:r/>
+            <w:r>
+              <w:rPr>
+                <w:rFonts w:ascii="Times New Roman" w:hAnsi="Times New Roman" w:eastAsia="SimSun"/>
+                <w:b w:val="0"/>
+                <w:sz w:val="17"/>
+              </w:rPr>
+              <w:t>人声泄漏、伴奏残留和分轨能量平衡</w:t>
+            </w:r>
+          </w:p>
+        </w:tc>
+      </w:tr>
+      <w:tr>
+        <w:trPr>
+          <w:cantSplit/>
+        </w:trPr>
+        <w:tc>
+          <w:tcPr>
+            <w:tcW w:type="dxa" w:w="1800"/>
+            <w:vAlign w:val="center"/>
+            <w:tcMar>
+              <w:top w:w="80" w:type="dxa"/>
+              <w:bottom w:w="80" w:type="dxa"/>
+              <w:start w:w="120" w:type="dxa"/>
+              <w:end w:w="120" w:type="dxa"/>
+            </w:tcMar>
+            <w:tcBorders>
+              <w:top w:val="nil"/>
+              <w:left w:val="nil"/>
+              <w:bottom w:val="nil"/>
+              <w:right w:val="nil"/>
+              <w:insideH w:val="nil"/>
+              <w:insideV w:val="nil"/>
+            </w:tcBorders>
+          </w:tcPr>
+          <w:p>
+            <w:pPr>
+              <w:spacing w:line="264" w:lineRule="auto" w:after="0"/>
+              <w:jc w:val="center"/>
+            </w:pPr>
+            <w:r/>
+            <w:r>
+              <w:rPr>
+                <w:rFonts w:ascii="Times New Roman" w:hAnsi="Times New Roman" w:eastAsia="SimSun"/>
+                <w:b w:val="0"/>
+                <w:sz w:val="17"/>
+              </w:rPr>
+              <w:t>内容与基频建模</w:t>
+            </w:r>
+          </w:p>
+        </w:tc>
+        <w:tc>
+          <w:tcPr>
+            <w:tcW w:type="dxa" w:w="4300"/>
+            <w:vAlign w:val="center"/>
+            <w:tcMar>
+              <w:top w:w="80" w:type="dxa"/>
+              <w:bottom w:w="80" w:type="dxa"/>
+              <w:start w:w="120" w:type="dxa"/>
+              <w:end w:w="120" w:type="dxa"/>
+            </w:tcMar>
+            <w:tcBorders>
+              <w:top w:val="nil"/>
+              <w:left w:val="nil"/>
+              <w:bottom w:val="nil"/>
+              <w:right w:val="nil"/>
+              <w:insideH w:val="nil"/>
+              <w:insideV w:val="nil"/>
+            </w:tcBorders>
+          </w:tcPr>
+          <w:p>
+            <w:pPr>
+              <w:spacing w:line="264" w:lineRule="auto" w:after="0"/>
+              <w:jc w:val="left"/>
+            </w:pPr>
+            <w:r/>
+            <w:r>
+              <w:rPr>
+                <w:rFonts w:ascii="Times New Roman" w:hAnsi="Times New Roman" w:eastAsia="SimSun"/>
+                <w:b w:val="0"/>
+                <w:sz w:val="17"/>
+              </w:rPr>
+              <w:t>从源人声提取歌唱内容表征和基频轨迹</w:t>
+            </w:r>
+          </w:p>
+        </w:tc>
+        <w:tc>
+          <w:tcPr>
+            <w:tcW w:type="dxa" w:w="3260"/>
+            <w:vAlign w:val="center"/>
+            <w:tcMar>
+              <w:top w:w="80" w:type="dxa"/>
+              <w:bottom w:w="80" w:type="dxa"/>
+              <w:start w:w="120" w:type="dxa"/>
+              <w:end w:w="120" w:type="dxa"/>
+            </w:tcMar>
+            <w:tcBorders>
+              <w:top w:val="nil"/>
+              <w:left w:val="nil"/>
+              <w:bottom w:val="nil"/>
+              <w:right w:val="nil"/>
+              <w:insideH w:val="nil"/>
+              <w:insideV w:val="nil"/>
+            </w:tcBorders>
+          </w:tcPr>
+          <w:p>
+            <w:pPr>
+              <w:spacing w:line="264" w:lineRule="auto" w:after="0"/>
+              <w:jc w:val="left"/>
+            </w:pPr>
+            <w:r/>
+            <w:r>
+              <w:rPr>
+                <w:rFonts w:ascii="Times New Roman" w:hAnsi="Times New Roman" w:eastAsia="SimSun"/>
+                <w:b w:val="0"/>
+                <w:sz w:val="17"/>
+              </w:rPr>
+              <w:t>歌词时序、旋律走向和转调稳定性</w:t>
+            </w:r>
+          </w:p>
+        </w:tc>
+      </w:tr>
+      <w:tr>
+        <w:trPr>
+          <w:cantSplit/>
+        </w:trPr>
+        <w:tc>
+          <w:tcPr>
+            <w:tcW w:type="dxa" w:w="1800"/>
+            <w:vAlign w:val="center"/>
+            <w:tcMar>
+              <w:top w:w="80" w:type="dxa"/>
+              <w:bottom w:w="80" w:type="dxa"/>
+              <w:start w:w="120" w:type="dxa"/>
+              <w:end w:w="120" w:type="dxa"/>
+            </w:tcMar>
+            <w:tcBorders>
+              <w:top w:val="nil"/>
+              <w:left w:val="nil"/>
+              <w:bottom w:val="nil"/>
+              <w:right w:val="nil"/>
+              <w:insideH w:val="nil"/>
+              <w:insideV w:val="nil"/>
+            </w:tcBorders>
+          </w:tcPr>
+          <w:p>
+            <w:pPr>
+              <w:spacing w:line="264" w:lineRule="auto" w:after="0"/>
+              <w:jc w:val="center"/>
+            </w:pPr>
+            <w:r/>
+            <w:r>
+              <w:rPr>
+                <w:rFonts w:ascii="Times New Roman" w:hAnsi="Times New Roman" w:eastAsia="SimSun"/>
+                <w:b w:val="0"/>
+                <w:sz w:val="17"/>
+              </w:rPr>
+              <w:t>音色条件建模</w:t>
+            </w:r>
+          </w:p>
+        </w:tc>
+        <w:tc>
+          <w:tcPr>
+            <w:tcW w:type="dxa" w:w="4300"/>
+            <w:vAlign w:val="center"/>
+            <w:tcMar>
+              <w:top w:w="80" w:type="dxa"/>
+              <w:bottom w:w="80" w:type="dxa"/>
+              <w:start w:w="120" w:type="dxa"/>
+              <w:end w:w="120" w:type="dxa"/>
+            </w:tcMar>
+            <w:tcBorders>
+              <w:top w:val="nil"/>
+              <w:left w:val="nil"/>
+              <w:bottom w:val="nil"/>
+              <w:right w:val="nil"/>
+              <w:insideH w:val="nil"/>
+              <w:insideV w:val="nil"/>
+            </w:tcBorders>
+          </w:tcPr>
+          <w:p>
+            <w:pPr>
+              <w:spacing w:line="264" w:lineRule="auto" w:after="0"/>
+              <w:jc w:val="left"/>
+            </w:pPr>
+            <w:r/>
+            <w:r>
+              <w:rPr>
+                <w:rFonts w:ascii="Times New Roman" w:hAnsi="Times New Roman" w:eastAsia="SimSun"/>
+                <w:b w:val="0"/>
+                <w:sz w:val="17"/>
+              </w:rPr>
+              <w:t>从授权参考样本提取目标音色嵌入</w:t>
+            </w:r>
+          </w:p>
+        </w:tc>
+        <w:tc>
+          <w:tcPr>
+            <w:tcW w:type="dxa" w:w="3260"/>
+            <w:vAlign w:val="center"/>
+            <w:tcMar>
+              <w:top w:w="80" w:type="dxa"/>
+              <w:bottom w:w="80" w:type="dxa"/>
+              <w:start w:w="120" w:type="dxa"/>
+              <w:end w:w="120" w:type="dxa"/>
+            </w:tcMar>
+            <w:tcBorders>
+              <w:top w:val="nil"/>
+              <w:left w:val="nil"/>
+              <w:bottom w:val="nil"/>
+              <w:right w:val="nil"/>
+              <w:insideH w:val="nil"/>
+              <w:insideV w:val="nil"/>
+            </w:tcBorders>
+          </w:tcPr>
+          <w:p>
+            <w:pPr>
+              <w:spacing w:line="264" w:lineRule="auto" w:after="0"/>
+              <w:jc w:val="left"/>
+            </w:pPr>
+            <w:r/>
+            <w:r>
+              <w:rPr>
+                <w:rFonts w:ascii="Times New Roman" w:hAnsi="Times New Roman" w:eastAsia="SimSun"/>
+                <w:b w:val="0"/>
+                <w:sz w:val="17"/>
+              </w:rPr>
+              <w:t>参考样本质量、情绪匹配和授权来源</w:t>
+            </w:r>
+          </w:p>
+        </w:tc>
+      </w:tr>
+      <w:tr>
+        <w:trPr>
+          <w:cantSplit/>
+        </w:trPr>
+        <w:tc>
+          <w:tcPr>
+            <w:tcW w:type="dxa" w:w="1800"/>
+            <w:vAlign w:val="center"/>
+            <w:tcMar>
+              <w:top w:w="80" w:type="dxa"/>
+              <w:bottom w:w="80" w:type="dxa"/>
+              <w:start w:w="120" w:type="dxa"/>
+              <w:end w:w="120" w:type="dxa"/>
+            </w:tcMar>
+            <w:tcBorders>
+              <w:top w:val="nil"/>
+              <w:left w:val="nil"/>
+              <w:bottom w:val="nil"/>
+              <w:right w:val="nil"/>
+              <w:insideH w:val="nil"/>
+              <w:insideV w:val="nil"/>
+            </w:tcBorders>
+          </w:tcPr>
+          <w:p>
+            <w:pPr>
+              <w:spacing w:line="264" w:lineRule="auto" w:after="0"/>
+              <w:jc w:val="center"/>
+            </w:pPr>
+            <w:r/>
+            <w:r>
+              <w:rPr>
+                <w:rFonts w:ascii="Times New Roman" w:hAnsi="Times New Roman" w:eastAsia="SimSun"/>
+                <w:b w:val="0"/>
+                <w:sz w:val="17"/>
+              </w:rPr>
+              <w:t>声线转换与声码器</w:t>
+            </w:r>
+          </w:p>
+        </w:tc>
+        <w:tc>
+          <w:tcPr>
+            <w:tcW w:type="dxa" w:w="4300"/>
+            <w:vAlign w:val="center"/>
+            <w:tcMar>
+              <w:top w:w="80" w:type="dxa"/>
+              <w:bottom w:w="80" w:type="dxa"/>
+              <w:start w:w="120" w:type="dxa"/>
+              <w:end w:w="120" w:type="dxa"/>
+            </w:tcMar>
+            <w:tcBorders>
+              <w:top w:val="nil"/>
+              <w:left w:val="nil"/>
+              <w:bottom w:val="nil"/>
+              <w:right w:val="nil"/>
+              <w:insideH w:val="nil"/>
+              <w:insideV w:val="nil"/>
+            </w:tcBorders>
+          </w:tcPr>
+          <w:p>
+            <w:pPr>
+              <w:spacing w:line="264" w:lineRule="auto" w:after="0"/>
+              <w:jc w:val="left"/>
+            </w:pPr>
+            <w:r/>
+            <w:r>
+              <w:rPr>
+                <w:rFonts w:ascii="Times New Roman" w:hAnsi="Times New Roman" w:eastAsia="SimSun"/>
+                <w:b w:val="0"/>
+                <w:sz w:val="17"/>
+              </w:rPr>
+              <w:t>由 Seed-VC 与声码器生成目标音色人声</w:t>
+            </w:r>
+          </w:p>
+        </w:tc>
+        <w:tc>
+          <w:tcPr>
+            <w:tcW w:type="dxa" w:w="3260"/>
+            <w:vAlign w:val="center"/>
+            <w:tcMar>
+              <w:top w:w="80" w:type="dxa"/>
+              <w:bottom w:w="80" w:type="dxa"/>
+              <w:start w:w="120" w:type="dxa"/>
+              <w:end w:w="120" w:type="dxa"/>
+            </w:tcMar>
+            <w:tcBorders>
+              <w:top w:val="nil"/>
+              <w:left w:val="nil"/>
+              <w:bottom w:val="nil"/>
+              <w:right w:val="nil"/>
+              <w:insideH w:val="nil"/>
+              <w:insideV w:val="nil"/>
+            </w:tcBorders>
+          </w:tcPr>
+          <w:p>
+            <w:pPr>
+              <w:spacing w:line="264" w:lineRule="auto" w:after="0"/>
+              <w:jc w:val="left"/>
+            </w:pPr>
+            <w:r/>
+            <w:r>
+              <w:rPr>
+                <w:rFonts w:ascii="Times New Roman" w:hAnsi="Times New Roman" w:eastAsia="SimSun"/>
+                <w:b w:val="0"/>
+                <w:sz w:val="17"/>
+              </w:rPr>
+              <w:t>音色相似度、咬字清晰度和高频伪影</w:t>
+            </w:r>
+          </w:p>
+        </w:tc>
+      </w:tr>
+      <w:tr>
+        <w:trPr>
+          <w:cantSplit/>
+        </w:trPr>
+        <w:tc>
+          <w:tcPr>
+            <w:tcW w:type="dxa" w:w="1800"/>
+            <w:vAlign w:val="center"/>
+            <w:tcMar>
+              <w:top w:w="80" w:type="dxa"/>
+              <w:bottom w:w="80" w:type="dxa"/>
+              <w:start w:w="120" w:type="dxa"/>
+              <w:end w:w="120" w:type="dxa"/>
+            </w:tcMar>
+            <w:tcBorders>
+              <w:top w:val="nil"/>
+              <w:left w:val="nil"/>
+              <w:bottom w:val="nil"/>
+              <w:right w:val="nil"/>
+              <w:insideH w:val="nil"/>
+              <w:insideV w:val="nil"/>
+            </w:tcBorders>
+          </w:tcPr>
+          <w:p>
+            <w:pPr>
+              <w:spacing w:line="264" w:lineRule="auto" w:after="0"/>
+              <w:jc w:val="center"/>
+            </w:pPr>
+            <w:r/>
+            <w:r>
+              <w:rPr>
+                <w:rFonts w:ascii="Times New Roman" w:hAnsi="Times New Roman" w:eastAsia="SimSun"/>
+                <w:b w:val="0"/>
+                <w:sz w:val="17"/>
+              </w:rPr>
+              <w:t>后处理与重混</w:t>
+            </w:r>
+          </w:p>
+        </w:tc>
+        <w:tc>
+          <w:tcPr>
+            <w:tcW w:type="dxa" w:w="4300"/>
+            <w:vAlign w:val="center"/>
+            <w:tcMar>
+              <w:top w:w="80" w:type="dxa"/>
+              <w:bottom w:w="80" w:type="dxa"/>
+              <w:start w:w="120" w:type="dxa"/>
+              <w:end w:w="120" w:type="dxa"/>
+            </w:tcMar>
+            <w:tcBorders>
+              <w:top w:val="nil"/>
+              <w:left w:val="nil"/>
+              <w:bottom w:val="nil"/>
+              <w:right w:val="nil"/>
+              <w:insideH w:val="nil"/>
+              <w:insideV w:val="nil"/>
+            </w:tcBorders>
+          </w:tcPr>
+          <w:p>
+            <w:pPr>
+              <w:spacing w:line="264" w:lineRule="auto" w:after="0"/>
+              <w:jc w:val="left"/>
+            </w:pPr>
+            <w:r/>
+            <w:r>
+              <w:rPr>
+                <w:rFonts w:ascii="Times New Roman" w:hAnsi="Times New Roman" w:eastAsia="SimSun"/>
+                <w:b w:val="0"/>
+                <w:sz w:val="17"/>
+              </w:rPr>
+              <w:t>去沙哑、包络保持、轻混响、人声增益和伴奏重混</w:t>
+            </w:r>
+          </w:p>
+        </w:tc>
+        <w:tc>
+          <w:tcPr>
+            <w:tcW w:type="dxa" w:w="3260"/>
+            <w:vAlign w:val="center"/>
+            <w:tcMar>
+              <w:top w:w="80" w:type="dxa"/>
+              <w:bottom w:w="80" w:type="dxa"/>
+              <w:start w:w="120" w:type="dxa"/>
+              <w:end w:w="120" w:type="dxa"/>
+            </w:tcMar>
+            <w:tcBorders>
+              <w:top w:val="nil"/>
+              <w:left w:val="nil"/>
+              <w:bottom w:val="nil"/>
+              <w:right w:val="nil"/>
+              <w:insideH w:val="nil"/>
+              <w:insideV w:val="nil"/>
+            </w:tcBorders>
+          </w:tcPr>
+          <w:p>
+            <w:pPr>
+              <w:spacing w:line="264" w:lineRule="auto" w:after="0"/>
+              <w:jc w:val="left"/>
+            </w:pPr>
+            <w:r/>
+            <w:r>
+              <w:rPr>
+                <w:rFonts w:ascii="Times New Roman" w:hAnsi="Times New Roman" w:eastAsia="SimSun"/>
+                <w:b w:val="0"/>
+                <w:sz w:val="17"/>
+              </w:rPr>
+              <w:t>自然度、空间融合和最终混音平衡</w:t>
+            </w:r>
+          </w:p>
+        </w:tc>
+      </w:tr>
+      <w:tr>
+        <w:trPr>
+          <w:cantSplit/>
+        </w:trPr>
+        <w:tc>
+          <w:tcPr>
+            <w:tcW w:type="dxa" w:w="1800"/>
+            <w:vAlign w:val="center"/>
+            <w:tcMar>
+              <w:top w:w="80" w:type="dxa"/>
+              <w:bottom w:w="80" w:type="dxa"/>
+              <w:start w:w="120" w:type="dxa"/>
+              <w:end w:w="120" w:type="dxa"/>
+            </w:tcMar>
+            <w:tcBorders>
+              <w:top w:val="nil"/>
+              <w:left w:val="nil"/>
+              <w:bottom w:val="single" w:sz="12" w:color="000000"/>
+              <w:right w:val="nil"/>
+              <w:insideH w:val="nil"/>
+              <w:insideV w:val="nil"/>
+            </w:tcBorders>
+          </w:tcPr>
+          <w:p>
+            <w:pPr>
+              <w:spacing w:line="264" w:lineRule="auto" w:after="0"/>
+              <w:jc w:val="center"/>
+            </w:pPr>
+            <w:r/>
+            <w:r>
+              <w:rPr>
+                <w:rFonts w:ascii="Times New Roman" w:hAnsi="Times New Roman" w:eastAsia="SimSun"/>
+                <w:b w:val="0"/>
+                <w:sz w:val="17"/>
+              </w:rPr>
+              <w:t>证据与水印</w:t>
+            </w:r>
+          </w:p>
+        </w:tc>
+        <w:tc>
+          <w:tcPr>
+            <w:tcW w:type="dxa" w:w="4300"/>
+            <w:vAlign w:val="center"/>
+            <w:tcMar>
+              <w:top w:w="80" w:type="dxa"/>
+              <w:bottom w:w="80" w:type="dxa"/>
+              <w:start w:w="120" w:type="dxa"/>
+              <w:end w:w="120" w:type="dxa"/>
+            </w:tcMar>
+            <w:tcBorders>
+              <w:top w:val="nil"/>
+              <w:left w:val="nil"/>
+              <w:bottom w:val="single" w:sz="12" w:color="000000"/>
+              <w:right w:val="nil"/>
+              <w:insideH w:val="nil"/>
+              <w:insideV w:val="nil"/>
+            </w:tcBorders>
+          </w:tcPr>
+          <w:p>
+            <w:pPr>
+              <w:spacing w:line="264" w:lineRule="auto" w:after="0"/>
+              <w:jc w:val="left"/>
+            </w:pPr>
+            <w:r/>
+            <w:r>
+              <w:rPr>
+                <w:rFonts w:ascii="Times New Roman" w:hAnsi="Times New Roman" w:eastAsia="SimSun"/>
+                <w:b w:val="0"/>
+                <w:sz w:val="17"/>
+              </w:rPr>
+              <w:t>输出波形、频谱、完整 Mel 图谱和频谱负形水印</w:t>
+            </w:r>
+          </w:p>
+        </w:tc>
+        <w:tc>
+          <w:tcPr>
+            <w:tcW w:type="dxa" w:w="3260"/>
+            <w:vAlign w:val="center"/>
+            <w:tcMar>
+              <w:top w:w="80" w:type="dxa"/>
+              <w:bottom w:w="80" w:type="dxa"/>
+              <w:start w:w="120" w:type="dxa"/>
+              <w:end w:w="120" w:type="dxa"/>
+            </w:tcMar>
+            <w:tcBorders>
+              <w:top w:val="nil"/>
+              <w:left w:val="nil"/>
+              <w:bottom w:val="single" w:sz="12" w:color="000000"/>
+              <w:right w:val="nil"/>
+              <w:insideH w:val="nil"/>
+              <w:insideV w:val="nil"/>
+            </w:tcBorders>
+          </w:tcPr>
+          <w:p>
+            <w:pPr>
+              <w:spacing w:line="264" w:lineRule="auto" w:after="0"/>
+              <w:jc w:val="left"/>
+            </w:pPr>
+            <w:r/>
+            <w:r>
+              <w:rPr>
+                <w:rFonts w:ascii="Times New Roman" w:hAnsi="Times New Roman" w:eastAsia="SimSun"/>
+                <w:b w:val="0"/>
+                <w:sz w:val="17"/>
+              </w:rPr>
+              <w:t>结果可复核性和 AI 生成标识可见性</w:t>
+            </w:r>
+          </w:p>
+        </w:tc>
+      </w:tr>
+    </w:tbl>
+    <w:p>
+      <w:pPr>
+        <w:keepNext w:val="0"/>
+        <w:keepLines w:val="0"/>
+        <w:spacing w:line="276" w:lineRule="auto" w:after="80"/>
+      </w:pPr>
+      <w:r>
+        <w:rPr>
+          <w:rFonts w:ascii="Times New Roman" w:hAnsi="Times New Roman" w:eastAsia="SimSun"/>
+          <w:b w:val="0"/>
+          <w:sz w:val="4"/>
+        </w:rPr>
+      </w:r>
+    </w:p>
+    <w:p>
+      <w:pPr>
         <w:keepNext/>
         <w:spacing w:before="140" w:after="100"/>
       </w:pPr>
@@ -1877,7 +2817,7 @@
           <w:b w:val="0"/>
           <w:sz w:val="21"/>
         </w:rPr>
-        <w:t>音乐生成路径以 ACE-Step 为基础模型，训练数据包含 6016 条 8 秒 EDM 片段，划分为 train/validation/test=4833/557/626。系统从 step=960 的本地 LoRA bundle 继续训练 240 个本地 step，到 step=1200；可训练范围覆盖最后 2 个 Transformer block，参数量约 1.12M。这种设置保留 MusicDCAE、文本编码器和大部分扩散主干的通用能力，只让末端去噪决策层学习目标 EDM 数据域的节奏、低频、合成器音色和混音偏移。</w:t>
+        <w:t>音乐生成路径以 ACE-Step 为基础模型，训练数据包含 6016 条 8 秒 EDM 片段，划分为训练/验证/测试=4833/557/626。系统从已有 LoRA 适配器的第 960 步继续训练 240 步，到第 1200 步；可训练范围覆盖最后 2 个 Transformer block，参数量约 1.12M。这种设置保留 MusicDCAE、文本编码器和大部分扩散主干的通用能力，只让末端去噪决策层学习目标 EDM 数据域的节奏、低频、合成器音色和混音偏移。</w:t>
       </w:r>
     </w:p>
     <w:p>
@@ -1893,7 +2833,142 @@
           <w:i/>
           <w:sz w:val="23"/>
         </w:rPr>
-        <w:t>W' = W + ΔW, ΔW = α/r · B · A</w:t>
+        <w:t>W</w:t>
+      </w:r>
+      <w:r>
+        <w:rPr>
+          <w:rFonts w:ascii="Times New Roman" w:hAnsi="Times New Roman" w:eastAsia="SimSun"/>
+          <w:b w:val="0"/>
+          <w:i w:val="0"/>
+          <w:sz w:val="23"/>
+        </w:rPr>
+        <w:t>′</w:t>
+      </w:r>
+      <w:r>
+        <w:rPr>
+          <w:rFonts w:ascii="Times New Roman" w:hAnsi="Times New Roman" w:eastAsia="SimSun"/>
+          <w:b w:val="0"/>
+          <w:i w:val="0"/>
+          <w:sz w:val="23"/>
+        </w:rPr>
+        <w:t xml:space="preserve"> = </w:t>
+      </w:r>
+      <w:r>
+        <w:rPr>
+          <w:rFonts w:ascii="Times New Roman" w:hAnsi="Times New Roman" w:eastAsia="SimSun"/>
+          <w:b w:val="0"/>
+          <w:i/>
+          <w:sz w:val="23"/>
+        </w:rPr>
+        <w:t>W</w:t>
+      </w:r>
+      <w:r>
+        <w:rPr>
+          <w:rFonts w:ascii="Times New Roman" w:hAnsi="Times New Roman" w:eastAsia="SimSun"/>
+          <w:b w:val="0"/>
+          <w:i w:val="0"/>
+          <w:sz w:val="23"/>
+        </w:rPr>
+        <w:t xml:space="preserve"> + Δ</w:t>
+      </w:r>
+      <w:r>
+        <w:rPr>
+          <w:rFonts w:ascii="Times New Roman" w:hAnsi="Times New Roman" w:eastAsia="SimSun"/>
+          <w:b w:val="0"/>
+          <w:i/>
+          <w:sz w:val="23"/>
+        </w:rPr>
+        <w:t>W</w:t>
+      </w:r>
+      <w:r>
+        <w:rPr>
+          <w:rFonts w:ascii="Times New Roman" w:hAnsi="Times New Roman" w:eastAsia="SimSun"/>
+          <w:b w:val="0"/>
+          <w:i w:val="0"/>
+          <w:sz w:val="23"/>
+        </w:rPr>
+        <w:t>,  Δ</w:t>
+      </w:r>
+      <w:r>
+        <w:rPr>
+          <w:rFonts w:ascii="Times New Roman" w:hAnsi="Times New Roman" w:eastAsia="SimSun"/>
+          <w:b w:val="0"/>
+          <w:i/>
+          <w:sz w:val="23"/>
+        </w:rPr>
+        <w:t>W</w:t>
+      </w:r>
+      <w:r>
+        <w:rPr>
+          <w:rFonts w:ascii="Times New Roman" w:hAnsi="Times New Roman" w:eastAsia="SimSun"/>
+          <w:b w:val="0"/>
+          <w:i w:val="0"/>
+          <w:sz w:val="23"/>
+        </w:rPr>
+        <w:t xml:space="preserve"> = </w:t>
+      </w:r>
+      <w:r>
+        <w:rPr>
+          <w:rFonts w:ascii="Times New Roman" w:hAnsi="Times New Roman" w:eastAsia="SimSun"/>
+          <w:b w:val="0"/>
+          <w:i w:val="0"/>
+          <w:sz w:val="23"/>
+        </w:rPr>
+        <w:t>α</w:t>
+      </w:r>
+      <w:r>
+        <w:rPr>
+          <w:rFonts w:ascii="Times New Roman" w:hAnsi="Times New Roman" w:eastAsia="SimSun"/>
+          <w:b w:val="0"/>
+          <w:i w:val="0"/>
+          <w:sz w:val="23"/>
+        </w:rPr>
+        <w:t>/</w:t>
+      </w:r>
+      <w:r>
+        <w:rPr>
+          <w:rFonts w:ascii="Times New Roman" w:hAnsi="Times New Roman" w:eastAsia="SimSun"/>
+          <w:b w:val="0"/>
+          <w:i/>
+          <w:sz w:val="23"/>
+        </w:rPr>
+        <w:t>r</w:t>
+      </w:r>
+      <w:r>
+        <w:rPr>
+          <w:rFonts w:ascii="Times New Roman" w:hAnsi="Times New Roman" w:eastAsia="SimSun"/>
+          <w:b w:val="0"/>
+          <w:i w:val="0"/>
+          <w:sz w:val="23"/>
+        </w:rPr>
+        <w:t xml:space="preserve"> · </w:t>
+      </w:r>
+      <w:r>
+        <w:rPr>
+          <w:rFonts w:ascii="Times New Roman" w:hAnsi="Times New Roman" w:eastAsia="SimSun"/>
+          <w:b w:val="0"/>
+          <w:i/>
+          <w:sz w:val="23"/>
+        </w:rPr>
+        <w:t>B</w:t>
+      </w:r>
+      <w:r>
+        <w:rPr>
+          <w:rFonts w:ascii="Times New Roman" w:hAnsi="Times New Roman" w:eastAsia="SimSun"/>
+          <w:b w:val="0"/>
+          <w:i w:val="0"/>
+          <w:sz w:val="23"/>
+        </w:rPr>
+        <w:t xml:space="preserve"> · </w:t>
+      </w:r>
+      <w:r>
+        <w:rPr>
+          <w:rFonts w:ascii="Times New Roman" w:hAnsi="Times New Roman" w:eastAsia="SimSun"/>
+          <w:b w:val="0"/>
+          <w:i/>
+          <w:sz w:val="23"/>
+        </w:rPr>
+        <w:t>A</w:t>
       </w:r>
     </w:p>
     <w:p>
@@ -1909,12 +2984,7 @@
           <w:b w:val="0"/>
           <w:sz w:val="21"/>
         </w:rPr>
-        <w:t>LoRA 实验采用同 seed 控制变量设计。网页端固定 prompt、歌词、seed、scheduler、采样步数、guidance 和后处理参数，只改变是否加载 LoRA adapter 或 LoRA 权重强度。这样，baseline 与 LoRA 输出从相同随机初态出发，差异主要来自 adapter 对去噪轨迹的影响，而不是来自不同 seed 造成的偶然旋律、鼓组或和声变化。</w:t>
-      </w:r>
-    </w:p>
-    <w:p>
-      <w:r>
-        <w:br w:type="page"/>
+        <w:t>LoRA 实验采用同种子控制变量设计。实验固定 prompt、歌词、seed、scheduler、采样步数、guidance 和后处理参数，只改变是否加载 LoRA adapter 或 LoRA 权重强度。这样，baseline 与 LoRA 输出从相同随机初态出发，差异主要来自 adapter 对去噪轨迹的影响，而不是来自不同 seed 造成的偶然旋律、鼓组或和声变化。</w:t>
       </w:r>
     </w:p>
     <w:p>
@@ -1987,7 +3057,7 @@
           <w:b/>
           <w:sz w:val="19"/>
         </w:rPr>
-        <w:t>表3 LoRA 音乐生成路径的训练与推理步骤</w:t>
+        <w:t>表4 LoRA 音乐生成路径的训练与推理步骤</w:t>
       </w:r>
     </w:p>
     <w:tbl>
@@ -2705,7 +3775,7 @@
           <w:b w:val="0"/>
           <w:sz w:val="21"/>
         </w:rPr>
-        <w:t>歌声音色转换链路包含输入建档、音频标准化、可选分轨、转换输入清理、Seed-VC 推理、人声后处理和伴奏重混。系统优先使用 Demucs 将上传歌曲分解为 vocals、drums、bass 和 other；若 vocals 存在，则只将 vocals 送入 Seed-VC，避免伴奏被错误转换。drums、bass 和 other 被合成为伴奏 a，并在最后与转换后人声重新混合，得到完整新歌。</w:t>
+        <w:t>歌声音色转换链路包含输入登记、音频标准化、声源分离、转换输入清理、Seed-VC 推理、人声后处理和伴奏重混。系统优先使用 Demucs 将上传歌曲分解为人声、鼓、贝斯和其他声部；若人声分轨存在，则只将人声送入 Seed-VC，避免伴奏被错误转换。非人声分轨被合成为伴奏，并在最后与转换后人声重新混合，得到完整新歌。</w:t>
       </w:r>
     </w:p>
     <w:p>
@@ -2887,12 +3957,7 @@
           <w:b w:val="0"/>
           <w:sz w:val="21"/>
         </w:rPr>
-        <w:t>式中 g_v 为人声重混增益。转换后人声并不直接与伴奏相加，而是先经过高频去沙哑、能量包络匹配、峰值约束和轻混响。去沙哑用于抑制分轨泄漏和声码器高频毛刺；包络匹配用于保留源 vocals 的演唱力度和情绪起伏；轻混响用于减弱干声贴耳感，使转换后人声更自然地融入伴奏。</w:t>
-      </w:r>
-    </w:p>
-    <w:p>
-      <w:r>
-        <w:br w:type="page"/>
+        <w:t>式中人声重混增益用于控制转换后人声进入最终混音时的响度比例。转换后人声并不直接与伴奏相加，而是先经过高频去沙哑、能量包络匹配、峰值约束和轻混响。去沙哑用于抑制分轨泄漏和声码器高频毛刺；包络匹配用于保留源人声的演唱力度和情绪起伏；轻混响用于减弱干声贴耳感，使转换后人声更自然地融入伴奏。</w:t>
       </w:r>
     </w:p>
     <w:p>
@@ -2908,7 +3973,7 @@
           <w:b/>
           <w:sz w:val="19"/>
         </w:rPr>
-        <w:t>表4 音色转换模块接口</w:t>
+        <w:t>表5 音色转换模块接口</w:t>
       </w:r>
     </w:p>
     <w:tbl>
@@ -3069,7 +4134,7 @@
                 <w:b w:val="0"/>
                 <w:sz w:val="17"/>
               </w:rPr>
-              <w:t>建档</w:t>
+              <w:t>输入登记</w:t>
             </w:r>
           </w:p>
         </w:tc>
@@ -3104,7 +4169,7 @@
                 <w:b w:val="0"/>
                 <w:sz w:val="17"/>
               </w:rPr>
-              <w:t>上传歌曲、目标音色目录、pitch、steps、CFG</w:t>
+              <w:t>上传歌曲、目标音色参考、转调量、扩散步数、CFG</w:t>
             </w:r>
           </w:p>
         </w:tc>
@@ -3139,7 +4204,7 @@
                 <w:b w:val="0"/>
                 <w:sz w:val="17"/>
               </w:rPr>
-              <w:t>生成任务目录和参数记录</w:t>
+              <w:t>生成实验参数记录</w:t>
             </w:r>
           </w:p>
         </w:tc>
@@ -3179,7 +4244,7 @@
                 <w:b w:val="0"/>
                 <w:sz w:val="17"/>
               </w:rPr>
-              <w:t>分轨</w:t>
+              <w:t>声源分离</w:t>
             </w:r>
           </w:p>
         </w:tc>
@@ -3240,7 +4305,7 @@
           <w:p>
             <w:pPr>
               <w:spacing w:line="264" w:lineRule="auto" w:after="0"/>
-              <w:jc w:val="left"/>
+              <w:jc w:val="center"/>
             </w:pPr>
             <w:r/>
             <w:r>
@@ -3249,7 +4314,7 @@
                 <w:b w:val="0"/>
                 <w:sz w:val="17"/>
               </w:rPr>
-              <w:t>vocals、drums、bass、other</w:t>
+              <w:t>人声、鼓、贝斯、其他声部</w:t>
             </w:r>
           </w:p>
         </w:tc>
@@ -3324,7 +4389,7 @@
                 <w:b w:val="0"/>
                 <w:sz w:val="17"/>
               </w:rPr>
-              <w:t>vocals</w:t>
+              <w:t>分离后人声</w:t>
             </w:r>
           </w:p>
         </w:tc>
@@ -3425,7 +4490,7 @@
           <w:p>
             <w:pPr>
               <w:spacing w:line="264" w:lineRule="auto" w:after="0"/>
-              <w:jc w:val="left"/>
+              <w:jc w:val="center"/>
             </w:pPr>
             <w:r/>
             <w:r>
@@ -3434,7 +4499,7 @@
                 <w:b w:val="0"/>
                 <w:sz w:val="17"/>
               </w:rPr>
-              <w:t>清理后 vocals、目标音色参考</w:t>
+              <w:t>清理后人声、目标音色参考</w:t>
             </w:r>
           </w:p>
         </w:tc>
@@ -3469,7 +4534,7 @@
                 <w:b w:val="0"/>
                 <w:sz w:val="17"/>
               </w:rPr>
-              <w:t>Seed-VC raw 转换人声</w:t>
+              <w:t>Seed-VC 输出的初始转换人声</w:t>
             </w:r>
           </w:p>
         </w:tc>
@@ -3535,7 +4600,7 @@
           <w:p>
             <w:pPr>
               <w:spacing w:line="264" w:lineRule="auto" w:after="0"/>
-              <w:jc w:val="left"/>
+              <w:jc w:val="center"/>
             </w:pPr>
             <w:r/>
             <w:r>
@@ -3544,7 +4609,7 @@
                 <w:b w:val="0"/>
                 <w:sz w:val="17"/>
               </w:rPr>
-              <w:t>raw 人声、源 vocals 包络</w:t>
+              <w:t>初始转换人声、源人声能量包络</w:t>
             </w:r>
           </w:p>
         </w:tc>
@@ -3579,7 +4644,7 @@
                 <w:b w:val="0"/>
                 <w:sz w:val="17"/>
               </w:rPr>
-              <w:t>去沙哑、力度保持、轻混响后的 y_vc</w:t>
+              <w:t>去沙哑、力度保持、轻混响后的目标音色人声</w:t>
             </w:r>
           </w:p>
         </w:tc>
@@ -3654,7 +4719,7 @@
                 <w:b w:val="0"/>
                 <w:sz w:val="17"/>
               </w:rPr>
-              <w:t>y_vc、伴奏 a、人声增益 g_v</w:t>
+              <w:t>目标音色人声、伴奏、人声重混增益</w:t>
             </w:r>
           </w:p>
         </w:tc>
@@ -3680,7 +4745,7 @@
           <w:p>
             <w:pPr>
               <w:spacing w:line="264" w:lineRule="auto" w:after="0"/>
-              <w:jc w:val="left"/>
+              <w:jc w:val="center"/>
             </w:pPr>
             <w:r/>
             <w:r>
@@ -3689,7 +4754,7 @@
                 <w:b w:val="0"/>
                 <w:sz w:val="17"/>
               </w:rPr>
-              <w:t>新歌 y_mix 和 Mel 证据图</w:t>
+              <w:t>完整新歌和 Mel 证据图</w:t>
             </w:r>
           </w:p>
         </w:tc>
@@ -3736,7 +4801,7 @@
           <w:b w:val="0"/>
           <w:sz w:val="21"/>
         </w:rPr>
-        <w:t>为了使实验不依赖口头描述，系统把一次任务的所有关键中间产物写入同一目录，包括 uploaded_song、分离 stems、converted_vocal_raw、converted_vocal_dry、converted_vocal_reverb、voice_conversion_mix、analysis.txt、task.json 和 task.log。报告中的图表均由这些文件重新生成，避免出现无法追溯的数据来源。</w:t>
+        <w:t>为了使实验不依赖口头描述，系统将关键中间产物组织为统一的实验记录单元，包括输入音频副本、分离音轨、转换前后人声、重混输出、参数表、运行记录和声学诊断图。报告中的图表均由这些实验产物重新生成，避免出现无法追溯的数据来源。</w:t>
       </w:r>
     </w:p>
     <w:p>
@@ -3809,12 +4874,7 @@
           <w:b/>
           <w:sz w:val="19"/>
         </w:rPr>
-        <w:t>图5 任务目录中的可复现实验证据。每个输出均可追溯到同一任务 ID、参数记录和命令日志。</w:t>
-      </w:r>
-    </w:p>
-    <w:p>
-      <w:r>
-        <w:br w:type="page"/>
+        <w:t>图5 实验记录单元中的可复现实验证据。输入、分轨、转换、重混、参数和诊断图被组织为同一复核链路。</w:t>
       </w:r>
     </w:p>
     <w:p>
@@ -3844,7 +4904,7 @@
           <w:b w:val="0"/>
           <w:sz w:val="21"/>
         </w:rPr>
-        <w:t>实验分为三组。第一组验证 LoRA 音乐生成路径是否在同 seed 条件下改变目标风格倾向；第二组验证授权音色转换链路是否能完成分轨、转换、后处理和伴奏重混；第三组验证 AI Mel 水印是否能在完整谱图末尾以频谱形态显现。三组实验共享任务级记录机制，但评价对象不同，因此不混合成一个总评分。</w:t>
+        <w:t>实验分为三组。第一组验证 LoRA 音乐生成路径是否在同 seed 条件下改变目标风格倾向；第二组验证授权音色转换链路是否能完成分轨、转换、后处理和伴奏重混；第三组验证 AI Mel 水印是否能在完整谱图末尾以频谱形态显现。三组实验共享实验级记录机制，但评价对象不同，因此不混合成一个总评分。</w:t>
       </w:r>
     </w:p>
     <w:p>
@@ -3860,7 +4920,7 @@
           <w:b/>
           <w:sz w:val="19"/>
         </w:rPr>
-        <w:t>表5 实验变量与控制条件</w:t>
+        <w:t>表6 实验变量与控制条件</w:t>
       </w:r>
     </w:p>
     <w:tbl>
@@ -4454,7 +5514,7 @@
           <w:b/>
           <w:sz w:val="19"/>
         </w:rPr>
-        <w:t>表6 客观指标与解释</w:t>
+        <w:t>表7 客观指标与解释</w:t>
       </w:r>
     </w:p>
     <w:tbl>
@@ -5426,7 +6486,7 @@
           <w:b w:val="0"/>
           <w:sz w:val="21"/>
         </w:rPr>
-        <w:t>在任务 20260603_093222_voice_conversion_d703c93b 中，系统保存了从上传音频到最终重混结果的完整证据链。输出音频时长为 279.7 秒，采样率为 44100 Hz，BPM=136.0，RMS=0.1363，低频比例=0.3401，起音密度=2.71/s。这些指标不直接等价于主观音质，但可以用于判断分轨、重混和高频伪影是否出现明显异常。</w:t>
+        <w:t>在授权音色转换实验 E-VC-01 中，系统保存了从输入音频到最终重混结果的完整证据链。输出音频时长为 279.7 秒，采样率为 44100 Hz，BPM=136.0，RMS=0.1363，低频比例=0.3401，起音密度=2.71/s。这些指标不直接等价于主观音质，但可以用于判断分轨、重混和高频伪影是否出现明显异常。</w:t>
       </w:r>
     </w:p>
     <w:p>
@@ -5483,7 +6543,7 @@
           <w:b/>
           <w:sz w:val="19"/>
         </w:rPr>
-        <w:t>图8 分离音轨与重混证据。左侧比较各 stem 和最终输出能量，右侧列出任务级产物，说明结果来自可复核链路。</w:t>
+        <w:t>图8 分离音轨与重混证据。左侧比较各分轨和最终输出能量，右侧列出实验级产物，说明结果来自可复核链路。</w:t>
       </w:r>
     </w:p>
     <w:p>
@@ -5561,7 +6621,7 @@
           <w:b/>
           <w:sz w:val="19"/>
         </w:rPr>
-        <w:t>表7 实际音色转换任务记录</w:t>
+        <w:t>表8 授权音色转换实验记录</w:t>
       </w:r>
     </w:p>
     <w:tbl>
@@ -5722,7 +6782,7 @@
                 <w:b w:val="0"/>
                 <w:sz w:val="17"/>
               </w:rPr>
-              <w:t>任务编号</w:t>
+              <w:t>实验编号</w:t>
             </w:r>
           </w:p>
         </w:tc>
@@ -5748,7 +6808,7 @@
           <w:p>
             <w:pPr>
               <w:spacing w:line="264" w:lineRule="auto" w:after="0"/>
-              <w:jc w:val="left"/>
+              <w:jc w:val="center"/>
             </w:pPr>
             <w:r/>
             <w:r>
@@ -5757,7 +6817,7 @@
                 <w:b w:val="0"/>
                 <w:sz w:val="17"/>
               </w:rPr>
-              <w:t>20260603_093222_voice_conversion_d703c93b</w:t>
+              <w:t>E-VC-01</w:t>
             </w:r>
           </w:p>
         </w:tc>
@@ -5792,7 +6852,7 @@
                 <w:b w:val="0"/>
                 <w:sz w:val="17"/>
               </w:rPr>
-              <w:t>作为复现实验单元的索引</w:t>
+              <w:t>作为论文中的匿名复现实验单元</w:t>
             </w:r>
           </w:p>
         </w:tc>
@@ -5832,7 +6892,7 @@
                 <w:b w:val="0"/>
                 <w:sz w:val="17"/>
               </w:rPr>
-              <w:t>输出文件</w:t>
+              <w:t>输出属性</w:t>
             </w:r>
           </w:p>
         </w:tc>
@@ -5858,7 +6918,7 @@
           <w:p>
             <w:pPr>
               <w:spacing w:line="264" w:lineRule="auto" w:after="0"/>
-              <w:jc w:val="left"/>
+              <w:jc w:val="center"/>
             </w:pPr>
             <w:r/>
             <w:r>
@@ -5867,7 +6927,7 @@
                 <w:b w:val="0"/>
                 <w:sz w:val="17"/>
               </w:rPr>
-              <w:t>voice_conversion_mix_20260603_093222_voice_conversion_d703c93b.wav</w:t>
+              <w:t>完整重混歌曲</w:t>
             </w:r>
           </w:p>
         </w:tc>
@@ -5977,7 +7037,7 @@
                 <w:b w:val="0"/>
                 <w:sz w:val="17"/>
               </w:rPr>
-              <w:t>已生成 vocals、drums、bass、other，并由 drums/bass/other 合成伴奏</w:t>
+              <w:t>已分离人声、鼓、贝斯和其他伴奏，并由非人声分轨合成伴奏</w:t>
             </w:r>
           </w:p>
         </w:tc>
@@ -6265,7 +7325,7 @@
           <w:b w:val="0"/>
           <w:sz w:val="21"/>
         </w:rPr>
-        <w:t>从结果链路看，分轨文件和重混文件同时存在，说明网页端不再只返回转换后人声，而是能够将转换后人声与伴奏组合为新的完整歌曲。若后续听感仍出现沙哑，应重点比较 converted_vocal_raw 与 converted_vocal_reverb 的频谱差异；若情绪力度不足，应比较源 vocals 包络与后处理后 y_vc 包络，而不是仅调整重混音量。</w:t>
+        <w:t>从结果链路看，分离音轨和重混输出同时存在，说明系统不是只返回转换后人声，而是能够将目标音色人声与伴奏组合为新的完整歌曲。若后续听感仍出现沙哑，应重点比较初始转换人声与加入轻混响后人声的频谱差异；若情绪力度不足，应比较源人声能量包络与后处理后目标音色人声包络，而不是仅调整重混音量。</w:t>
       </w:r>
     </w:p>
     <w:p>
@@ -6311,7 +7371,7 @@
           <w:b/>
           <w:sz w:val="19"/>
         </w:rPr>
-        <w:t>表8 秒段落级 LoRA 二次微调方案</w:t>
+        <w:t>表9 秒段落级 LoRA 二次微调方案</w:t>
       </w:r>
     </w:p>
     <w:tbl>
@@ -7143,7 +8203,7 @@
           <w:b w:val="0"/>
           <w:sz w:val="21"/>
         </w:rPr>
-        <w:t>针对长音频任务，系统记录了输入时长约 279.7 秒、扩散步数 50、CFG=0.75、去沙哑强度 0.75、情感保持 1.00 和预计耗时约 381.8 分钟。整曲转换更适合作为离线任务执行，交互式网页端则适合先用短片段筛选 pitch、CFG、扩散步数和后处理参数。</w:t>
+        <w:t>针对长音频任务，系统记录了输入时长约 279.7 秒、扩散步数 50、CFG=0.75、去沙哑强度 0.75、情感保持 1.00 和预计耗时约 381.8 分钟。整曲转换更适合作为离线实验执行，交互式系统适合先用短片段筛选转调量、CFG、扩散步数和后处理参数。</w:t>
       </w:r>
     </w:p>
     <w:p>
@@ -7360,7 +8420,7 @@
           <w:b w:val="0"/>
           <w:sz w:val="21"/>
         </w:rPr>
-        <w:t>本文系统的优点是模块边界明确、证据链完整，并且能把用户在网页端观察到的问题映射到具体技术环节。如果输出声音沙哑，应先检查分轨泄漏和声码器高频伪影，再调节去沙哑强度；如果情感不足，应检查源 vocals 包络和 emotion_strength；如果整曲任务耗时过长，应采用短片段参数筛选和整曲离线处理，而不是把耗时问题写成模型失败。</w:t>
+        <w:t>本文系统的优点是模块边界明确、证据链完整，并且能把听感问题映射到具体技术环节。如果输出声音沙哑，应先检查分轨泄漏和声码器高频伪影，再调节去沙哑强度；如果情感不足，应检查源人声包络和情感保持系数；如果整曲任务耗时过长，应采用短片段参数筛选和整曲离线处理，而不是把耗时问题写成模型失败。</w:t>
       </w:r>
     </w:p>
     <w:p>
@@ -7392,7 +8452,7 @@
           <w:b/>
           <w:sz w:val="19"/>
         </w:rPr>
-        <w:t>表9 局限性与后续改进</w:t>
+        <w:t>表10 局限性与后续改进</w:t>
       </w:r>
     </w:p>
     <w:tbl>
@@ -8000,7 +9060,7 @@
           <w:b w:val="0"/>
           <w:sz w:val="21"/>
         </w:rPr>
-        <w:t>本文提出并实现了一个面向智能语音处理的音乐生成与授权歌声音色转换系统。系统在音乐生成侧使用 ACE-Step 与 LoRA 完成目标 EDM 数据域适配，在歌声音色转换侧使用 Demucs 和 Seed-VC 完成人声分离、音色迁移和伴奏重混。与单纯展示生成样例不同，本文强调任务级复现实验单元，保存输入、分轨、转换、后处理、重混、日志、指标和 Mel 水印图。实验表明，该系统能够把音乐风格适配、授权音色转换和 AI 生成标识组织为一条可检查的工程链路，为后续加入主观听评、音色相似度度量和高性能推理部署提供基础。</w:t>
+        <w:t>本文提出并实现了一个面向智能语音处理的音乐生成与授权歌声音色转换系统。系统在音乐生成侧使用 ACE-Step 与 LoRA 完成目标 EDM 数据域适配，在歌声音色转换侧使用 Demucs 和 Seed-VC 完成人声分离、音色迁移和伴奏重混。与单纯展示生成样例不同，本文强调实验级复现实验单元，保存输入、分轨、转换、后处理、重混、参数、指标和 Mel 水印图。实验表明，该系统能够把音乐风格适配、授权音色转换和 AI 生成标识组织为一条可检查的工程链路，为后续加入主观听评、音色相似度度量和高性能推理部署提供基础。</w:t>
       </w:r>
     </w:p>
     <w:p>

</xml_diff>

<commit_message>
improve paper method principles and figures
</commit_message>
<xml_diff>
--- a/report/intelligent_speech_processing_paper/ace_step_isp_lora_voice_conversion_paper.docx
+++ b/report/intelligent_speech_processing_paper/ace_step_isp_lora_voice_conversion_paper.docx
@@ -77,7 +77,7 @@
           <w:b w:val="0"/>
           <w:sz w:val="21"/>
         </w:rPr>
-        <w:t>面向音乐生成、歌声音色替换和网页化实验复现的综合需求，本文提出并实现一种双路径智能音频处理系统。系统将文本到音乐生成与授权歌声音色转换拆分为两个独立研究变量：音乐生成路径以 ACE-Step 为基础模型，通过 LoRA 对目标 EDM 数据域进行参数高效适配；音色转换路径以 Demucs 完成人声与伴奏分离，以 Seed-VC 完成零样本歌声音色转换，并在转换后执行去沙哑、能量包络保持、轻混响和伴奏重混。为避免仅凭单个听感样例给出结论，本文建立实验级证据链：每次实验保存输入音频、分轨结果、转换人声、伴奏重混、参数记录、波形频谱诊断图和完整 Mel 水印图。音乐生成实验使用 6016 条 8 秒 EDM 片段，训练/验证/测试划分为 4833/557/626；段落级增强实验进一步构建 360 条 15 秒片段，覆盖 drop=130, breakdown=86, build-up=65, intro=36, loop=25, outro=18 等结构标签。授权音色转换实验以匿名样例 E-VC-01 验证端到端链路，输出时长 279.7 秒，BPM=136.0，RMS=0.1363，低频比例=0.3401，Seed-VC 运行代价 RTF=19.30。实验结果表明，该系统能够把风格适配、歌声音色迁移、分轨重混和 AI 生成标识组织为可复核的智能语音处理流程。项目源代码仓库地址：https://github.com/anmoryli/edm-adapter。</w:t>
+        <w:t>面向音乐生成、歌声音色替换和网页化实验复现的综合需求，本文提出并实现一种双路径智能音频处理系统。系统将文本到音乐生成与授权歌声音色转换拆分为两个独立研究变量：音乐生成路径以 ACE-Step 为基础模型，通过 LoRA 对目标 EDM 数据域进行参数高效适配；音色转换路径以 Demucs 完成人声与伴奏分离，以 Seed-VC 完成零样本歌声音色转换，并在转换后执行去沙哑、能量包络保持、轻混响和伴奏重混。为避免仅凭单个听感样例给出结论，本文建立实验级证据链：每次实验保存输入音频、分轨结果、转换人声、伴奏重混、参数记录、波形频谱诊断图和完整 Mel 水印图。音乐生成实验使用 6016 条 8 秒 EDM 片段，训练/验证/测试划分为 4833/557/626；段落级增强实验进一步构建 360 条 15 秒片段，覆盖 drop=130, breakdown=86, build-up=65, intro=36, loop=25, outro=18 等结构标签。授权音色转换实验以匿名样例 E-VC-01 验证端到端链路，输出时长 30.0 秒，BPM=136.0，RMS=0.0949，低频比例=0.0736，Seed-VC 运行代价 RTF=19.12。实验结果表明，该系统能够把风格适配、歌声音色迁移、分轨重混和 AI 生成标识组织为可复核的智能语音处理流程。项目源代码仓库地址：https://github.com/anmoryli/edm-adapter。</w:t>
       </w:r>
     </w:p>
     <w:p>
@@ -183,7 +183,7 @@
           <w:b w:val="0"/>
           <w:sz w:val="21"/>
         </w:rPr>
-        <w:t>本文主要贡献包括：1）设计音乐生成与授权歌声音色转换的双路径系统架构，避免 LoRA 风格适配与 Seed-VC 音色迁移相互混淆；2）给出歌声音色转换的形式化定义和工程实现链路，包括 Demucs 分轨、Seed-VC 转换、去沙哑、包络保持、轻混响和伴奏重混；3）建立实验级证据链，将输入音频、分轨、转换、重混、参数和诊断图组织为最小复现实验单元；4）在最终生成音频的完整 Mel 图谱末尾加入由频谱能量构成的“AI生成”负形水印，用于标识 AI 生成结果。</w:t>
+        <w:t>本文主要贡献包括：1）设计音乐生成与授权歌声音色转换的双路径系统架构，避免 LoRA 风格适配与 Seed-VC 音色迁移相互混淆；2）从低秩残差注入和内容-基频-音色解耦两个层面解释核心原理，并给出对应科研图和形式化表达；3）给出歌声音色转换的工程实现链路，包括 Demucs 分轨、Seed-VC 转换、去沙哑、包络保持、轻混响和伴奏重混；4）建立实验级证据链，将输入音频、分轨、转换、重混、参数和诊断图组织为最小复现实验单元；5）在最终生成音频的完整 Mel 图谱末尾加入由频谱能量构成的“AI生成”负形水印，用于标识 AI 生成结果。</w:t>
       </w:r>
     </w:p>
     <w:p>
@@ -2817,7 +2817,7 @@
           <w:b w:val="0"/>
           <w:sz w:val="21"/>
         </w:rPr>
-        <w:t>音乐生成路径以 ACE-Step 为基础模型，训练数据包含 6016 条 8 秒 EDM 片段，划分为训练/验证/测试=4833/557/626。系统从已有 LoRA 适配器的第 960 步继续训练 240 步，到第 1200 步；可训练范围覆盖最后 2 个 Transformer block，参数量约 1.12M。这种设置保留 MusicDCAE、文本编码器和大部分扩散主干的通用能力，只让末端去噪决策层学习目标 EDM 数据域的节奏、低频、合成器音色和混音偏移。</w:t>
+        <w:t>LoRA 的核心不是重新训练基础模型，而是在已有线性映射旁加入一个低秩残差分支。对 Transformer 中的线性投影而言，若直接微调整个权重矩阵，更新量与矩阵规模同阶，既增加显存和存储成本，也容易让基础模型已有能力发生漂移。LoRA 假设面向特定任务的数据域偏移具有较低的内在秩，因此把更新矩阵分解为两个小矩阵：先把隐藏状态投影到低维瓶颈，再投影回原维度，并用缩放系数控制残差强度。</w:t>
       </w:r>
     </w:p>
     <w:p>
@@ -2833,7 +2833,7 @@
           <w:i/>
           <w:sz w:val="23"/>
         </w:rPr>
-        <w:t>W</w:t>
+        <w:t>h</w:t>
       </w:r>
       <w:r>
         <w:rPr>
@@ -2868,8 +2868,9 @@
           <w:b w:val="0"/>
           <w:i w:val="0"/>
           <w:sz w:val="23"/>
+          <w:vertAlign w:val="subscript"/>
         </w:rPr>
-        <w:t xml:space="preserve"> + Δ</w:t>
+        <w:t>0</w:t>
       </w:r>
       <w:r>
         <w:rPr>
@@ -2878,7 +2879,7 @@
           <w:i/>
           <w:sz w:val="23"/>
         </w:rPr>
-        <w:t>W</w:t>
+        <w:t>h</w:t>
       </w:r>
       <w:r>
         <w:rPr>
@@ -2887,25 +2888,7 @@
           <w:i w:val="0"/>
           <w:sz w:val="23"/>
         </w:rPr>
-        <w:t>,  Δ</w:t>
-      </w:r>
-      <w:r>
-        <w:rPr>
-          <w:rFonts w:ascii="Times New Roman" w:hAnsi="Times New Roman" w:eastAsia="SimSun"/>
-          <w:b w:val="0"/>
-          <w:i/>
-          <w:sz w:val="23"/>
-        </w:rPr>
-        <w:t>W</w:t>
-      </w:r>
-      <w:r>
-        <w:rPr>
-          <w:rFonts w:ascii="Times New Roman" w:hAnsi="Times New Roman" w:eastAsia="SimSun"/>
-          <w:b w:val="0"/>
-          <w:i w:val="0"/>
-          <w:sz w:val="23"/>
-        </w:rPr>
-        <w:t xml:space="preserve"> = </w:t>
+        <w:t xml:space="preserve"> + </w:t>
       </w:r>
       <w:r>
         <w:rPr>
@@ -2959,7 +2942,7 @@
           <w:i w:val="0"/>
           <w:sz w:val="23"/>
         </w:rPr>
-        <w:t xml:space="preserve"> · </w:t>
+        <w:t>(</w:t>
       </w:r>
       <w:r>
         <w:rPr>
@@ -2969,6 +2952,129 @@
           <w:sz w:val="23"/>
         </w:rPr>
         <w:t>A</w:t>
+      </w:r>
+      <w:r>
+        <w:rPr>
+          <w:rFonts w:ascii="Times New Roman" w:hAnsi="Times New Roman" w:eastAsia="SimSun"/>
+          <w:b w:val="0"/>
+          <w:i/>
+          <w:sz w:val="23"/>
+        </w:rPr>
+        <w:t>h</w:t>
+      </w:r>
+      <w:r>
+        <w:rPr>
+          <w:rFonts w:ascii="Times New Roman" w:hAnsi="Times New Roman" w:eastAsia="SimSun"/>
+          <w:b w:val="0"/>
+          <w:i w:val="0"/>
+          <w:sz w:val="23"/>
+        </w:rPr>
+        <w:t>)</w:t>
+      </w:r>
+    </w:p>
+    <w:p>
+      <w:pPr>
+        <w:keepNext w:val="0"/>
+        <w:keepLines w:val="0"/>
+        <w:spacing w:line="276" w:lineRule="auto" w:after="80"/>
+        <w:ind w:firstLine="420"/>
+      </w:pPr>
+      <w:r>
+        <w:rPr>
+          <w:rFonts w:ascii="Times New Roman" w:hAnsi="Times New Roman" w:eastAsia="SimSun"/>
+          <w:b w:val="0"/>
+          <w:sz w:val="21"/>
+        </w:rPr>
+        <w:t>式中，基础权重保持冻结，只有低秩矩阵 A 和 B 参与训练；r 表示瓶颈秩，α 表示适配强度。当隐藏维度为 d 且 r 远小于 d 时，新增可训练参数从全量更新的平方级降为近似线性级。因此，LoRA 更适合在保留 ACE-Step 通用音乐生成能力的前提下学习 EDM 数据域的局部偏移。</w:t>
+      </w:r>
+    </w:p>
+    <w:p>
+      <w:pPr>
+        <w:keepNext w:val="0"/>
+        <w:keepLines w:val="0"/>
+        <w:spacing w:line="276" w:lineRule="auto" w:after="80"/>
+        <w:ind w:firstLine="420"/>
+      </w:pPr>
+      <w:r>
+        <w:rPr>
+          <w:rFonts w:ascii="Times New Roman" w:hAnsi="Times New Roman" w:eastAsia="SimSun"/>
+          <w:b w:val="0"/>
+          <w:sz w:val="21"/>
+        </w:rPr>
+        <w:t>在扩散式音乐生成中，LoRA 的作用位置可以理解为去噪网络内部的条件响应校正。基础模型已经具备从文本、歌词、时长和随机噪声生成音乐潜变量的能力；LoRA 分支只在若干线性投影处加入小幅残差，使网络在相同步数和相同随机种子下更倾向于目标数据域的鼓组密度、低频能量、合成器织体和段落推进方式。这也是本文必须使用同 seed baseline 的原因：只有固定采样初态和推理参数，才能把可听差异归因到低秩适配，而不是归因到随机采样。</w:t>
+      </w:r>
+    </w:p>
+    <w:p>
+      <w:pPr>
+        <w:keepNext/>
+        <w:spacing w:before="100" w:after="60"/>
+        <w:jc w:val="center"/>
+      </w:pPr>
+      <w:r>
+        <w:drawing>
+          <wp:inline xmlns:a="http://schemas.openxmlformats.org/drawingml/2006/main" xmlns:pic="http://schemas.openxmlformats.org/drawingml/2006/picture">
+            <wp:extent cx="5257800" cy="2708954"/>
+            <wp:docPr id="3" name="Picture 3"/>
+            <wp:cNvGraphicFramePr>
+              <a:graphicFrameLocks noChangeAspect="1"/>
+            </wp:cNvGraphicFramePr>
+            <a:graphic>
+              <a:graphicData uri="http://schemas.openxmlformats.org/drawingml/2006/picture">
+                <pic:pic>
+                  <pic:nvPicPr>
+                    <pic:cNvPr id="0" name="fig3_cn_lora_principle.png"/>
+                    <pic:cNvPicPr/>
+                  </pic:nvPicPr>
+                  <pic:blipFill>
+                    <a:blip r:embed="rId14"/>
+                    <a:stretch>
+                      <a:fillRect/>
+                    </a:stretch>
+                  </pic:blipFill>
+                  <pic:spPr>
+                    <a:xfrm>
+                      <a:off x="0" y="0"/>
+                      <a:ext cx="5257800" cy="2708954"/>
+                    </a:xfrm>
+                    <a:prstGeom prst="rect"/>
+                  </pic:spPr>
+                </pic:pic>
+              </a:graphicData>
+            </a:graphic>
+          </wp:inline>
+        </w:drawing>
+      </w:r>
+    </w:p>
+    <w:p>
+      <w:pPr>
+        <w:keepNext w:val="0"/>
+        <w:keepLines/>
+        <w:spacing w:line="276" w:lineRule="auto" w:after="80"/>
+        <w:jc w:val="center"/>
+      </w:pPr>
+      <w:r>
+        <w:rPr>
+          <w:rFonts w:ascii="Times New Roman" w:hAnsi="Times New Roman" w:eastAsia="SimSun"/>
+          <w:b/>
+          <w:sz w:val="19"/>
+        </w:rPr>
+        <w:t>图3 LoRA 低秩残差注入原理。基础权重保持冻结，低秩矩阵 A 和 B 构成可训练残差分支，并通过缩放系数控制适配强度。</w:t>
+      </w:r>
+    </w:p>
+    <w:p>
+      <w:pPr>
+        <w:keepNext w:val="0"/>
+        <w:keepLines w:val="0"/>
+        <w:spacing w:line="276" w:lineRule="auto" w:after="80"/>
+        <w:ind w:firstLine="420"/>
+      </w:pPr>
+      <w:r>
+        <w:rPr>
+          <w:rFonts w:ascii="Times New Roman" w:hAnsi="Times New Roman" w:eastAsia="SimSun"/>
+          <w:b w:val="0"/>
+          <w:sz w:val="21"/>
+        </w:rPr>
+        <w:t>音乐生成路径以 ACE-Step 为基础模型，训练数据包含 6016 条 8 秒 EDM 片段，划分为训练/验证/测试=4833/557/626。系统从已有 LoRA 适配器的第 960 步继续训练 240 步，到第 1200 步；可训练范围覆盖最后 2 个 Transformer block，参数量约 1.12M。这种设置保留 MusicDCAE、文本编码器和大部分扩散主干的通用能力，只让末端去噪决策层学习目标 EDM 数据域的节奏、低频、合成器音色和混音偏移。</w:t>
       </w:r>
     </w:p>
     <w:p>
@@ -2997,7 +3103,7 @@
         <w:drawing>
           <wp:inline xmlns:a="http://schemas.openxmlformats.org/drawingml/2006/main" xmlns:pic="http://schemas.openxmlformats.org/drawingml/2006/picture">
             <wp:extent cx="5257800" cy="3178202"/>
-            <wp:docPr id="3" name="Picture 3"/>
+            <wp:docPr id="4" name="Picture 4"/>
             <wp:cNvGraphicFramePr>
               <a:graphicFrameLocks noChangeAspect="1"/>
             </wp:cNvGraphicFramePr>
@@ -3009,7 +3115,7 @@
                     <pic:cNvPicPr/>
                   </pic:nvPicPr>
                   <pic:blipFill>
-                    <a:blip r:embed="rId14"/>
+                    <a:blip r:embed="rId15"/>
                     <a:stretch>
                       <a:fillRect/>
                     </a:stretch>
@@ -3041,7 +3147,7 @@
           <w:b/>
           <w:sz w:val="19"/>
         </w:rPr>
-        <w:t>图3 LoRA 音乐生成路径。LoRA 只更新少量末端参数，输出通过同 seed baseline 进行控制变量对照。</w:t>
+        <w:t>图4 LoRA 音乐生成路径。LoRA 只更新少量末端参数，输出通过同 seed baseline 进行控制变量对照。</w:t>
       </w:r>
     </w:p>
     <w:p>
@@ -3775,6 +3881,95 @@
           <w:b w:val="0"/>
           <w:sz w:val="21"/>
         </w:rPr>
+        <w:t>歌声音色转换的基本原理是把源人声中的歌唱内容、基频轨迹和情绪力度，与目标参考样本中的音色身份分开建模。源人声决定歌词时序、咬字节奏、旋律走向和能量包络；目标参考样本只提供声学音色身份。如果把整首歌直接输入转换器，鼓、贝斯和合成器残留会被错误解释为人声内容，导致沙哑、金属感或伴奏被染色。因此，本文先用声源分离获得人声分轨，再对人声做条件转换，最后把转换后人声重新混回伴奏。</w:t>
+      </w:r>
+    </w:p>
+    <w:p>
+      <w:pPr>
+        <w:keepNext/>
+        <w:spacing w:before="100" w:after="60"/>
+        <w:jc w:val="center"/>
+      </w:pPr>
+      <w:r>
+        <w:drawing>
+          <wp:inline xmlns:a="http://schemas.openxmlformats.org/drawingml/2006/main" xmlns:pic="http://schemas.openxmlformats.org/drawingml/2006/picture">
+            <wp:extent cx="5257800" cy="2588133"/>
+            <wp:docPr id="5" name="Picture 5"/>
+            <wp:cNvGraphicFramePr>
+              <a:graphicFrameLocks noChangeAspect="1"/>
+            </wp:cNvGraphicFramePr>
+            <a:graphic>
+              <a:graphicData uri="http://schemas.openxmlformats.org/drawingml/2006/picture">
+                <pic:pic>
+                  <pic:nvPicPr>
+                    <pic:cNvPr id="0" name="fig4_cn_svc_disentanglement.png"/>
+                    <pic:cNvPicPr/>
+                  </pic:nvPicPr>
+                  <pic:blipFill>
+                    <a:blip r:embed="rId16"/>
+                    <a:stretch>
+                      <a:fillRect/>
+                    </a:stretch>
+                  </pic:blipFill>
+                  <pic:spPr>
+                    <a:xfrm>
+                      <a:off x="0" y="0"/>
+                      <a:ext cx="5257800" cy="2588133"/>
+                    </a:xfrm>
+                    <a:prstGeom prst="rect"/>
+                  </pic:spPr>
+                </pic:pic>
+              </a:graphicData>
+            </a:graphic>
+          </wp:inline>
+        </w:drawing>
+      </w:r>
+    </w:p>
+    <w:p>
+      <w:pPr>
+        <w:keepNext w:val="0"/>
+        <w:keepLines/>
+        <w:spacing w:line="276" w:lineRule="auto" w:after="80"/>
+        <w:jc w:val="center"/>
+      </w:pPr>
+      <w:r>
+        <w:rPr>
+          <w:rFonts w:ascii="Times New Roman" w:hAnsi="Times New Roman" w:eastAsia="SimSun"/>
+          <w:b/>
+          <w:sz w:val="19"/>
+        </w:rPr>
+        <w:t>图5 歌声音色转换的解耦建模原理。源人声提供内容、基频和能量包络，目标参考样本提供音色嵌入，声码器重建目标音色人声后再与伴奏重混。</w:t>
+      </w:r>
+    </w:p>
+    <w:p>
+      <w:pPr>
+        <w:keepNext w:val="0"/>
+        <w:keepLines w:val="0"/>
+        <w:spacing w:line="276" w:lineRule="auto" w:after="80"/>
+        <w:ind w:firstLine="420"/>
+      </w:pPr>
+      <w:r>
+        <w:rPr>
+          <w:rFonts w:ascii="Times New Roman" w:hAnsi="Times New Roman" w:eastAsia="SimSun"/>
+          <w:b w:val="0"/>
+          <w:sz w:val="21"/>
+        </w:rPr>
+        <w:t>其中，内容表征 C(x) 主要对应歌词音素、咬字边界和时序结构；F0 轨迹决定旋律高度与转调后的音高走向；能量包络反映演唱力度、句尾收束和情绪起伏；目标音色嵌入 e(r) 则描述参考样本的声道形态、共振峰分布和声学身份。转换器需要在这些因素之间做条件生成：既不能丢掉源人声的旋律和情绪，也不能把伴奏中的鼓、贝斯和合成器误当成人声内容。因此，分轨、去沙哑、包络保持、轻混响和最终重混不是附属步骤，而是保证转换结果可听、可解释和可复现的必要环节。</w:t>
+      </w:r>
+    </w:p>
+    <w:p>
+      <w:pPr>
+        <w:keepNext w:val="0"/>
+        <w:keepLines w:val="0"/>
+        <w:spacing w:line="276" w:lineRule="auto" w:after="80"/>
+        <w:ind w:firstLine="420"/>
+      </w:pPr>
+      <w:r>
+        <w:rPr>
+          <w:rFonts w:ascii="Times New Roman" w:hAnsi="Times New Roman" w:eastAsia="SimSun"/>
+          <w:b w:val="0"/>
+          <w:sz w:val="21"/>
+        </w:rPr>
         <w:t>歌声音色转换链路包含输入登记、音频标准化、声源分离、转换输入清理、Seed-VC 推理、人声后处理和伴奏重混。系统优先使用 Demucs 将上传歌曲分解为人声、鼓、贝斯和其他声部；若人声分轨存在，则只将人声送入 Seed-VC，避免伴奏被错误转换。非人声分轨被合成为伴奏，并在最后与转换后人声重新混合，得到完整新歌。</w:t>
       </w:r>
     </w:p>
@@ -3788,7 +3983,7 @@
         <w:drawing>
           <wp:inline xmlns:a="http://schemas.openxmlformats.org/drawingml/2006/main" xmlns:pic="http://schemas.openxmlformats.org/drawingml/2006/picture">
             <wp:extent cx="5257800" cy="2596970"/>
-            <wp:docPr id="4" name="Picture 4"/>
+            <wp:docPr id="6" name="Picture 6"/>
             <wp:cNvGraphicFramePr>
               <a:graphicFrameLocks noChangeAspect="1"/>
             </wp:cNvGraphicFramePr>
@@ -3800,7 +3995,7 @@
                     <pic:cNvPicPr/>
                   </pic:nvPicPr>
                   <pic:blipFill>
-                    <a:blip r:embed="rId15"/>
+                    <a:blip r:embed="rId17"/>
                     <a:stretch>
                       <a:fillRect/>
                     </a:stretch>
@@ -3832,7 +4027,7 @@
           <w:b/>
           <w:sz w:val="19"/>
         </w:rPr>
-        <w:t>图4 授权音色转换与新歌重混流水线。系统先分离人声与伴奏，再完成音色替换、人声修复和重混输出。</w:t>
+        <w:t>图6 授权音色转换与新歌重混流水线。系统先分离人声与伴奏，再完成音色替换、人声修复和重混输出。</w:t>
       </w:r>
     </w:p>
     <w:p>
@@ -4830,7 +5025,7 @@
         <w:drawing>
           <wp:inline xmlns:a="http://schemas.openxmlformats.org/drawingml/2006/main" xmlns:pic="http://schemas.openxmlformats.org/drawingml/2006/picture">
             <wp:extent cx="5257800" cy="2904387"/>
-            <wp:docPr id="5" name="Picture 5"/>
+            <wp:docPr id="7" name="Picture 7"/>
             <wp:cNvGraphicFramePr>
               <a:graphicFrameLocks noChangeAspect="1"/>
             </wp:cNvGraphicFramePr>
@@ -4842,7 +5037,7 @@
                     <pic:cNvPicPr/>
                   </pic:nvPicPr>
                   <pic:blipFill>
-                    <a:blip r:embed="rId16"/>
+                    <a:blip r:embed="rId18"/>
                     <a:stretch>
                       <a:fillRect/>
                     </a:stretch>
@@ -4874,7 +5069,7 @@
           <w:b/>
           <w:sz w:val="19"/>
         </w:rPr>
-        <w:t>图5 实验记录单元中的可复现实验证据。输入、分轨、转换、重混、参数和诊断图被组织为同一复核链路。</w:t>
+        <w:t>图7 实验记录单元中的可复现实验证据。输入、分轨、转换、重混、参数和诊断图被组织为同一复核链路。</w:t>
       </w:r>
     </w:p>
     <w:p>
@@ -6341,7 +6536,7 @@
         <w:drawing>
           <wp:inline xmlns:a="http://schemas.openxmlformats.org/drawingml/2006/main" xmlns:pic="http://schemas.openxmlformats.org/drawingml/2006/picture">
             <wp:extent cx="5257800" cy="3067277"/>
-            <wp:docPr id="6" name="Picture 6"/>
+            <wp:docPr id="8" name="Picture 8"/>
             <wp:cNvGraphicFramePr>
               <a:graphicFrameLocks noChangeAspect="1"/>
             </wp:cNvGraphicFramePr>
@@ -6353,7 +6548,7 @@
                     <pic:cNvPicPr/>
                   </pic:nvPicPr>
                   <pic:blipFill>
-                    <a:blip r:embed="rId17"/>
+                    <a:blip r:embed="rId19"/>
                     <a:stretch>
                       <a:fillRect/>
                     </a:stretch>
@@ -6385,7 +6580,7 @@
           <w:b/>
           <w:sz w:val="19"/>
         </w:rPr>
-        <w:t>图6 实验变量控制矩阵。系统将 LoRA 风格适配、歌声音色转换和后处理质量修复拆成独立评价对象。</w:t>
+        <w:t>图8 实验变量控制矩阵。系统将 LoRA 风格适配、歌声音色转换和后处理质量修复拆成独立评价对象。</w:t>
       </w:r>
     </w:p>
     <w:p>
@@ -6398,7 +6593,7 @@
         <w:drawing>
           <wp:inline xmlns:a="http://schemas.openxmlformats.org/drawingml/2006/main" xmlns:pic="http://schemas.openxmlformats.org/drawingml/2006/picture">
             <wp:extent cx="5257800" cy="4081954"/>
-            <wp:docPr id="7" name="Picture 7"/>
+            <wp:docPr id="9" name="Picture 9"/>
             <wp:cNvGraphicFramePr>
               <a:graphicFrameLocks noChangeAspect="1"/>
             </wp:cNvGraphicFramePr>
@@ -6410,7 +6605,7 @@
                     <pic:cNvPicPr/>
                   </pic:nvPicPr>
                   <pic:blipFill>
-                    <a:blip r:embed="rId18"/>
+                    <a:blip r:embed="rId20"/>
                     <a:stretch>
                       <a:fillRect/>
                     </a:stretch>
@@ -6442,7 +6637,7 @@
           <w:b/>
           <w:sz w:val="19"/>
         </w:rPr>
-        <w:t>图7 客观指标与主观听评的评价矩阵。不同模块对应不同主证据，避免单一指标误导结论。</w:t>
+        <w:t>图9 客观指标与主观听评的评价矩阵。不同模块对应不同主证据，避免单一指标误导结论。</w:t>
       </w:r>
     </w:p>
     <w:p>
@@ -6486,7 +6681,7 @@
           <w:b w:val="0"/>
           <w:sz w:val="21"/>
         </w:rPr>
-        <w:t>在授权音色转换实验 E-VC-01 中，系统保存了从输入音频到最终重混结果的完整证据链。输出音频时长为 279.7 秒，采样率为 44100 Hz，BPM=136.0，RMS=0.1363，低频比例=0.3401，起音密度=2.71/s。这些指标不直接等价于主观音质，但可以用于判断分轨、重混和高频伪影是否出现明显异常。</w:t>
+        <w:t>在授权音色转换实验 E-VC-01 中，系统保存了从输入音频到最终重混结果的完整证据链。输出音频时长为 30.0 秒，采样率为 44100 Hz，BPM=136.0，RMS=0.0949，低频比例=0.0736，起音密度=2.40/s。这些指标不直接等价于主观音质，但可以用于判断分轨、重混和高频伪影是否出现明显异常。</w:t>
       </w:r>
     </w:p>
     <w:p>
@@ -6498,8 +6693,8 @@
       <w:r>
         <w:drawing>
           <wp:inline xmlns:a="http://schemas.openxmlformats.org/drawingml/2006/main" xmlns:pic="http://schemas.openxmlformats.org/drawingml/2006/picture">
-            <wp:extent cx="5257800" cy="2544880"/>
-            <wp:docPr id="8" name="Picture 8"/>
+            <wp:extent cx="5257800" cy="2567620"/>
+            <wp:docPr id="10" name="Picture 10"/>
             <wp:cNvGraphicFramePr>
               <a:graphicFrameLocks noChangeAspect="1"/>
             </wp:cNvGraphicFramePr>
@@ -6511,7 +6706,7 @@
                     <pic:cNvPicPr/>
                   </pic:nvPicPr>
                   <pic:blipFill>
-                    <a:blip r:embed="rId19"/>
+                    <a:blip r:embed="rId21"/>
                     <a:stretch>
                       <a:fillRect/>
                     </a:stretch>
@@ -6519,7 +6714,7 @@
                   <pic:spPr>
                     <a:xfrm>
                       <a:off x="0" y="0"/>
-                      <a:ext cx="5257800" cy="2544880"/>
+                      <a:ext cx="5257800" cy="2567620"/>
                     </a:xfrm>
                     <a:prstGeom prst="rect"/>
                   </pic:spPr>
@@ -6543,7 +6738,7 @@
           <w:b/>
           <w:sz w:val="19"/>
         </w:rPr>
-        <w:t>图8 分离音轨与重混证据。左侧比较各分轨和最终输出能量，右侧列出实验级产物，说明结果来自可复核链路。</w:t>
+        <w:t>图10 分离音轨与重混证据。左侧比较各分轨和最终输出能量，右侧列出实验级产物，说明结果来自可复核链路。</w:t>
       </w:r>
     </w:p>
     <w:p>
@@ -6556,7 +6751,7 @@
         <w:drawing>
           <wp:inline xmlns:a="http://schemas.openxmlformats.org/drawingml/2006/main" xmlns:pic="http://schemas.openxmlformats.org/drawingml/2006/picture">
             <wp:extent cx="5257800" cy="4045241"/>
-            <wp:docPr id="9" name="Picture 9"/>
+            <wp:docPr id="11" name="Picture 11"/>
             <wp:cNvGraphicFramePr>
               <a:graphicFrameLocks noChangeAspect="1"/>
             </wp:cNvGraphicFramePr>
@@ -6568,7 +6763,7 @@
                     <pic:cNvPicPr/>
                   </pic:nvPicPr>
                   <pic:blipFill>
-                    <a:blip r:embed="rId20"/>
+                    <a:blip r:embed="rId22"/>
                     <a:stretch>
                       <a:fillRect/>
                     </a:stretch>
@@ -6600,7 +6795,7 @@
           <w:b/>
           <w:sz w:val="19"/>
         </w:rPr>
-        <w:t>图9 音色转换输出的波形、频谱与客观指标。该图用于检查响度、频带分布和短时异常。</w:t>
+        <w:t>图11 音色转换输出的波形、频谱与客观指标。该图用于检查响度、频带分布和短时异常。</w:t>
       </w:r>
     </w:p>
     <w:p>
@@ -6962,7 +7157,7 @@
                 <w:b w:val="0"/>
                 <w:sz w:val="17"/>
               </w:rPr>
-              <w:t>279.7s / 44100Hz</w:t>
+              <w:t>30.0s / 44100Hz</w:t>
             </w:r>
           </w:p>
         </w:tc>
@@ -7147,7 +7342,7 @@
                 <w:b w:val="0"/>
                 <w:sz w:val="17"/>
               </w:rPr>
-              <w:t>BPM=136.0, RMS=0.1363</w:t>
+              <w:t>BPM=136.0, RMS=0.0949</w:t>
             </w:r>
           </w:p>
         </w:tc>
@@ -7182,7 +7377,7 @@
                 <w:b w:val="0"/>
                 <w:sz w:val="17"/>
               </w:rPr>
-              <w:t>低频比例=0.3401, onset=2.71/s</w:t>
+              <w:t>低频比例=0.0736, onset=2.40/s</w:t>
             </w:r>
           </w:p>
         </w:tc>
@@ -7292,7 +7487,7 @@
                 <w:b w:val="0"/>
                 <w:sz w:val="17"/>
               </w:rPr>
-              <w:t>RTF=19.30</w:t>
+              <w:t>RTF=19.12</w:t>
             </w:r>
           </w:p>
         </w:tc>
@@ -8072,7 +8267,7 @@
         <w:drawing>
           <wp:inline xmlns:a="http://schemas.openxmlformats.org/drawingml/2006/main" xmlns:pic="http://schemas.openxmlformats.org/drawingml/2006/picture">
             <wp:extent cx="5257800" cy="2825811"/>
-            <wp:docPr id="10" name="Picture 10"/>
+            <wp:docPr id="12" name="Picture 12"/>
             <wp:cNvGraphicFramePr>
               <a:graphicFrameLocks noChangeAspect="1"/>
             </wp:cNvGraphicFramePr>
@@ -8084,7 +8279,7 @@
                     <pic:cNvPicPr/>
                   </pic:nvPicPr>
                   <pic:blipFill>
-                    <a:blip r:embed="rId21"/>
+                    <a:blip r:embed="rId23"/>
                     <a:stretch>
                       <a:fillRect/>
                     </a:stretch>
@@ -8116,7 +8311,7 @@
           <w:b/>
           <w:sz w:val="19"/>
         </w:rPr>
-        <w:t>图10 同 seed LoRA 与 baseline 的客观音频诊断。该图作为音乐生成路径的基线证据，与音色转换路径分开解释。</w:t>
+        <w:t>图12 同 seed LoRA 与 baseline 的客观音频诊断。该图作为音乐生成路径的基线证据，与音色转换路径分开解释。</w:t>
       </w:r>
     </w:p>
     <w:p>
@@ -8129,7 +8324,7 @@
         <w:drawing>
           <wp:inline xmlns:a="http://schemas.openxmlformats.org/drawingml/2006/main" xmlns:pic="http://schemas.openxmlformats.org/drawingml/2006/picture">
             <wp:extent cx="5257800" cy="3505200"/>
-            <wp:docPr id="11" name="Picture 11"/>
+            <wp:docPr id="13" name="Picture 13"/>
             <wp:cNvGraphicFramePr>
               <a:graphicFrameLocks noChangeAspect="1"/>
             </wp:cNvGraphicFramePr>
@@ -8141,7 +8336,7 @@
                     <pic:cNvPicPr/>
                   </pic:nvPicPr>
                   <pic:blipFill>
-                    <a:blip r:embed="rId22"/>
+                    <a:blip r:embed="rId24"/>
                     <a:stretch>
                       <a:fillRect/>
                     </a:stretch>
@@ -8173,7 +8368,7 @@
           <w:b/>
           <w:sz w:val="19"/>
         </w:rPr>
-        <w:t>图11 段落级 LoRA 二次微调与 AI 水印 Mel 证据。右侧完整 Mel 图谱末尾显示由频谱能量构成的“AI生成”负形水印。</w:t>
+        <w:t>图13 段落级 LoRA 二次微调与 AI 水印 Mel 证据。右侧完整 Mel 图谱末尾显示由频谱能量构成的“AI生成”负形水印。</w:t>
       </w:r>
     </w:p>
     <w:p>
@@ -8203,7 +8398,7 @@
           <w:b w:val="0"/>
           <w:sz w:val="21"/>
         </w:rPr>
-        <w:t>针对长音频任务，系统记录了输入时长约 279.7 秒、扩散步数 50、CFG=0.75、去沙哑强度 0.75、情感保持 1.00 和预计耗时约 381.8 分钟。整曲转换更适合作为离线实验执行，交互式系统适合先用短片段筛选转调量、CFG、扩散步数和后处理参数。</w:t>
+        <w:t>针对长音频任务，系统记录了输入时长约 279.7 秒、扩散步数 30、CFG=0.75、去沙哑强度 0.95、情感保持 1.00 和预计耗时约 230.3 分钟。整曲转换更适合作为离线实验执行，交互式系统适合先用短片段筛选转调量、CFG、扩散步数和后处理参数。</w:t>
       </w:r>
     </w:p>
     <w:p>
@@ -8232,7 +8427,7 @@
         <w:drawing>
           <wp:inline xmlns:a="http://schemas.openxmlformats.org/drawingml/2006/main" xmlns:pic="http://schemas.openxmlformats.org/drawingml/2006/picture">
             <wp:extent cx="5257800" cy="2973606"/>
-            <wp:docPr id="12" name="Picture 12"/>
+            <wp:docPr id="14" name="Picture 14"/>
             <wp:cNvGraphicFramePr>
               <a:graphicFrameLocks noChangeAspect="1"/>
             </wp:cNvGraphicFramePr>
@@ -8244,7 +8439,7 @@
                     <pic:cNvPicPr/>
                   </pic:nvPicPr>
                   <pic:blipFill>
-                    <a:blip r:embed="rId23"/>
+                    <a:blip r:embed="rId25"/>
                     <a:stretch>
                       <a:fillRect/>
                     </a:stretch>
@@ -8276,7 +8471,7 @@
           <w:b/>
           <w:sz w:val="19"/>
         </w:rPr>
-        <w:t>图12 去沙哑、情感力度保持与轻混响后处理链路。该链路用于抑制高频毛刺、保留演唱力度并改善人声融入伴奏的自然度。</w:t>
+        <w:t>图14 去沙哑、情感力度保持与轻混响后处理链路。该链路用于抑制高频毛刺、保留演唱力度并改善人声融入伴奏的自然度。</w:t>
       </w:r>
     </w:p>
     <w:p>
@@ -8289,7 +8484,7 @@
         <w:drawing>
           <wp:inline xmlns:a="http://schemas.openxmlformats.org/drawingml/2006/main" xmlns:pic="http://schemas.openxmlformats.org/drawingml/2006/picture">
             <wp:extent cx="5257800" cy="3138985"/>
-            <wp:docPr id="13" name="Picture 13"/>
+            <wp:docPr id="15" name="Picture 15"/>
             <wp:cNvGraphicFramePr>
               <a:graphicFrameLocks noChangeAspect="1"/>
             </wp:cNvGraphicFramePr>
@@ -8301,7 +8496,7 @@
                     <pic:cNvPicPr/>
                   </pic:nvPicPr>
                   <pic:blipFill>
-                    <a:blip r:embed="rId24"/>
+                    <a:blip r:embed="rId26"/>
                     <a:stretch>
                       <a:fillRect/>
                     </a:stretch>
@@ -8333,7 +8528,7 @@
           <w:b/>
           <w:sz w:val="19"/>
         </w:rPr>
-        <w:t>图13 Seed-VC 长音频推理资源预算。图中区分短片段实测、整曲估计和离线任务策略。</w:t>
+        <w:t>图15 Seed-VC 长音频推理资源预算。图中区分短片段实测、整曲估计和离线任务策略。</w:t>
       </w:r>
     </w:p>
     <w:p>
@@ -8346,7 +8541,7 @@
         <w:drawing>
           <wp:inline xmlns:a="http://schemas.openxmlformats.org/drawingml/2006/main" xmlns:pic="http://schemas.openxmlformats.org/drawingml/2006/picture">
             <wp:extent cx="5257800" cy="3040055"/>
-            <wp:docPr id="14" name="Picture 14"/>
+            <wp:docPr id="16" name="Picture 16"/>
             <wp:cNvGraphicFramePr>
               <a:graphicFrameLocks noChangeAspect="1"/>
             </wp:cNvGraphicFramePr>
@@ -8358,7 +8553,7 @@
                     <pic:cNvPicPr/>
                   </pic:nvPicPr>
                   <pic:blipFill>
-                    <a:blip r:embed="rId25"/>
+                    <a:blip r:embed="rId27"/>
                     <a:stretch>
                       <a:fillRect/>
                     </a:stretch>
@@ -8390,7 +8585,7 @@
           <w:b/>
           <w:sz w:val="19"/>
         </w:rPr>
-        <w:t>图14 音色转换异常来源分析。沙哑、跑调、耗时和音色不稳定分别映射到分轨、F0、声码器、参考样本和资源预算等可检查环节。</w:t>
+        <w:t>图16 音色转换异常来源分析。沙哑、跑调、耗时和音色不稳定分别映射到分轨、F0、声码器、参考样本和资源预算等可检查环节。</w:t>
       </w:r>
     </w:p>
     <w:p>
@@ -9164,7 +9359,7 @@
           <w:b w:val="0"/>
           <w:sz w:val="21"/>
         </w:rPr>
-        <w:t>[6] Défossez A, Synnaeve G, Adi Y. Hybrid Spectrogram and Waveform Source Separation[C]//ISMIR Workshop, 2021.</w:t>
+        <w:t>[6] Qian K, Zhang Y, Chang S, Yang X, Hasegawa-Johnson M. AutoVC: Zero-Shot Voice Style Transfer with Only Autoencoder Loss[C]//International Conference on Machine Learning. 2019.</w:t>
       </w:r>
     </w:p>
     <w:p>
@@ -9179,7 +9374,7 @@
           <w:b w:val="0"/>
           <w:sz w:val="21"/>
         </w:rPr>
-        <w:t>[7] Plachtaa. Seed-VC: zero-shot singing voice conversion toolkit[EB/OL]. GitHub repository.</w:t>
+        <w:t>[7] Défossez A, Synnaeve G, Adi Y. Hybrid Spectrogram and Waveform Source Separation[C]//ISMIR Workshop, 2021.</w:t>
       </w:r>
     </w:p>
     <w:p>
@@ -9194,7 +9389,7 @@
           <w:b w:val="0"/>
           <w:sz w:val="21"/>
         </w:rPr>
-        <w:t>[8] Lee S, Ping W, Ginsburg B, Catanzaro B, Yoon S. BigVGAN: A Universal Neural Vocoder with Large-Scale Training[C]//International Conference on Learning Representations. 2023.</w:t>
+        <w:t>[8] Plachtaa. Seed-VC: zero-shot singing voice conversion toolkit[EB/OL]. GitHub repository.</w:t>
       </w:r>
     </w:p>
     <w:p>
@@ -9209,7 +9404,7 @@
           <w:b w:val="0"/>
           <w:sz w:val="21"/>
         </w:rPr>
-        <w:t>[9] McFee B, Raffel C, Liang D, et al. librosa: Audio and Music Signal Analysis in Python[C]//Proceedings of the 14th Python in Science Conference. 2015.</w:t>
+        <w:t>[9] Lee S, Ping W, Ginsburg B, Catanzaro B, Yoon S. BigVGAN: A Universal Neural Vocoder with Large-Scale Training[C]//International Conference on Learning Representations. 2023.</w:t>
       </w:r>
     </w:p>
     <w:p>
@@ -9224,7 +9419,22 @@
           <w:b w:val="0"/>
           <w:sz w:val="21"/>
         </w:rPr>
-        <w:t>[10] Kilgour K, Zuluaga M, Roblek D, Sharifi M. Fréchet Audio Distance: A Reference-Free Metric for Evaluating Music Enhancement Algorithms[C]//Interspeech. 2019.</w:t>
+        <w:t>[10] McFee B, Raffel C, Liang D, et al. librosa: Audio and Music Signal Analysis in Python[C]//Proceedings of the 14th Python in Science Conference. 2015.</w:t>
+      </w:r>
+    </w:p>
+    <w:p>
+      <w:pPr>
+        <w:keepNext w:val="0"/>
+        <w:keepLines w:val="0"/>
+        <w:spacing w:line="276" w:lineRule="auto" w:after="80"/>
+      </w:pPr>
+      <w:r>
+        <w:rPr>
+          <w:rFonts w:ascii="Times New Roman" w:hAnsi="Times New Roman" w:eastAsia="SimSun"/>
+          <w:b w:val="0"/>
+          <w:sz w:val="21"/>
+        </w:rPr>
+        <w:t>[11] Kilgour K, Zuluaga M, Roblek D, Sharifi M. Fréchet Audio Distance: A Reference-Free Metric for Evaluating Music Enhancement Algorithms[C]//Interspeech. 2019.</w:t>
       </w:r>
     </w:p>
     <w:sectPr>

</xml_diff>

<commit_message>
Revise intelligent speech processing paper
</commit_message>
<xml_diff>
--- a/report/intelligent_speech_processing_paper/ace_step_isp_lora_voice_conversion_paper.docx
+++ b/report/intelligent_speech_processing_paper/ace_step_isp_lora_voice_conversion_paper.docx
@@ -15,7 +15,7 @@
           <w:b/>
           <w:sz w:val="32"/>
         </w:rPr>
-        <w:t>面向智能语音处理的音乐生成与授权歌声音色转换系统</w:t>
+        <w:t>面向智能语音处理的生成式音乐建模与授权歌声音色迁移研究</w:t>
       </w:r>
     </w:p>
     <w:p>
@@ -31,7 +31,7 @@
           <w:b w:val="0"/>
           <w:sz w:val="22"/>
         </w:rPr>
-        <w:t>A Music Generation and Authorized Singing-Voice Timbre Conversion System for Intelligent Speech Processing</w:t>
+        <w:t>Generative Music Modeling and Authorized Singing-Voice Timbre Transfer for Intelligent Speech Processing</w:t>
       </w:r>
     </w:p>
     <w:p>
@@ -77,7 +77,7 @@
           <w:b w:val="0"/>
           <w:sz w:val="21"/>
         </w:rPr>
-        <w:t>面向音乐生成、歌声音色替换和网页化实验复现的综合需求，本文提出并实现一种双路径智能音频处理系统。系统将文本到音乐生成与授权歌声音色转换拆分为两个独立研究变量：音乐生成路径以 ACE-Step 为基础模型，通过 LoRA 对目标 EDM 数据域进行参数高效适配；音色转换路径以 Demucs 完成人声与伴奏分离，以 Seed-VC 完成零样本歌声音色转换，并在转换后执行去沙哑、能量包络保持、轻混响和伴奏重混。为避免仅凭单个听感样例给出结论，本文建立实验级证据链：每次实验保存输入音频、分轨结果、转换人声、伴奏重混、参数记录、波形频谱诊断图和完整 Mel 水印图。音乐生成实验使用 6016 条 8 秒 EDM 片段，训练/验证/测试划分为 4833/557/626；段落级增强实验进一步构建 360 条 15 秒片段，覆盖 drop=130, breakdown=86, build-up=65, intro=36, loop=25, outro=18 等结构标签。授权音色转换实验以匿名样例 E-VC-01 验证端到端链路，输出时长 30.0 秒，BPM=136.0，RMS=0.0949，低频比例=0.0736，Seed-VC 运行代价 RTF=19.12。实验结果表明，该系统能够把风格适配、歌声音色迁移、分轨重混和 AI 生成标识组织为可复核的智能语音处理流程。项目源代码仓库地址：https://github.com/anmoryli/edm-adapter。</w:t>
+        <w:t>随着深度生成模型从语音识别、语音增强和语音合成扩展到音乐生成、歌声音色迁移和多轨音频编辑，智能语音处理的研究对象正在由单一语音信号转向包含旋律、节奏、音色、结构和混音关系的复杂音频对象。针对文本到音乐生成难以在低资源条件下稳定适配目标风格、歌声音色转换容易混入伴奏泄漏和后处理伪影、实验结果缺乏可复核证据链等问题，本文提出一种面向智能语音处理的双路径生成式音频建模方法。在音乐生成路径中，系统以 ACE-Step 为基础模型，采用 LoRA 对目标 EDM 数据域进行参数高效适配，并通过同 seed baseline 控制随机采样因素；在授权歌声音色迁移路径中，系统以 Demucs 完成人声与伴奏分离，以 Seed-VC 完成零样本歌声音色迁移，并在转换后执行去沙哑、能量包络保持、轻混响和伴奏重混。为提升论文实验的可验证性，本文将输入音频、分离音轨、转换人声、重混结果、参数记录、日志、波形频谱诊断图和完整 Mel 水印图组织为统一实验记录单元。实验数据包含 6016 条 8 秒 EDM 片段，训练/验证/测试划分为 4833/557/626；另构建 360 条 15 秒段落级增强片段，覆盖 drop=130, breakdown=86, build-up=65, intro=36, loop=25, outro=18 等结构标签。授权音色迁移实验以匿名样例 E-VC-01 验证端到端链路，输出时长 183.4 秒，采样率 44100 Hz，BPM=110.0，RMS=0.1392，低频比例=0.4498，Seed-VC 运行代价 RTF=20.71。结果表明，该方法能够把目标风格适配、歌声音色迁移、分轨重混和 AI 生成标识纳入可追踪、可复核的智能音频处理流程。</w:t>
       </w:r>
     </w:p>
     <w:p>
@@ -92,7 +92,7 @@
           <w:b/>
           <w:sz w:val="21"/>
         </w:rPr>
-        <w:t>关键词：智能语音处理；音乐生成；歌声音色转换；ACE-Step；LoRA；Demucs；Seed-VC；分轨重混；可复现实验</w:t>
+        <w:t>关键词：智能语音处理；生成式音乐建模；授权歌声音色迁移；ACE-Step；LoRA；Demucs；Seed-VC；分轨重混；可复现实验</w:t>
       </w:r>
     </w:p>
     <w:p>
@@ -121,7 +121,7 @@
           <w:b w:val="0"/>
           <w:sz w:val="21"/>
         </w:rPr>
-        <w:t>This paper presents a dual-path intelligent audio-processing system for controllable music generation and authorized singing-voice timbre conversion. The generation path adapts ACE-Step to an EDM domain through LoRA fine-tuning, while the conversion path combines Demucs source separation, Seed-VC timbre conversion, artifact suppression, dynamics preservation, light vocal reverb, and accompaniment remixing. The system records experiment-level evidence including separated stems, converted vocals, remix outputs, parameter records, waveform diagnostics, and full Mel-spectrogram watermark figures. Experiments show that the proposed prototype can separate style adaptation from vocal timbre transfer and provide reproducible evidence for intelligent speech-processing analysis. Source code repository: https://github.com/anmoryli/edm-adapter.</w:t>
+        <w:t>This paper studies generative music modeling and authorized singing-voice timbre transfer for intelligent speech processing. The proposed dual-path framework adapts ACE-Step to an EDM domain with LoRA while separating style adaptation from singing-voice timbre transfer. The conversion path combines Demucs source separation, Seed-VC zero-shot singing-voice conversion, artifact suppression, dynamics preservation, light reverb, and accompaniment remixing. The system further records experiment-level evidence, including stems, converted vocals, remix outputs, parameter logs, waveform diagnostics, and full Mel-spectrogram watermark figures. Experiments on short clips, section-level clips, and an authorized conversion case show that the framework provides a reproducible basis for analyzing controllable music generation and singing-voice timbre migration.</w:t>
       </w:r>
     </w:p>
     <w:p>
@@ -140,18 +140,16 @@
     </w:p>
     <w:p>
       <w:pPr>
-        <w:keepNext w:val="0"/>
-        <w:keepLines w:val="0"/>
-        <w:spacing w:line="276" w:lineRule="auto" w:after="80"/>
-        <w:ind w:firstLine="420"/>
+        <w:keepNext/>
+        <w:spacing w:before="140" w:after="100"/>
       </w:pPr>
       <w:r>
         <w:rPr>
           <w:rFonts w:ascii="Times New Roman" w:hAnsi="Times New Roman" w:eastAsia="SimSun"/>
-          <w:b w:val="0"/>
-          <w:sz w:val="21"/>
+          <w:b/>
+          <w:sz w:val="24"/>
         </w:rPr>
-        <w:t>智能语音处理的研究对象正在从传统语音识别、语音增强和文本到语音合成扩展到音乐生成、歌声转换、多轨分离和跨媒体音频编辑。这类任务不再只关心语音是否可懂，还需要同时处理旋律、节奏、基频轨迹、音色身份、混音空间和生成结果的可追溯性。在实际网页系统中，用户往往希望上传一首歌后保留旋律与歌词时序，只改变歌手音色；同时也希望模型能够学习某类电子音乐制作风格，并与基础模型输出进行同 seed 对照。如果把这些能力混在一个黑箱按钮里，最终差异可能来自采样 seed、LoRA 权重、分轨误差、F0 估计、声码器伪影或后处理参数，结论将无法复核。</w:t>
+        <w:t>1.1 研究背景</w:t>
       </w:r>
     </w:p>
     <w:p>
@@ -167,7 +165,7 @@
           <w:b w:val="0"/>
           <w:sz w:val="21"/>
         </w:rPr>
-        <w:t>本文围绕 EDM-Adapter 原型系统重新组织研究问题。第一，如何在有限训练资源条件下对大规模音乐生成模型进行参数高效风格适配；第二，如何把上传歌曲中的人声内容和基频轨迹与授权目标音色样本结合，生成新的目标声线；第三，如何让每一次实验都留下足够的中间产物和图表证据，使实验结果可以被复核、比较和定位问题。因此，本文的目标不是宣称重新训练一个完整基础模型，而是给出一个边界清晰、流程可运行、证据可追踪的智能音频处理框架。</w:t>
+        <w:t>智能语音处理长期关注语音识别、语音增强、说话人识别和文本到语音合成等任务，其核心目标是让机器能够理解、生成和改善人类语音。近年来，音乐生成、歌声音色迁移、音源分离和跨模态音频编辑逐渐进入同一技术体系：这些任务同样依赖声学表征、时序建模、音色编码、基频估计、声码器重建和主客观质量评价，但处理对象从短时语音扩展为包含和声、节奏、段落结构和混音空间的复杂音频。因此，面向音乐和歌声的智能处理不只是应用场景扩展，而是对传统语音处理中的内容表征、说话人或歌手身份表征、韵律建模和可控生成能力提出了更高要求。</w:t>
       </w:r>
     </w:p>
     <w:p>
@@ -183,7 +181,83 @@
           <w:b w:val="0"/>
           <w:sz w:val="21"/>
         </w:rPr>
-        <w:t>本文主要贡献包括：1）设计音乐生成与授权歌声音色转换的双路径系统架构，避免 LoRA 风格适配与 Seed-VC 音色迁移相互混淆；2）从低秩残差注入和内容-基频-音色解耦两个层面解释核心原理，并给出对应科研图和形式化表达；3）给出歌声音色转换的工程实现链路，包括 Demucs 分轨、Seed-VC 转换、去沙哑、包络保持、轻混响和伴奏重混；4）建立实验级证据链，将输入音频、分轨、转换、重混、参数和诊断图组织为最小复现实验单元；5）在最终生成音频的完整 Mel 图谱末尾加入由频谱能量构成的“AI生成”负形水印，用于标识 AI 生成结果。</w:t>
+        <w:t>文本到音乐生成模型能够根据提示词和歌词生成较长音频，但基础模型输出通常反映训练集中宽泛的音乐先验，难以在有限样本和有限算力条件下稳定学习特定 EDM 数据域中的段落推进、合成器音色、低频律动和混音习惯。另一方面，歌声音色迁移要求保留源歌曲的歌词时序、旋律走向和演唱力度，同时只改变授权目标样本提供的音色身份；如果直接把整首混音送入转换模型，伴奏泄漏、分轨误差和声码器伪影会同时进入结果，使问题难以定位。本文将这两类能力拆分为生成适配路径和授权音色迁移路径，目的在于让风格学习、旋律内容、歌手音色和后处理质量分别形成可解释变量。</w:t>
+      </w:r>
+    </w:p>
+    <w:p>
+      <w:pPr>
+        <w:keepNext/>
+        <w:spacing w:before="140" w:after="100"/>
+      </w:pPr>
+      <w:r>
+        <w:rPr>
+          <w:rFonts w:ascii="Times New Roman" w:hAnsi="Times New Roman" w:eastAsia="SimSun"/>
+          <w:b/>
+          <w:sz w:val="24"/>
+        </w:rPr>
+        <w:t>1.2 研究意义</w:t>
+      </w:r>
+    </w:p>
+    <w:p>
+      <w:pPr>
+        <w:keepNext w:val="0"/>
+        <w:keepLines w:val="0"/>
+        <w:spacing w:line="276" w:lineRule="auto" w:after="80"/>
+        <w:ind w:firstLine="420"/>
+      </w:pPr>
+      <w:r>
+        <w:rPr>
+          <w:rFonts w:ascii="Times New Roman" w:hAnsi="Times New Roman" w:eastAsia="SimSun"/>
+          <w:b w:val="0"/>
+          <w:sz w:val="21"/>
+        </w:rPr>
+        <w:t>从理论意义看，本文把生成式音乐建模与歌声音色迁移纳入智能语音处理框架，强调内容、基频、音色、能量包络和混音背景之间的解耦关系。这种建模视角有助于解释为什么同一段音频中“旋律清楚但音色不像”“瞬时音色接近但段落结构发散”“人声清晰但伴奏模糊”等现象不能简单归因于单一模型能力，而应从训练数据粒度、模型适配位置、分轨质量、F0 稳定性和后处理链路共同分析。因此，本文不仅给出系统实现，也将实验变量拆解为可复核的研究对象。</w:t>
+      </w:r>
+    </w:p>
+    <w:p>
+      <w:pPr>
+        <w:keepNext w:val="0"/>
+        <w:keepLines w:val="0"/>
+        <w:spacing w:line="276" w:lineRule="auto" w:after="80"/>
+        <w:ind w:firstLine="420"/>
+      </w:pPr>
+      <w:r>
+        <w:rPr>
+          <w:rFonts w:ascii="Times New Roman" w:hAnsi="Times New Roman" w:eastAsia="SimSun"/>
+          <w:b w:val="0"/>
+          <w:sz w:val="21"/>
+        </w:rPr>
+        <w:t>从工程意义看，本文面向本地化可运行系统设计了低资源微调、网页任务队列、音轨分离、零样本音色迁移、重混输出和证据归档流程。该流程降低了从研究模型到可交互原型之间的落地成本，也避免仅凭单个听感样例判断模型好坏。从应用和治理意义看，本文坚持授权目标音色样本作为转换条件，并在最终 Mel 图谱中加入 AI 生成水印，使生成音频的来源、参数和可追踪记录能够进入系统设计本身。</w:t>
+      </w:r>
+    </w:p>
+    <w:p>
+      <w:pPr>
+        <w:keepNext/>
+        <w:spacing w:before="140" w:after="100"/>
+      </w:pPr>
+      <w:r>
+        <w:rPr>
+          <w:rFonts w:ascii="Times New Roman" w:hAnsi="Times New Roman" w:eastAsia="SimSun"/>
+          <w:b/>
+          <w:sz w:val="24"/>
+        </w:rPr>
+        <w:t>1.3 研究内容与创新点</w:t>
+      </w:r>
+    </w:p>
+    <w:p>
+      <w:pPr>
+        <w:keepNext w:val="0"/>
+        <w:keepLines w:val="0"/>
+        <w:spacing w:line="276" w:lineRule="auto" w:after="80"/>
+        <w:ind w:firstLine="420"/>
+      </w:pPr>
+      <w:r>
+        <w:rPr>
+          <w:rFonts w:ascii="Times New Roman" w:hAnsi="Times New Roman" w:eastAsia="SimSun"/>
+          <w:b w:val="0"/>
+          <w:sz w:val="21"/>
+        </w:rPr>
+        <w:t>本文围绕 EDM-Adapter 原型系统展开研究，主要内容包括：第一，构建 ACE-Step 与 LoRA 结合的音乐生成路径，用低秩残差注入方式在有限算力下完成目标数据域适配；第二，构建 Demucs 与 Seed-VC 结合的授权歌声音色迁移路径，显式分离源歌曲内容、基频轨迹、目标音色嵌入和伴奏重混；第三，建立同 seed 生成对照、段落级数据增强和任务级证据链，使每次实验都能回溯到输入、参数、模型权重、分轨结果和诊断图；第四，针对 AI 生成内容标识设计 Mel 频谱水印，把生成结果的可标识性纳入音频处理链路。</w:t>
       </w:r>
     </w:p>
     <w:p>
@@ -254,7 +328,707 @@
           <w:b/>
           <w:sz w:val="28"/>
         </w:rPr>
-        <w:t>2 相关工作与问题定义</w:t>
+        <w:t>2 国内外研究现状与问题定义</w:t>
+      </w:r>
+    </w:p>
+    <w:p>
+      <w:pPr>
+        <w:keepNext/>
+        <w:spacing w:before="140" w:after="100"/>
+      </w:pPr>
+      <w:r>
+        <w:rPr>
+          <w:rFonts w:ascii="Times New Roman" w:hAnsi="Times New Roman" w:eastAsia="SimSun"/>
+          <w:b/>
+          <w:sz w:val="24"/>
+        </w:rPr>
+        <w:t>2.1 国外研究现状</w:t>
+      </w:r>
+    </w:p>
+    <w:p>
+      <w:pPr>
+        <w:keepNext w:val="0"/>
+        <w:keepLines w:val="0"/>
+        <w:spacing w:line="276" w:lineRule="auto" w:after="80"/>
+        <w:ind w:firstLine="420"/>
+      </w:pPr>
+      <w:r>
+        <w:rPr>
+          <w:rFonts w:ascii="Times New Roman" w:hAnsi="Times New Roman" w:eastAsia="SimSun"/>
+          <w:b w:val="0"/>
+          <w:sz w:val="21"/>
+        </w:rPr>
+        <w:t>国外生成式音频研究大致经历了从谱图生成、离散音频 token 建模到潜变量扩散和大规模音乐基础模型的发展过程。MusicLM 将文本条件音乐生成表述为分层序列建模问题，强调长时一致性和文本语义对齐；MusicGen 使用压缩离散音乐表示和单阶段语言模型提升可控生成效率；AudioLDM 系列则把潜变量扩散引入通用音频、音乐和声效生成，使文本条件和自监督音频表征成为统一建模基础。ACE-Step 进一步面向音乐生成基础模型组织文本、歌词、声学潜变量和扩散式采样流程，为本地 LoRA 适配提供了可复用底座。</w:t>
+      </w:r>
+    </w:p>
+    <w:p>
+      <w:pPr>
+        <w:keepNext w:val="0"/>
+        <w:keepLines w:val="0"/>
+        <w:spacing w:line="276" w:lineRule="auto" w:after="80"/>
+        <w:ind w:firstLine="420"/>
+      </w:pPr>
+      <w:r>
+        <w:rPr>
+          <w:rFonts w:ascii="Times New Roman" w:hAnsi="Times New Roman" w:eastAsia="SimSun"/>
+          <w:b w:val="0"/>
+          <w:sz w:val="21"/>
+        </w:rPr>
+        <w:t>在参数高效微调方面，LoRA 通过冻结基础权重并训练低秩增量矩阵，降低了大模型风格适配的显存和存储开销。在音源分离方面，Demucs 类模型结合波形域和谱图域建模，为从混音歌曲中提取人声、鼓、贝斯和其他伴奏声部提供了工程基础。在语音与歌声音色转换方面，AutoVC 等零样本转换方法强调内容瓶颈和说话人嵌入解耦，Seed-VC 等开源工具进一步把这种思路扩展到实时语音转换和歌声音色转换。总体来看，国外研究更强调基础模型规模、跨模态条件控制和开放式生成能力，但在小样本目标风格适配、授权音色治理和实验证据链方面仍需要具体系统补足。</w:t>
+      </w:r>
+    </w:p>
+    <w:p>
+      <w:pPr>
+        <w:keepNext/>
+        <w:spacing w:before="140" w:after="100"/>
+      </w:pPr>
+      <w:r>
+        <w:rPr>
+          <w:rFonts w:ascii="Times New Roman" w:hAnsi="Times New Roman" w:eastAsia="SimSun"/>
+          <w:b/>
+          <w:sz w:val="24"/>
+        </w:rPr>
+        <w:t>2.2 国内研究现状</w:t>
+      </w:r>
+    </w:p>
+    <w:p>
+      <w:pPr>
+        <w:keepNext w:val="0"/>
+        <w:keepLines w:val="0"/>
+        <w:spacing w:line="276" w:lineRule="auto" w:after="80"/>
+        <w:ind w:firstLine="420"/>
+      </w:pPr>
+      <w:r>
+        <w:rPr>
+          <w:rFonts w:ascii="Times New Roman" w:hAnsi="Times New Roman" w:eastAsia="SimSun"/>
+          <w:b w:val="0"/>
+          <w:sz w:val="21"/>
+        </w:rPr>
+        <w:t>国内相关研究和应用主要呈现三类特点。第一，围绕开源大模型、LoRA 适配和本地推理形成了较活跃的工程实践，研究者更关注在消费级显卡上完成微调、推理加速和网页化交互。第二，音乐理解、音频表征学习、歌声合成和声码器重建等方向持续积累组件能力，但这些组件在完整音乐生成和歌声音色迁移系统中常被割裂使用。第三，国内应用场景更重视中文用户交互、作品授权、生成内容标识和可复现实验报告，但公开数据集标注、主观听评协议和跨系统指标对齐仍不充分。因此，本文更关注如何把可用模型组件组织成边界清晰、证据完整、能够定位问题来源的系统化研究流程。</w:t>
+      </w:r>
+    </w:p>
+    <w:p>
+      <w:pPr>
+        <w:keepNext/>
+        <w:keepLines/>
+        <w:spacing w:line="276" w:lineRule="auto" w:after="80"/>
+        <w:jc w:val="center"/>
+      </w:pPr>
+      <w:r>
+        <w:rPr>
+          <w:rFonts w:ascii="Times New Roman" w:hAnsi="Times New Roman" w:eastAsia="SimSun"/>
+          <w:b/>
+          <w:sz w:val="19"/>
+        </w:rPr>
+        <w:t>表1 国内外研究现状对比</w:t>
+      </w:r>
+    </w:p>
+    <w:tbl>
+      <w:tblPr>
+        <w:tblW w:type="auto" w:w="0"/>
+        <w:jc w:val="center"/>
+        <w:tblLayout w:type="fixed"/>
+        <w:tblLook w:firstColumn="1" w:firstRow="1" w:lastColumn="0" w:lastRow="0" w:noHBand="0" w:noVBand="1" w:val="04A0"/>
+      </w:tblPr>
+      <w:tblGrid>
+        <w:gridCol w:w="3061"/>
+        <w:gridCol w:w="3061"/>
+        <w:gridCol w:w="3061"/>
+      </w:tblGrid>
+      <w:tr>
+        <w:trPr>
+          <w:cantSplit/>
+          <w:tblHeader w:val="true"/>
+        </w:trPr>
+        <w:tc>
+          <w:tcPr>
+            <w:tcW w:type="dxa" w:w="1900"/>
+            <w:vAlign w:val="center"/>
+            <w:tcMar>
+              <w:top w:w="80" w:type="dxa"/>
+              <w:bottom w:w="80" w:type="dxa"/>
+              <w:start w:w="120" w:type="dxa"/>
+              <w:end w:w="120" w:type="dxa"/>
+            </w:tcMar>
+            <w:tcBorders>
+              <w:top w:val="single" w:sz="12" w:color="000000"/>
+              <w:left w:val="nil"/>
+              <w:bottom w:val="single" w:sz="8" w:color="000000"/>
+              <w:right w:val="nil"/>
+              <w:insideH w:val="nil"/>
+              <w:insideV w:val="nil"/>
+            </w:tcBorders>
+          </w:tcPr>
+          <w:p>
+            <w:pPr>
+              <w:spacing w:line="264" w:lineRule="auto" w:after="0"/>
+              <w:jc w:val="center"/>
+            </w:pPr>
+            <w:r/>
+            <w:r>
+              <w:rPr>
+                <w:rFonts w:ascii="Times New Roman" w:hAnsi="Times New Roman" w:eastAsia="SimSun"/>
+                <w:b/>
+                <w:sz w:val="17"/>
+              </w:rPr>
+              <w:t>方向</w:t>
+            </w:r>
+          </w:p>
+        </w:tc>
+        <w:tc>
+          <w:tcPr>
+            <w:tcW w:type="dxa" w:w="3700"/>
+            <w:vAlign w:val="center"/>
+            <w:tcMar>
+              <w:top w:w="80" w:type="dxa"/>
+              <w:bottom w:w="80" w:type="dxa"/>
+              <w:start w:w="120" w:type="dxa"/>
+              <w:end w:w="120" w:type="dxa"/>
+            </w:tcMar>
+            <w:tcBorders>
+              <w:top w:val="single" w:sz="12" w:color="000000"/>
+              <w:left w:val="nil"/>
+              <w:bottom w:val="single" w:sz="8" w:color="000000"/>
+              <w:right w:val="nil"/>
+              <w:insideH w:val="nil"/>
+              <w:insideV w:val="nil"/>
+            </w:tcBorders>
+          </w:tcPr>
+          <w:p>
+            <w:pPr>
+              <w:spacing w:line="264" w:lineRule="auto" w:after="0"/>
+              <w:jc w:val="center"/>
+            </w:pPr>
+            <w:r/>
+            <w:r>
+              <w:rPr>
+                <w:rFonts w:ascii="Times New Roman" w:hAnsi="Times New Roman" w:eastAsia="SimSun"/>
+                <w:b/>
+                <w:sz w:val="17"/>
+              </w:rPr>
+              <w:t>国外研究重点</w:t>
+            </w:r>
+          </w:p>
+        </w:tc>
+        <w:tc>
+          <w:tcPr>
+            <w:tcW w:type="dxa" w:w="3760"/>
+            <w:vAlign w:val="center"/>
+            <w:tcMar>
+              <w:top w:w="80" w:type="dxa"/>
+              <w:bottom w:w="80" w:type="dxa"/>
+              <w:start w:w="120" w:type="dxa"/>
+              <w:end w:w="120" w:type="dxa"/>
+            </w:tcMar>
+            <w:tcBorders>
+              <w:top w:val="single" w:sz="12" w:color="000000"/>
+              <w:left w:val="nil"/>
+              <w:bottom w:val="single" w:sz="8" w:color="000000"/>
+              <w:right w:val="nil"/>
+              <w:insideH w:val="nil"/>
+              <w:insideV w:val="nil"/>
+            </w:tcBorders>
+          </w:tcPr>
+          <w:p>
+            <w:pPr>
+              <w:spacing w:line="264" w:lineRule="auto" w:after="0"/>
+              <w:jc w:val="center"/>
+            </w:pPr>
+            <w:r/>
+            <w:r>
+              <w:rPr>
+                <w:rFonts w:ascii="Times New Roman" w:hAnsi="Times New Roman" w:eastAsia="SimSun"/>
+                <w:b/>
+                <w:sz w:val="17"/>
+              </w:rPr>
+              <w:t>国内研究与应用重点</w:t>
+            </w:r>
+          </w:p>
+        </w:tc>
+      </w:tr>
+      <w:tr>
+        <w:trPr>
+          <w:cantSplit/>
+        </w:trPr>
+        <w:tc>
+          <w:tcPr>
+            <w:tcW w:type="dxa" w:w="1900"/>
+            <w:vAlign w:val="center"/>
+            <w:tcMar>
+              <w:top w:w="80" w:type="dxa"/>
+              <w:bottom w:w="80" w:type="dxa"/>
+              <w:start w:w="120" w:type="dxa"/>
+              <w:end w:w="120" w:type="dxa"/>
+            </w:tcMar>
+            <w:tcBorders>
+              <w:top w:val="nil"/>
+              <w:left w:val="nil"/>
+              <w:bottom w:val="nil"/>
+              <w:right w:val="nil"/>
+              <w:insideH w:val="nil"/>
+              <w:insideV w:val="nil"/>
+            </w:tcBorders>
+          </w:tcPr>
+          <w:p>
+            <w:pPr>
+              <w:spacing w:line="264" w:lineRule="auto" w:after="0"/>
+              <w:jc w:val="center"/>
+            </w:pPr>
+            <w:r/>
+            <w:r>
+              <w:rPr>
+                <w:rFonts w:ascii="Times New Roman" w:hAnsi="Times New Roman" w:eastAsia="SimSun"/>
+                <w:b w:val="0"/>
+                <w:sz w:val="17"/>
+              </w:rPr>
+              <w:t>文本到音乐生成</w:t>
+            </w:r>
+          </w:p>
+        </w:tc>
+        <w:tc>
+          <w:tcPr>
+            <w:tcW w:type="dxa" w:w="3700"/>
+            <w:vAlign w:val="center"/>
+            <w:tcMar>
+              <w:top w:w="80" w:type="dxa"/>
+              <w:bottom w:w="80" w:type="dxa"/>
+              <w:start w:w="120" w:type="dxa"/>
+              <w:end w:w="120" w:type="dxa"/>
+            </w:tcMar>
+            <w:tcBorders>
+              <w:top w:val="nil"/>
+              <w:left w:val="nil"/>
+              <w:bottom w:val="nil"/>
+              <w:right w:val="nil"/>
+              <w:insideH w:val="nil"/>
+              <w:insideV w:val="nil"/>
+            </w:tcBorders>
+          </w:tcPr>
+          <w:p>
+            <w:pPr>
+              <w:spacing w:line="264" w:lineRule="auto" w:after="0"/>
+              <w:jc w:val="left"/>
+            </w:pPr>
+            <w:r/>
+            <w:r>
+              <w:rPr>
+                <w:rFonts w:ascii="Times New Roman" w:hAnsi="Times New Roman" w:eastAsia="SimSun"/>
+                <w:b w:val="0"/>
+                <w:sz w:val="17"/>
+              </w:rPr>
+              <w:t>大规模基础模型、长时一致性、文本和旋律条件控制</w:t>
+            </w:r>
+          </w:p>
+        </w:tc>
+        <w:tc>
+          <w:tcPr>
+            <w:tcW w:type="dxa" w:w="3760"/>
+            <w:vAlign w:val="center"/>
+            <w:tcMar>
+              <w:top w:w="80" w:type="dxa"/>
+              <w:bottom w:w="80" w:type="dxa"/>
+              <w:start w:w="120" w:type="dxa"/>
+              <w:end w:w="120" w:type="dxa"/>
+            </w:tcMar>
+            <w:tcBorders>
+              <w:top w:val="nil"/>
+              <w:left w:val="nil"/>
+              <w:bottom w:val="nil"/>
+              <w:right w:val="nil"/>
+              <w:insideH w:val="nil"/>
+              <w:insideV w:val="nil"/>
+            </w:tcBorders>
+          </w:tcPr>
+          <w:p>
+            <w:pPr>
+              <w:spacing w:line="264" w:lineRule="auto" w:after="0"/>
+              <w:jc w:val="left"/>
+            </w:pPr>
+            <w:r/>
+            <w:r>
+              <w:rPr>
+                <w:rFonts w:ascii="Times New Roman" w:hAnsi="Times New Roman" w:eastAsia="SimSun"/>
+                <w:b w:val="0"/>
+                <w:sz w:val="17"/>
+              </w:rPr>
+              <w:t>本地部署、提示词工程、垂直风格适配和网页化生成</w:t>
+            </w:r>
+          </w:p>
+        </w:tc>
+      </w:tr>
+      <w:tr>
+        <w:trPr>
+          <w:cantSplit/>
+        </w:trPr>
+        <w:tc>
+          <w:tcPr>
+            <w:tcW w:type="dxa" w:w="1900"/>
+            <w:vAlign w:val="center"/>
+            <w:tcMar>
+              <w:top w:w="80" w:type="dxa"/>
+              <w:bottom w:w="80" w:type="dxa"/>
+              <w:start w:w="120" w:type="dxa"/>
+              <w:end w:w="120" w:type="dxa"/>
+            </w:tcMar>
+            <w:tcBorders>
+              <w:top w:val="nil"/>
+              <w:left w:val="nil"/>
+              <w:bottom w:val="nil"/>
+              <w:right w:val="nil"/>
+              <w:insideH w:val="nil"/>
+              <w:insideV w:val="nil"/>
+            </w:tcBorders>
+          </w:tcPr>
+          <w:p>
+            <w:pPr>
+              <w:spacing w:line="264" w:lineRule="auto" w:after="0"/>
+              <w:jc w:val="center"/>
+            </w:pPr>
+            <w:r/>
+            <w:r>
+              <w:rPr>
+                <w:rFonts w:ascii="Times New Roman" w:hAnsi="Times New Roman" w:eastAsia="SimSun"/>
+                <w:b w:val="0"/>
+                <w:sz w:val="17"/>
+              </w:rPr>
+              <w:t>参数高效微调</w:t>
+            </w:r>
+          </w:p>
+        </w:tc>
+        <w:tc>
+          <w:tcPr>
+            <w:tcW w:type="dxa" w:w="3700"/>
+            <w:vAlign w:val="center"/>
+            <w:tcMar>
+              <w:top w:w="80" w:type="dxa"/>
+              <w:bottom w:w="80" w:type="dxa"/>
+              <w:start w:w="120" w:type="dxa"/>
+              <w:end w:w="120" w:type="dxa"/>
+            </w:tcMar>
+            <w:tcBorders>
+              <w:top w:val="nil"/>
+              <w:left w:val="nil"/>
+              <w:bottom w:val="nil"/>
+              <w:right w:val="nil"/>
+              <w:insideH w:val="nil"/>
+              <w:insideV w:val="nil"/>
+            </w:tcBorders>
+          </w:tcPr>
+          <w:p>
+            <w:pPr>
+              <w:spacing w:line="264" w:lineRule="auto" w:after="0"/>
+              <w:jc w:val="left"/>
+            </w:pPr>
+            <w:r/>
+            <w:r>
+              <w:rPr>
+                <w:rFonts w:ascii="Times New Roman" w:hAnsi="Times New Roman" w:eastAsia="SimSun"/>
+                <w:b w:val="0"/>
+                <w:sz w:val="17"/>
+              </w:rPr>
+              <w:t>LoRA、Adapter 等低成本适配方法及多任务泛化</w:t>
+            </w:r>
+          </w:p>
+        </w:tc>
+        <w:tc>
+          <w:tcPr>
+            <w:tcW w:type="dxa" w:w="3760"/>
+            <w:vAlign w:val="center"/>
+            <w:tcMar>
+              <w:top w:w="80" w:type="dxa"/>
+              <w:bottom w:w="80" w:type="dxa"/>
+              <w:start w:w="120" w:type="dxa"/>
+              <w:end w:w="120" w:type="dxa"/>
+            </w:tcMar>
+            <w:tcBorders>
+              <w:top w:val="nil"/>
+              <w:left w:val="nil"/>
+              <w:bottom w:val="nil"/>
+              <w:right w:val="nil"/>
+              <w:insideH w:val="nil"/>
+              <w:insideV w:val="nil"/>
+            </w:tcBorders>
+          </w:tcPr>
+          <w:p>
+            <w:pPr>
+              <w:spacing w:line="264" w:lineRule="auto" w:after="0"/>
+              <w:jc w:val="left"/>
+            </w:pPr>
+            <w:r/>
+            <w:r>
+              <w:rPr>
+                <w:rFonts w:ascii="Times New Roman" w:hAnsi="Times New Roman" w:eastAsia="SimSun"/>
+                <w:b w:val="0"/>
+                <w:sz w:val="17"/>
+              </w:rPr>
+              <w:t>面向消费级 GPU 的小样本训练、权重管理和同 seed 对照</w:t>
+            </w:r>
+          </w:p>
+        </w:tc>
+      </w:tr>
+      <w:tr>
+        <w:trPr>
+          <w:cantSplit/>
+        </w:trPr>
+        <w:tc>
+          <w:tcPr>
+            <w:tcW w:type="dxa" w:w="1900"/>
+            <w:vAlign w:val="center"/>
+            <w:tcMar>
+              <w:top w:w="80" w:type="dxa"/>
+              <w:bottom w:w="80" w:type="dxa"/>
+              <w:start w:w="120" w:type="dxa"/>
+              <w:end w:w="120" w:type="dxa"/>
+            </w:tcMar>
+            <w:tcBorders>
+              <w:top w:val="nil"/>
+              <w:left w:val="nil"/>
+              <w:bottom w:val="nil"/>
+              <w:right w:val="nil"/>
+              <w:insideH w:val="nil"/>
+              <w:insideV w:val="nil"/>
+            </w:tcBorders>
+          </w:tcPr>
+          <w:p>
+            <w:pPr>
+              <w:spacing w:line="264" w:lineRule="auto" w:after="0"/>
+              <w:jc w:val="center"/>
+            </w:pPr>
+            <w:r/>
+            <w:r>
+              <w:rPr>
+                <w:rFonts w:ascii="Times New Roman" w:hAnsi="Times New Roman" w:eastAsia="SimSun"/>
+                <w:b w:val="0"/>
+                <w:sz w:val="17"/>
+              </w:rPr>
+              <w:t>歌声音色迁移</w:t>
+            </w:r>
+          </w:p>
+        </w:tc>
+        <w:tc>
+          <w:tcPr>
+            <w:tcW w:type="dxa" w:w="3700"/>
+            <w:vAlign w:val="center"/>
+            <w:tcMar>
+              <w:top w:w="80" w:type="dxa"/>
+              <w:bottom w:w="80" w:type="dxa"/>
+              <w:start w:w="120" w:type="dxa"/>
+              <w:end w:w="120" w:type="dxa"/>
+            </w:tcMar>
+            <w:tcBorders>
+              <w:top w:val="nil"/>
+              <w:left w:val="nil"/>
+              <w:bottom w:val="nil"/>
+              <w:right w:val="nil"/>
+              <w:insideH w:val="nil"/>
+              <w:insideV w:val="nil"/>
+            </w:tcBorders>
+          </w:tcPr>
+          <w:p>
+            <w:pPr>
+              <w:spacing w:line="264" w:lineRule="auto" w:after="0"/>
+              <w:jc w:val="left"/>
+            </w:pPr>
+            <w:r/>
+            <w:r>
+              <w:rPr>
+                <w:rFonts w:ascii="Times New Roman" w:hAnsi="Times New Roman" w:eastAsia="SimSun"/>
+                <w:b w:val="0"/>
+                <w:sz w:val="17"/>
+              </w:rPr>
+              <w:t>内容、F0、音色嵌入和声码器的解耦建模</w:t>
+            </w:r>
+          </w:p>
+        </w:tc>
+        <w:tc>
+          <w:tcPr>
+            <w:tcW w:type="dxa" w:w="3760"/>
+            <w:vAlign w:val="center"/>
+            <w:tcMar>
+              <w:top w:w="80" w:type="dxa"/>
+              <w:bottom w:w="80" w:type="dxa"/>
+              <w:start w:w="120" w:type="dxa"/>
+              <w:end w:w="120" w:type="dxa"/>
+            </w:tcMar>
+            <w:tcBorders>
+              <w:top w:val="nil"/>
+              <w:left w:val="nil"/>
+              <w:bottom w:val="nil"/>
+              <w:right w:val="nil"/>
+              <w:insideH w:val="nil"/>
+              <w:insideV w:val="nil"/>
+            </w:tcBorders>
+          </w:tcPr>
+          <w:p>
+            <w:pPr>
+              <w:spacing w:line="264" w:lineRule="auto" w:after="0"/>
+              <w:jc w:val="left"/>
+            </w:pPr>
+            <w:r/>
+            <w:r>
+              <w:rPr>
+                <w:rFonts w:ascii="Times New Roman" w:hAnsi="Times New Roman" w:eastAsia="SimSun"/>
+                <w:b w:val="0"/>
+                <w:sz w:val="17"/>
+              </w:rPr>
+              <w:t>授权样本管理、中文交互、伴奏重混和听感修复</w:t>
+            </w:r>
+          </w:p>
+        </w:tc>
+      </w:tr>
+      <w:tr>
+        <w:trPr>
+          <w:cantSplit/>
+        </w:trPr>
+        <w:tc>
+          <w:tcPr>
+            <w:tcW w:type="dxa" w:w="1900"/>
+            <w:vAlign w:val="center"/>
+            <w:tcMar>
+              <w:top w:w="80" w:type="dxa"/>
+              <w:bottom w:w="80" w:type="dxa"/>
+              <w:start w:w="120" w:type="dxa"/>
+              <w:end w:w="120" w:type="dxa"/>
+            </w:tcMar>
+            <w:tcBorders>
+              <w:top w:val="nil"/>
+              <w:left w:val="nil"/>
+              <w:bottom w:val="single" w:sz="12" w:color="000000"/>
+              <w:right w:val="nil"/>
+              <w:insideH w:val="nil"/>
+              <w:insideV w:val="nil"/>
+            </w:tcBorders>
+          </w:tcPr>
+          <w:p>
+            <w:pPr>
+              <w:spacing w:line="264" w:lineRule="auto" w:after="0"/>
+              <w:jc w:val="center"/>
+            </w:pPr>
+            <w:r/>
+            <w:r>
+              <w:rPr>
+                <w:rFonts w:ascii="Times New Roman" w:hAnsi="Times New Roman" w:eastAsia="SimSun"/>
+                <w:b w:val="0"/>
+                <w:sz w:val="17"/>
+              </w:rPr>
+              <w:t>实验评价</w:t>
+            </w:r>
+          </w:p>
+        </w:tc>
+        <w:tc>
+          <w:tcPr>
+            <w:tcW w:type="dxa" w:w="3700"/>
+            <w:vAlign w:val="center"/>
+            <w:tcMar>
+              <w:top w:w="80" w:type="dxa"/>
+              <w:bottom w:w="80" w:type="dxa"/>
+              <w:start w:w="120" w:type="dxa"/>
+              <w:end w:w="120" w:type="dxa"/>
+            </w:tcMar>
+            <w:tcBorders>
+              <w:top w:val="nil"/>
+              <w:left w:val="nil"/>
+              <w:bottom w:val="single" w:sz="12" w:color="000000"/>
+              <w:right w:val="nil"/>
+              <w:insideH w:val="nil"/>
+              <w:insideV w:val="nil"/>
+            </w:tcBorders>
+          </w:tcPr>
+          <w:p>
+            <w:pPr>
+              <w:spacing w:line="264" w:lineRule="auto" w:after="0"/>
+              <w:jc w:val="left"/>
+            </w:pPr>
+            <w:r/>
+            <w:r>
+              <w:rPr>
+                <w:rFonts w:ascii="Times New Roman" w:hAnsi="Times New Roman" w:eastAsia="SimSun"/>
+                <w:b w:val="0"/>
+                <w:sz w:val="17"/>
+              </w:rPr>
+              <w:t>FAD、CLAP 相似度、主观听评和公开 benchmark</w:t>
+            </w:r>
+          </w:p>
+        </w:tc>
+        <w:tc>
+          <w:tcPr>
+            <w:tcW w:type="dxa" w:w="3760"/>
+            <w:vAlign w:val="center"/>
+            <w:tcMar>
+              <w:top w:w="80" w:type="dxa"/>
+              <w:bottom w:w="80" w:type="dxa"/>
+              <w:start w:w="120" w:type="dxa"/>
+              <w:end w:w="120" w:type="dxa"/>
+            </w:tcMar>
+            <w:tcBorders>
+              <w:top w:val="nil"/>
+              <w:left w:val="nil"/>
+              <w:bottom w:val="single" w:sz="12" w:color="000000"/>
+              <w:right w:val="nil"/>
+              <w:insideH w:val="nil"/>
+              <w:insideV w:val="nil"/>
+            </w:tcBorders>
+          </w:tcPr>
+          <w:p>
+            <w:pPr>
+              <w:spacing w:line="264" w:lineRule="auto" w:after="0"/>
+              <w:jc w:val="left"/>
+            </w:pPr>
+            <w:r/>
+            <w:r>
+              <w:rPr>
+                <w:rFonts w:ascii="Times New Roman" w:hAnsi="Times New Roman" w:eastAsia="SimSun"/>
+                <w:b w:val="0"/>
+                <w:sz w:val="17"/>
+              </w:rPr>
+              <w:t>任务级证据归档、可复现报告、生成内容标识和工程可用性</w:t>
+            </w:r>
+          </w:p>
+        </w:tc>
+      </w:tr>
+    </w:tbl>
+    <w:p>
+      <w:pPr>
+        <w:keepNext w:val="0"/>
+        <w:keepLines w:val="0"/>
+        <w:spacing w:line="276" w:lineRule="auto" w:after="80"/>
+      </w:pPr>
+      <w:r>
+        <w:rPr>
+          <w:rFonts w:ascii="Times New Roman" w:hAnsi="Times New Roman" w:eastAsia="SimSun"/>
+          <w:b w:val="0"/>
+          <w:sz w:val="4"/>
+        </w:rPr>
+      </w:r>
+    </w:p>
+    <w:p>
+      <w:pPr>
+        <w:keepNext/>
+        <w:spacing w:before="140" w:after="100"/>
+      </w:pPr>
+      <w:r>
+        <w:rPr>
+          <w:rFonts w:ascii="Times New Roman" w:hAnsi="Times New Roman" w:eastAsia="SimSun"/>
+          <w:b/>
+          <w:sz w:val="24"/>
+        </w:rPr>
+        <w:t>2.3 关键问题与本文定位</w:t>
+      </w:r>
+    </w:p>
+    <w:p>
+      <w:pPr>
+        <w:keepNext w:val="0"/>
+        <w:keepLines w:val="0"/>
+        <w:spacing w:line="276" w:lineRule="auto" w:after="80"/>
+        <w:ind w:firstLine="420"/>
+      </w:pPr>
+      <w:r>
+        <w:rPr>
+          <w:rFonts w:ascii="Times New Roman" w:hAnsi="Times New Roman" w:eastAsia="SimSun"/>
+          <w:b w:val="0"/>
+          <w:sz w:val="21"/>
+        </w:rPr>
+        <w:t>现有研究虽然已经证明大模型可以生成音乐、分离音轨并转换音色，但在一个真实系统中仍存在三类关键问题：一是风格适配与旋律结构学习容易混淆，短片段训练可能只学到瞬时音色或局部纹理，而难以学习段落级铺垫和 drop 结构；二是歌声音色迁移对分轨质量高度敏感，伴奏泄漏会污染内容编码和声码器输出；三是听感问题往往缺乏中间证据，无法判断问题来自数据、模型、采样参数还是后处理。本文的定位不是重新提出一个完整基础模型，而是在现有基础模型和开源组件上构建可解释、可复核、可迭代的智能音频处理方法。</w:t>
       </w:r>
     </w:p>
     <w:p>
@@ -302,7 +1076,7 @@
           <w:b/>
           <w:sz w:val="19"/>
         </w:rPr>
-        <w:t>表1 三类音频任务的边界</w:t>
+        <w:t>表2 三类音频任务的边界</w:t>
       </w:r>
     </w:p>
     <w:tbl>
@@ -1035,7 +1809,7 @@
           <w:b/>
           <w:sz w:val="19"/>
         </w:rPr>
-        <w:t>表2 符号定义</w:t>
+        <w:t>表3 符号定义</w:t>
       </w:r>
     </w:p>
     <w:tbl>
@@ -1852,6 +2626,630 @@
     </w:p>
     <w:p>
       <w:pPr>
+        <w:keepNext/>
+        <w:spacing w:before="140" w:after="100"/>
+      </w:pPr>
+      <w:r>
+        <w:rPr>
+          <w:rFonts w:ascii="Times New Roman" w:hAnsi="Times New Roman" w:eastAsia="SimSun"/>
+          <w:b/>
+          <w:sz w:val="24"/>
+        </w:rPr>
+        <w:t>3.1 总体技术路线</w:t>
+      </w:r>
+    </w:p>
+    <w:p>
+      <w:pPr>
+        <w:keepNext w:val="0"/>
+        <w:keepLines w:val="0"/>
+        <w:spacing w:line="276" w:lineRule="auto" w:after="80"/>
+        <w:ind w:firstLine="420"/>
+      </w:pPr>
+      <w:r>
+        <w:rPr>
+          <w:rFonts w:ascii="Times New Roman" w:hAnsi="Times New Roman" w:eastAsia="SimSun"/>
+          <w:b w:val="0"/>
+          <w:sz w:val="21"/>
+        </w:rPr>
+        <w:t>本文技术路线按照“数据层、模型层、推理层、评价层”组织。数据层负责把原始音频切分为基础风格片段和段落级结构片段，并记录来源、时长、标签和训练划分；模型层将 ACE-Step+LoRA 的生成式适配与 Demucs+Seed-VC 的授权音色迁移分离部署；推理层通过固定 seed、采样步数、guidance、LoRA 权重和后处理参数控制变量；评价层保存客观声学指标、主观听评入口、波形频谱诊断图和 Mel 水印证据。这种分层设计使系统在听感不理想时能够逐层回查，而不是把所有问题笼统归因于“模型不像”。</w:t>
+      </w:r>
+    </w:p>
+    <w:p>
+      <w:pPr>
+        <w:keepNext/>
+        <w:keepLines/>
+        <w:spacing w:line="276" w:lineRule="auto" w:after="80"/>
+        <w:jc w:val="center"/>
+      </w:pPr>
+      <w:r>
+        <w:rPr>
+          <w:rFonts w:ascii="Times New Roman" w:hAnsi="Times New Roman" w:eastAsia="SimSun"/>
+          <w:b/>
+          <w:sz w:val="19"/>
+        </w:rPr>
+        <w:t>表4 技术路线与可观测证据</w:t>
+      </w:r>
+    </w:p>
+    <w:tbl>
+      <w:tblPr>
+        <w:tblW w:type="auto" w:w="0"/>
+        <w:jc w:val="center"/>
+        <w:tblLayout w:type="fixed"/>
+        <w:tblLook w:firstColumn="1" w:firstRow="1" w:lastColumn="0" w:lastRow="0" w:noHBand="0" w:noVBand="1" w:val="04A0"/>
+      </w:tblPr>
+      <w:tblGrid>
+        <w:gridCol w:w="3061"/>
+        <w:gridCol w:w="3061"/>
+        <w:gridCol w:w="3061"/>
+      </w:tblGrid>
+      <w:tr>
+        <w:trPr>
+          <w:cantSplit/>
+          <w:tblHeader w:val="true"/>
+        </w:trPr>
+        <w:tc>
+          <w:tcPr>
+            <w:tcW w:type="dxa" w:w="1700"/>
+            <w:vAlign w:val="center"/>
+            <w:tcMar>
+              <w:top w:w="80" w:type="dxa"/>
+              <w:bottom w:w="80" w:type="dxa"/>
+              <w:start w:w="120" w:type="dxa"/>
+              <w:end w:w="120" w:type="dxa"/>
+            </w:tcMar>
+            <w:tcBorders>
+              <w:top w:val="single" w:sz="12" w:color="000000"/>
+              <w:left w:val="nil"/>
+              <w:bottom w:val="single" w:sz="8" w:color="000000"/>
+              <w:right w:val="nil"/>
+              <w:insideH w:val="nil"/>
+              <w:insideV w:val="nil"/>
+            </w:tcBorders>
+          </w:tcPr>
+          <w:p>
+            <w:pPr>
+              <w:spacing w:line="264" w:lineRule="auto" w:after="0"/>
+              <w:jc w:val="center"/>
+            </w:pPr>
+            <w:r/>
+            <w:r>
+              <w:rPr>
+                <w:rFonts w:ascii="Times New Roman" w:hAnsi="Times New Roman" w:eastAsia="SimSun"/>
+                <w:b/>
+                <w:sz w:val="17"/>
+              </w:rPr>
+              <w:t>层次</w:t>
+            </w:r>
+          </w:p>
+        </w:tc>
+        <w:tc>
+          <w:tcPr>
+            <w:tcW w:type="dxa" w:w="4200"/>
+            <w:vAlign w:val="center"/>
+            <w:tcMar>
+              <w:top w:w="80" w:type="dxa"/>
+              <w:bottom w:w="80" w:type="dxa"/>
+              <w:start w:w="120" w:type="dxa"/>
+              <w:end w:w="120" w:type="dxa"/>
+            </w:tcMar>
+            <w:tcBorders>
+              <w:top w:val="single" w:sz="12" w:color="000000"/>
+              <w:left w:val="nil"/>
+              <w:bottom w:val="single" w:sz="8" w:color="000000"/>
+              <w:right w:val="nil"/>
+              <w:insideH w:val="nil"/>
+              <w:insideV w:val="nil"/>
+            </w:tcBorders>
+          </w:tcPr>
+          <w:p>
+            <w:pPr>
+              <w:spacing w:line="264" w:lineRule="auto" w:after="0"/>
+              <w:jc w:val="center"/>
+            </w:pPr>
+            <w:r/>
+            <w:r>
+              <w:rPr>
+                <w:rFonts w:ascii="Times New Roman" w:hAnsi="Times New Roman" w:eastAsia="SimSun"/>
+                <w:b/>
+                <w:sz w:val="17"/>
+              </w:rPr>
+              <w:t>核心操作</w:t>
+            </w:r>
+          </w:p>
+        </w:tc>
+        <w:tc>
+          <w:tcPr>
+            <w:tcW w:type="dxa" w:w="3460"/>
+            <w:vAlign w:val="center"/>
+            <w:tcMar>
+              <w:top w:w="80" w:type="dxa"/>
+              <w:bottom w:w="80" w:type="dxa"/>
+              <w:start w:w="120" w:type="dxa"/>
+              <w:end w:w="120" w:type="dxa"/>
+            </w:tcMar>
+            <w:tcBorders>
+              <w:top w:val="single" w:sz="12" w:color="000000"/>
+              <w:left w:val="nil"/>
+              <w:bottom w:val="single" w:sz="8" w:color="000000"/>
+              <w:right w:val="nil"/>
+              <w:insideH w:val="nil"/>
+              <w:insideV w:val="nil"/>
+            </w:tcBorders>
+          </w:tcPr>
+          <w:p>
+            <w:pPr>
+              <w:spacing w:line="264" w:lineRule="auto" w:after="0"/>
+              <w:jc w:val="center"/>
+            </w:pPr>
+            <w:r/>
+            <w:r>
+              <w:rPr>
+                <w:rFonts w:ascii="Times New Roman" w:hAnsi="Times New Roman" w:eastAsia="SimSun"/>
+                <w:b/>
+                <w:sz w:val="17"/>
+              </w:rPr>
+              <w:t>可观测证据</w:t>
+            </w:r>
+          </w:p>
+        </w:tc>
+      </w:tr>
+      <w:tr>
+        <w:trPr>
+          <w:cantSplit/>
+        </w:trPr>
+        <w:tc>
+          <w:tcPr>
+            <w:tcW w:type="dxa" w:w="1700"/>
+            <w:vAlign w:val="center"/>
+            <w:tcMar>
+              <w:top w:w="80" w:type="dxa"/>
+              <w:bottom w:w="80" w:type="dxa"/>
+              <w:start w:w="120" w:type="dxa"/>
+              <w:end w:w="120" w:type="dxa"/>
+            </w:tcMar>
+            <w:tcBorders>
+              <w:top w:val="nil"/>
+              <w:left w:val="nil"/>
+              <w:bottom w:val="nil"/>
+              <w:right w:val="nil"/>
+              <w:insideH w:val="nil"/>
+              <w:insideV w:val="nil"/>
+            </w:tcBorders>
+          </w:tcPr>
+          <w:p>
+            <w:pPr>
+              <w:spacing w:line="264" w:lineRule="auto" w:after="0"/>
+              <w:jc w:val="center"/>
+            </w:pPr>
+            <w:r/>
+            <w:r>
+              <w:rPr>
+                <w:rFonts w:ascii="Times New Roman" w:hAnsi="Times New Roman" w:eastAsia="SimSun"/>
+                <w:b w:val="0"/>
+                <w:sz w:val="17"/>
+              </w:rPr>
+              <w:t>数据层</w:t>
+            </w:r>
+          </w:p>
+        </w:tc>
+        <w:tc>
+          <w:tcPr>
+            <w:tcW w:type="dxa" w:w="4200"/>
+            <w:vAlign w:val="center"/>
+            <w:tcMar>
+              <w:top w:w="80" w:type="dxa"/>
+              <w:bottom w:w="80" w:type="dxa"/>
+              <w:start w:w="120" w:type="dxa"/>
+              <w:end w:w="120" w:type="dxa"/>
+            </w:tcMar>
+            <w:tcBorders>
+              <w:top w:val="nil"/>
+              <w:left w:val="nil"/>
+              <w:bottom w:val="nil"/>
+              <w:right w:val="nil"/>
+              <w:insideH w:val="nil"/>
+              <w:insideV w:val="nil"/>
+            </w:tcBorders>
+          </w:tcPr>
+          <w:p>
+            <w:pPr>
+              <w:spacing w:line="264" w:lineRule="auto" w:after="0"/>
+              <w:jc w:val="left"/>
+            </w:pPr>
+            <w:r/>
+            <w:r>
+              <w:rPr>
+                <w:rFonts w:ascii="Times New Roman" w:hAnsi="Times New Roman" w:eastAsia="SimSun"/>
+                <w:b w:val="0"/>
+                <w:sz w:val="17"/>
+              </w:rPr>
+              <w:t>8 秒基础片段、15 秒段落片段、结构标签和训练划分</w:t>
+            </w:r>
+          </w:p>
+        </w:tc>
+        <w:tc>
+          <w:tcPr>
+            <w:tcW w:type="dxa" w:w="3460"/>
+            <w:vAlign w:val="center"/>
+            <w:tcMar>
+              <w:top w:w="80" w:type="dxa"/>
+              <w:bottom w:w="80" w:type="dxa"/>
+              <w:start w:w="120" w:type="dxa"/>
+              <w:end w:w="120" w:type="dxa"/>
+            </w:tcMar>
+            <w:tcBorders>
+              <w:top w:val="nil"/>
+              <w:left w:val="nil"/>
+              <w:bottom w:val="nil"/>
+              <w:right w:val="nil"/>
+              <w:insideH w:val="nil"/>
+              <w:insideV w:val="nil"/>
+            </w:tcBorders>
+          </w:tcPr>
+          <w:p>
+            <w:pPr>
+              <w:spacing w:line="264" w:lineRule="auto" w:after="0"/>
+              <w:jc w:val="left"/>
+            </w:pPr>
+            <w:r/>
+            <w:r>
+              <w:rPr>
+                <w:rFonts w:ascii="Times New Roman" w:hAnsi="Times New Roman" w:eastAsia="SimSun"/>
+                <w:b w:val="0"/>
+                <w:sz w:val="17"/>
+              </w:rPr>
+              <w:t>数据统计、标签分布、split 文件和样本路径</w:t>
+            </w:r>
+          </w:p>
+        </w:tc>
+      </w:tr>
+      <w:tr>
+        <w:trPr>
+          <w:cantSplit/>
+        </w:trPr>
+        <w:tc>
+          <w:tcPr>
+            <w:tcW w:type="dxa" w:w="1700"/>
+            <w:vAlign w:val="center"/>
+            <w:tcMar>
+              <w:top w:w="80" w:type="dxa"/>
+              <w:bottom w:w="80" w:type="dxa"/>
+              <w:start w:w="120" w:type="dxa"/>
+              <w:end w:w="120" w:type="dxa"/>
+            </w:tcMar>
+            <w:tcBorders>
+              <w:top w:val="nil"/>
+              <w:left w:val="nil"/>
+              <w:bottom w:val="nil"/>
+              <w:right w:val="nil"/>
+              <w:insideH w:val="nil"/>
+              <w:insideV w:val="nil"/>
+            </w:tcBorders>
+          </w:tcPr>
+          <w:p>
+            <w:pPr>
+              <w:spacing w:line="264" w:lineRule="auto" w:after="0"/>
+              <w:jc w:val="center"/>
+            </w:pPr>
+            <w:r/>
+            <w:r>
+              <w:rPr>
+                <w:rFonts w:ascii="Times New Roman" w:hAnsi="Times New Roman" w:eastAsia="SimSun"/>
+                <w:b w:val="0"/>
+                <w:sz w:val="17"/>
+              </w:rPr>
+              <w:t>生成模型层</w:t>
+            </w:r>
+          </w:p>
+        </w:tc>
+        <w:tc>
+          <w:tcPr>
+            <w:tcW w:type="dxa" w:w="4200"/>
+            <w:vAlign w:val="center"/>
+            <w:tcMar>
+              <w:top w:w="80" w:type="dxa"/>
+              <w:bottom w:w="80" w:type="dxa"/>
+              <w:start w:w="120" w:type="dxa"/>
+              <w:end w:w="120" w:type="dxa"/>
+            </w:tcMar>
+            <w:tcBorders>
+              <w:top w:val="nil"/>
+              <w:left w:val="nil"/>
+              <w:bottom w:val="nil"/>
+              <w:right w:val="nil"/>
+              <w:insideH w:val="nil"/>
+              <w:insideV w:val="nil"/>
+            </w:tcBorders>
+          </w:tcPr>
+          <w:p>
+            <w:pPr>
+              <w:spacing w:line="264" w:lineRule="auto" w:after="0"/>
+              <w:jc w:val="left"/>
+            </w:pPr>
+            <w:r/>
+            <w:r>
+              <w:rPr>
+                <w:rFonts w:ascii="Times New Roman" w:hAnsi="Times New Roman" w:eastAsia="SimSun"/>
+                <w:b w:val="0"/>
+                <w:sz w:val="17"/>
+              </w:rPr>
+              <w:t>冻结 ACE-Step 主体并注入 LoRA 低秩残差</w:t>
+            </w:r>
+          </w:p>
+        </w:tc>
+        <w:tc>
+          <w:tcPr>
+            <w:tcW w:type="dxa" w:w="3460"/>
+            <w:vAlign w:val="center"/>
+            <w:tcMar>
+              <w:top w:w="80" w:type="dxa"/>
+              <w:bottom w:w="80" w:type="dxa"/>
+              <w:start w:w="120" w:type="dxa"/>
+              <w:end w:w="120" w:type="dxa"/>
+            </w:tcMar>
+            <w:tcBorders>
+              <w:top w:val="nil"/>
+              <w:left w:val="nil"/>
+              <w:bottom w:val="nil"/>
+              <w:right w:val="nil"/>
+              <w:insideH w:val="nil"/>
+              <w:insideV w:val="nil"/>
+            </w:tcBorders>
+          </w:tcPr>
+          <w:p>
+            <w:pPr>
+              <w:spacing w:line="264" w:lineRule="auto" w:after="0"/>
+              <w:jc w:val="left"/>
+            </w:pPr>
+            <w:r/>
+            <w:r>
+              <w:rPr>
+                <w:rFonts w:ascii="Times New Roman" w:hAnsi="Times New Roman" w:eastAsia="SimSun"/>
+                <w:b w:val="0"/>
+                <w:sz w:val="17"/>
+              </w:rPr>
+              <w:t>LoRA manifest、训练步数、可训练参数和同 seed 输出</w:t>
+            </w:r>
+          </w:p>
+        </w:tc>
+      </w:tr>
+      <w:tr>
+        <w:trPr>
+          <w:cantSplit/>
+        </w:trPr>
+        <w:tc>
+          <w:tcPr>
+            <w:tcW w:type="dxa" w:w="1700"/>
+            <w:vAlign w:val="center"/>
+            <w:tcMar>
+              <w:top w:w="80" w:type="dxa"/>
+              <w:bottom w:w="80" w:type="dxa"/>
+              <w:start w:w="120" w:type="dxa"/>
+              <w:end w:w="120" w:type="dxa"/>
+            </w:tcMar>
+            <w:tcBorders>
+              <w:top w:val="nil"/>
+              <w:left w:val="nil"/>
+              <w:bottom w:val="nil"/>
+              <w:right w:val="nil"/>
+              <w:insideH w:val="nil"/>
+              <w:insideV w:val="nil"/>
+            </w:tcBorders>
+          </w:tcPr>
+          <w:p>
+            <w:pPr>
+              <w:spacing w:line="264" w:lineRule="auto" w:after="0"/>
+              <w:jc w:val="center"/>
+            </w:pPr>
+            <w:r/>
+            <w:r>
+              <w:rPr>
+                <w:rFonts w:ascii="Times New Roman" w:hAnsi="Times New Roman" w:eastAsia="SimSun"/>
+                <w:b w:val="0"/>
+                <w:sz w:val="17"/>
+              </w:rPr>
+              <w:t>音色迁移层</w:t>
+            </w:r>
+          </w:p>
+        </w:tc>
+        <w:tc>
+          <w:tcPr>
+            <w:tcW w:type="dxa" w:w="4200"/>
+            <w:vAlign w:val="center"/>
+            <w:tcMar>
+              <w:top w:w="80" w:type="dxa"/>
+              <w:bottom w:w="80" w:type="dxa"/>
+              <w:start w:w="120" w:type="dxa"/>
+              <w:end w:w="120" w:type="dxa"/>
+            </w:tcMar>
+            <w:tcBorders>
+              <w:top w:val="nil"/>
+              <w:left w:val="nil"/>
+              <w:bottom w:val="nil"/>
+              <w:right w:val="nil"/>
+              <w:insideH w:val="nil"/>
+              <w:insideV w:val="nil"/>
+            </w:tcBorders>
+          </w:tcPr>
+          <w:p>
+            <w:pPr>
+              <w:spacing w:line="264" w:lineRule="auto" w:after="0"/>
+              <w:jc w:val="left"/>
+            </w:pPr>
+            <w:r/>
+            <w:r>
+              <w:rPr>
+                <w:rFonts w:ascii="Times New Roman" w:hAnsi="Times New Roman" w:eastAsia="SimSun"/>
+                <w:b w:val="0"/>
+                <w:sz w:val="17"/>
+              </w:rPr>
+              <w:t>Demucs 分轨、Seed-VC 转换、去沙哑、包络保持和重混</w:t>
+            </w:r>
+          </w:p>
+        </w:tc>
+        <w:tc>
+          <w:tcPr>
+            <w:tcW w:type="dxa" w:w="3460"/>
+            <w:vAlign w:val="center"/>
+            <w:tcMar>
+              <w:top w:w="80" w:type="dxa"/>
+              <w:bottom w:w="80" w:type="dxa"/>
+              <w:start w:w="120" w:type="dxa"/>
+              <w:end w:w="120" w:type="dxa"/>
+            </w:tcMar>
+            <w:tcBorders>
+              <w:top w:val="nil"/>
+              <w:left w:val="nil"/>
+              <w:bottom w:val="nil"/>
+              <w:right w:val="nil"/>
+              <w:insideH w:val="nil"/>
+              <w:insideV w:val="nil"/>
+            </w:tcBorders>
+          </w:tcPr>
+          <w:p>
+            <w:pPr>
+              <w:spacing w:line="264" w:lineRule="auto" w:after="0"/>
+              <w:jc w:val="left"/>
+            </w:pPr>
+            <w:r/>
+            <w:r>
+              <w:rPr>
+                <w:rFonts w:ascii="Times New Roman" w:hAnsi="Times New Roman" w:eastAsia="SimSun"/>
+                <w:b w:val="0"/>
+                <w:sz w:val="17"/>
+              </w:rPr>
+              <w:t>stems、converted vocals、mix wav、参数 JSON 和运行日志</w:t>
+            </w:r>
+          </w:p>
+        </w:tc>
+      </w:tr>
+      <w:tr>
+        <w:trPr>
+          <w:cantSplit/>
+        </w:trPr>
+        <w:tc>
+          <w:tcPr>
+            <w:tcW w:type="dxa" w:w="1700"/>
+            <w:vAlign w:val="center"/>
+            <w:tcMar>
+              <w:top w:w="80" w:type="dxa"/>
+              <w:bottom w:w="80" w:type="dxa"/>
+              <w:start w:w="120" w:type="dxa"/>
+              <w:end w:w="120" w:type="dxa"/>
+            </w:tcMar>
+            <w:tcBorders>
+              <w:top w:val="nil"/>
+              <w:left w:val="nil"/>
+              <w:bottom w:val="single" w:sz="12" w:color="000000"/>
+              <w:right w:val="nil"/>
+              <w:insideH w:val="nil"/>
+              <w:insideV w:val="nil"/>
+            </w:tcBorders>
+          </w:tcPr>
+          <w:p>
+            <w:pPr>
+              <w:spacing w:line="264" w:lineRule="auto" w:after="0"/>
+              <w:jc w:val="center"/>
+            </w:pPr>
+            <w:r/>
+            <w:r>
+              <w:rPr>
+                <w:rFonts w:ascii="Times New Roman" w:hAnsi="Times New Roman" w:eastAsia="SimSun"/>
+                <w:b w:val="0"/>
+                <w:sz w:val="17"/>
+              </w:rPr>
+              <w:t>评价层</w:t>
+            </w:r>
+          </w:p>
+        </w:tc>
+        <w:tc>
+          <w:tcPr>
+            <w:tcW w:type="dxa" w:w="4200"/>
+            <w:vAlign w:val="center"/>
+            <w:tcMar>
+              <w:top w:w="80" w:type="dxa"/>
+              <w:bottom w:w="80" w:type="dxa"/>
+              <w:start w:w="120" w:type="dxa"/>
+              <w:end w:w="120" w:type="dxa"/>
+            </w:tcMar>
+            <w:tcBorders>
+              <w:top w:val="nil"/>
+              <w:left w:val="nil"/>
+              <w:bottom w:val="single" w:sz="12" w:color="000000"/>
+              <w:right w:val="nil"/>
+              <w:insideH w:val="nil"/>
+              <w:insideV w:val="nil"/>
+            </w:tcBorders>
+          </w:tcPr>
+          <w:p>
+            <w:pPr>
+              <w:spacing w:line="264" w:lineRule="auto" w:after="0"/>
+              <w:jc w:val="left"/>
+            </w:pPr>
+            <w:r/>
+            <w:r>
+              <w:rPr>
+                <w:rFonts w:ascii="Times New Roman" w:hAnsi="Times New Roman" w:eastAsia="SimSun"/>
+                <w:b w:val="0"/>
+                <w:sz w:val="17"/>
+              </w:rPr>
+              <w:t>BPM、RMS、低频比例、onset、RTF、波形频谱和 Mel 水印</w:t>
+            </w:r>
+          </w:p>
+        </w:tc>
+        <w:tc>
+          <w:tcPr>
+            <w:tcW w:type="dxa" w:w="3460"/>
+            <w:vAlign w:val="center"/>
+            <w:tcMar>
+              <w:top w:w="80" w:type="dxa"/>
+              <w:bottom w:w="80" w:type="dxa"/>
+              <w:start w:w="120" w:type="dxa"/>
+              <w:end w:w="120" w:type="dxa"/>
+            </w:tcMar>
+            <w:tcBorders>
+              <w:top w:val="nil"/>
+              <w:left w:val="nil"/>
+              <w:bottom w:val="single" w:sz="12" w:color="000000"/>
+              <w:right w:val="nil"/>
+              <w:insideH w:val="nil"/>
+              <w:insideV w:val="nil"/>
+            </w:tcBorders>
+          </w:tcPr>
+          <w:p>
+            <w:pPr>
+              <w:spacing w:line="264" w:lineRule="auto" w:after="0"/>
+              <w:jc w:val="left"/>
+            </w:pPr>
+            <w:r/>
+            <w:r>
+              <w:rPr>
+                <w:rFonts w:ascii="Times New Roman" w:hAnsi="Times New Roman" w:eastAsia="SimSun"/>
+                <w:b w:val="0"/>
+                <w:sz w:val="17"/>
+              </w:rPr>
+              <w:t>指标表、诊断图、网页任务记录和最终报告图表</w:t>
+            </w:r>
+          </w:p>
+        </w:tc>
+      </w:tr>
+    </w:tbl>
+    <w:p>
+      <w:pPr>
+        <w:keepNext w:val="0"/>
+        <w:keepLines w:val="0"/>
+        <w:spacing w:line="276" w:lineRule="auto" w:after="80"/>
+      </w:pPr>
+      <w:r>
+        <w:rPr>
+          <w:rFonts w:ascii="Times New Roman" w:hAnsi="Times New Roman" w:eastAsia="SimSun"/>
+          <w:b w:val="0"/>
+          <w:sz w:val="4"/>
+        </w:rPr>
+      </w:r>
+    </w:p>
+    <w:p>
+      <w:pPr>
         <w:keepNext w:val="0"/>
         <w:keepLines w:val="0"/>
         <w:spacing w:line="276" w:lineRule="auto" w:after="80"/>
@@ -1879,7 +3277,7 @@
           <w:b/>
           <w:sz w:val="19"/>
         </w:rPr>
-        <w:t>表3 技术方案分层</w:t>
+        <w:t>表5 技术方案分层</w:t>
       </w:r>
     </w:p>
     <w:tbl>
@@ -2801,7 +4199,7 @@
           <w:b/>
           <w:sz w:val="24"/>
         </w:rPr>
-        <w:t>3.1 音乐生成与 LoRA 适配</w:t>
+        <w:t>3.2 音乐生成与 LoRA 适配</w:t>
       </w:r>
     </w:p>
     <w:p>
@@ -3163,7 +4561,7 @@
           <w:b/>
           <w:sz w:val="19"/>
         </w:rPr>
-        <w:t>表4 LoRA 音乐生成路径的训练与推理步骤</w:t>
+        <w:t>表6 LoRA 音乐生成路径的训练与推理步骤</w:t>
       </w:r>
     </w:p>
     <w:tbl>
@@ -3865,7 +5263,7 @@
           <w:b/>
           <w:sz w:val="24"/>
         </w:rPr>
-        <w:t>3.2 授权歌声音色转换链路</w:t>
+        <w:t>3.3 授权歌声音色转换链路</w:t>
       </w:r>
     </w:p>
     <w:p>
@@ -4168,7 +5566,7 @@
           <w:b/>
           <w:sz w:val="19"/>
         </w:rPr>
-        <w:t>表5 音色转换模块接口</w:t>
+        <w:t>表7 音色转换模块接口</w:t>
       </w:r>
     </w:p>
     <w:tbl>
@@ -4980,7 +6378,7 @@
           <w:b/>
           <w:sz w:val="24"/>
         </w:rPr>
-        <w:t>3.3 证据链与 AI 水印</w:t>
+        <w:t>3.4 证据链与 AI 水印</w:t>
       </w:r>
     </w:p>
     <w:p>
@@ -5088,6 +6486,520 @@
     </w:p>
     <w:p>
       <w:pPr>
+        <w:keepNext/>
+        <w:spacing w:before="140" w:after="100"/>
+      </w:pPr>
+      <w:r>
+        <w:rPr>
+          <w:rFonts w:ascii="Times New Roman" w:hAnsi="Times New Roman" w:eastAsia="SimSun"/>
+          <w:b/>
+          <w:sz w:val="24"/>
+        </w:rPr>
+        <w:t>4.1 数据集构建与切分原则</w:t>
+      </w:r>
+    </w:p>
+    <w:p>
+      <w:pPr>
+        <w:keepNext w:val="0"/>
+        <w:keepLines w:val="0"/>
+        <w:spacing w:line="276" w:lineRule="auto" w:after="80"/>
+        <w:ind w:firstLine="420"/>
+      </w:pPr>
+      <w:r>
+        <w:rPr>
+          <w:rFonts w:ascii="Times New Roman" w:hAnsi="Times New Roman" w:eastAsia="SimSun"/>
+          <w:b w:val="0"/>
+          <w:sz w:val="21"/>
+        </w:rPr>
+        <w:t>本文使用两级训练数据，而不是单一数据集。第一层为 6016 条 8 秒基础 EDM 片段，主要用于让 LoRA 学习目标数据域的音色纹理、节奏密度、低频能量和短时制作特征，训练/验证/测试划分为 4833/557/626。第二层为 360 条 15 秒段落级增强片段，来自 142 个来源，主要用于强化 intro、breakdown、build-up、drop 等段落结构。因此，论文中出现的 6000 余条 clip 与 300 余条段落样本并不矛盾：前者是基础微调样本规模，后者是面向段落结构的二次增强样本规模。</w:t>
+      </w:r>
+    </w:p>
+    <w:p>
+      <w:pPr>
+        <w:keepNext/>
+        <w:keepLines/>
+        <w:spacing w:line="276" w:lineRule="auto" w:after="80"/>
+        <w:jc w:val="center"/>
+      </w:pPr>
+      <w:r>
+        <w:rPr>
+          <w:rFonts w:ascii="Times New Roman" w:hAnsi="Times New Roman" w:eastAsia="SimSun"/>
+          <w:b/>
+          <w:sz w:val="19"/>
+        </w:rPr>
+        <w:t>表8 数据层级与训练目的</w:t>
+      </w:r>
+    </w:p>
+    <w:tbl>
+      <w:tblPr>
+        <w:tblW w:type="auto" w:w="0"/>
+        <w:jc w:val="center"/>
+        <w:tblLayout w:type="fixed"/>
+        <w:tblLook w:firstColumn="1" w:firstRow="1" w:lastColumn="0" w:lastRow="0" w:noHBand="0" w:noVBand="1" w:val="04A0"/>
+      </w:tblPr>
+      <w:tblGrid>
+        <w:gridCol w:w="3061"/>
+        <w:gridCol w:w="3061"/>
+        <w:gridCol w:w="3061"/>
+      </w:tblGrid>
+      <w:tr>
+        <w:trPr>
+          <w:cantSplit/>
+          <w:tblHeader w:val="true"/>
+        </w:trPr>
+        <w:tc>
+          <w:tcPr>
+            <w:tcW w:type="dxa" w:w="1900"/>
+            <w:vAlign w:val="center"/>
+            <w:tcMar>
+              <w:top w:w="80" w:type="dxa"/>
+              <w:bottom w:w="80" w:type="dxa"/>
+              <w:start w:w="120" w:type="dxa"/>
+              <w:end w:w="120" w:type="dxa"/>
+            </w:tcMar>
+            <w:tcBorders>
+              <w:top w:val="single" w:sz="12" w:color="000000"/>
+              <w:left w:val="nil"/>
+              <w:bottom w:val="single" w:sz="8" w:color="000000"/>
+              <w:right w:val="nil"/>
+              <w:insideH w:val="nil"/>
+              <w:insideV w:val="nil"/>
+            </w:tcBorders>
+          </w:tcPr>
+          <w:p>
+            <w:pPr>
+              <w:spacing w:line="264" w:lineRule="auto" w:after="0"/>
+              <w:jc w:val="center"/>
+            </w:pPr>
+            <w:r/>
+            <w:r>
+              <w:rPr>
+                <w:rFonts w:ascii="Times New Roman" w:hAnsi="Times New Roman" w:eastAsia="SimSun"/>
+                <w:b/>
+                <w:sz w:val="17"/>
+              </w:rPr>
+              <w:t>数据层级</w:t>
+            </w:r>
+          </w:p>
+        </w:tc>
+        <w:tc>
+          <w:tcPr>
+            <w:tcW w:type="dxa" w:w="3600"/>
+            <w:vAlign w:val="center"/>
+            <w:tcMar>
+              <w:top w:w="80" w:type="dxa"/>
+              <w:bottom w:w="80" w:type="dxa"/>
+              <w:start w:w="120" w:type="dxa"/>
+              <w:end w:w="120" w:type="dxa"/>
+            </w:tcMar>
+            <w:tcBorders>
+              <w:top w:val="single" w:sz="12" w:color="000000"/>
+              <w:left w:val="nil"/>
+              <w:bottom w:val="single" w:sz="8" w:color="000000"/>
+              <w:right w:val="nil"/>
+              <w:insideH w:val="nil"/>
+              <w:insideV w:val="nil"/>
+            </w:tcBorders>
+          </w:tcPr>
+          <w:p>
+            <w:pPr>
+              <w:spacing w:line="264" w:lineRule="auto" w:after="0"/>
+              <w:jc w:val="center"/>
+            </w:pPr>
+            <w:r/>
+            <w:r>
+              <w:rPr>
+                <w:rFonts w:ascii="Times New Roman" w:hAnsi="Times New Roman" w:eastAsia="SimSun"/>
+                <w:b/>
+                <w:sz w:val="17"/>
+              </w:rPr>
+              <w:t>规模与切分</w:t>
+            </w:r>
+          </w:p>
+        </w:tc>
+        <w:tc>
+          <w:tcPr>
+            <w:tcW w:type="dxa" w:w="3860"/>
+            <w:vAlign w:val="center"/>
+            <w:tcMar>
+              <w:top w:w="80" w:type="dxa"/>
+              <w:bottom w:w="80" w:type="dxa"/>
+              <w:start w:w="120" w:type="dxa"/>
+              <w:end w:w="120" w:type="dxa"/>
+            </w:tcMar>
+            <w:tcBorders>
+              <w:top w:val="single" w:sz="12" w:color="000000"/>
+              <w:left w:val="nil"/>
+              <w:bottom w:val="single" w:sz="8" w:color="000000"/>
+              <w:right w:val="nil"/>
+              <w:insideH w:val="nil"/>
+              <w:insideV w:val="nil"/>
+            </w:tcBorders>
+          </w:tcPr>
+          <w:p>
+            <w:pPr>
+              <w:spacing w:line="264" w:lineRule="auto" w:after="0"/>
+              <w:jc w:val="center"/>
+            </w:pPr>
+            <w:r/>
+            <w:r>
+              <w:rPr>
+                <w:rFonts w:ascii="Times New Roman" w:hAnsi="Times New Roman" w:eastAsia="SimSun"/>
+                <w:b/>
+                <w:sz w:val="17"/>
+              </w:rPr>
+              <w:t>训练目的</w:t>
+            </w:r>
+          </w:p>
+        </w:tc>
+      </w:tr>
+      <w:tr>
+        <w:trPr>
+          <w:cantSplit/>
+        </w:trPr>
+        <w:tc>
+          <w:tcPr>
+            <w:tcW w:type="dxa" w:w="1900"/>
+            <w:vAlign w:val="center"/>
+            <w:tcMar>
+              <w:top w:w="80" w:type="dxa"/>
+              <w:bottom w:w="80" w:type="dxa"/>
+              <w:start w:w="120" w:type="dxa"/>
+              <w:end w:w="120" w:type="dxa"/>
+            </w:tcMar>
+            <w:tcBorders>
+              <w:top w:val="nil"/>
+              <w:left w:val="nil"/>
+              <w:bottom w:val="nil"/>
+              <w:right w:val="nil"/>
+              <w:insideH w:val="nil"/>
+              <w:insideV w:val="nil"/>
+            </w:tcBorders>
+          </w:tcPr>
+          <w:p>
+            <w:pPr>
+              <w:spacing w:line="264" w:lineRule="auto" w:after="0"/>
+              <w:jc w:val="center"/>
+            </w:pPr>
+            <w:r/>
+            <w:r>
+              <w:rPr>
+                <w:rFonts w:ascii="Times New Roman" w:hAnsi="Times New Roman" w:eastAsia="SimSun"/>
+                <w:b w:val="0"/>
+                <w:sz w:val="17"/>
+              </w:rPr>
+              <w:t>基础 8 秒片段</w:t>
+            </w:r>
+          </w:p>
+        </w:tc>
+        <w:tc>
+          <w:tcPr>
+            <w:tcW w:type="dxa" w:w="3600"/>
+            <w:vAlign w:val="center"/>
+            <w:tcMar>
+              <w:top w:w="80" w:type="dxa"/>
+              <w:bottom w:w="80" w:type="dxa"/>
+              <w:start w:w="120" w:type="dxa"/>
+              <w:end w:w="120" w:type="dxa"/>
+            </w:tcMar>
+            <w:tcBorders>
+              <w:top w:val="nil"/>
+              <w:left w:val="nil"/>
+              <w:bottom w:val="nil"/>
+              <w:right w:val="nil"/>
+              <w:insideH w:val="nil"/>
+              <w:insideV w:val="nil"/>
+            </w:tcBorders>
+          </w:tcPr>
+          <w:p>
+            <w:pPr>
+              <w:spacing w:line="264" w:lineRule="auto" w:after="0"/>
+              <w:jc w:val="left"/>
+            </w:pPr>
+            <w:r/>
+            <w:r>
+              <w:rPr>
+                <w:rFonts w:ascii="Times New Roman" w:hAnsi="Times New Roman" w:eastAsia="SimSun"/>
+                <w:b w:val="0"/>
+                <w:sz w:val="17"/>
+              </w:rPr>
+              <w:t>6016 条；train/val/test=4833/557/626</w:t>
+            </w:r>
+          </w:p>
+        </w:tc>
+        <w:tc>
+          <w:tcPr>
+            <w:tcW w:type="dxa" w:w="3860"/>
+            <w:vAlign w:val="center"/>
+            <w:tcMar>
+              <w:top w:w="80" w:type="dxa"/>
+              <w:bottom w:w="80" w:type="dxa"/>
+              <w:start w:w="120" w:type="dxa"/>
+              <w:end w:w="120" w:type="dxa"/>
+            </w:tcMar>
+            <w:tcBorders>
+              <w:top w:val="nil"/>
+              <w:left w:val="nil"/>
+              <w:bottom w:val="nil"/>
+              <w:right w:val="nil"/>
+              <w:insideH w:val="nil"/>
+              <w:insideV w:val="nil"/>
+            </w:tcBorders>
+          </w:tcPr>
+          <w:p>
+            <w:pPr>
+              <w:spacing w:line="264" w:lineRule="auto" w:after="0"/>
+              <w:jc w:val="left"/>
+            </w:pPr>
+            <w:r/>
+            <w:r>
+              <w:rPr>
+                <w:rFonts w:ascii="Times New Roman" w:hAnsi="Times New Roman" w:eastAsia="SimSun"/>
+                <w:b w:val="0"/>
+                <w:sz w:val="17"/>
+              </w:rPr>
+              <w:t>学习短时音色、鼓组、低频、混音质感和目标域局部纹理</w:t>
+            </w:r>
+          </w:p>
+        </w:tc>
+      </w:tr>
+      <w:tr>
+        <w:trPr>
+          <w:cantSplit/>
+        </w:trPr>
+        <w:tc>
+          <w:tcPr>
+            <w:tcW w:type="dxa" w:w="1900"/>
+            <w:vAlign w:val="center"/>
+            <w:tcMar>
+              <w:top w:w="80" w:type="dxa"/>
+              <w:bottom w:w="80" w:type="dxa"/>
+              <w:start w:w="120" w:type="dxa"/>
+              <w:end w:w="120" w:type="dxa"/>
+            </w:tcMar>
+            <w:tcBorders>
+              <w:top w:val="nil"/>
+              <w:left w:val="nil"/>
+              <w:bottom w:val="nil"/>
+              <w:right w:val="nil"/>
+              <w:insideH w:val="nil"/>
+              <w:insideV w:val="nil"/>
+            </w:tcBorders>
+          </w:tcPr>
+          <w:p>
+            <w:pPr>
+              <w:spacing w:line="264" w:lineRule="auto" w:after="0"/>
+              <w:jc w:val="center"/>
+            </w:pPr>
+            <w:r/>
+            <w:r>
+              <w:rPr>
+                <w:rFonts w:ascii="Times New Roman" w:hAnsi="Times New Roman" w:eastAsia="SimSun"/>
+                <w:b w:val="0"/>
+                <w:sz w:val="17"/>
+              </w:rPr>
+              <w:t>段落 15 秒片段</w:t>
+            </w:r>
+          </w:p>
+        </w:tc>
+        <w:tc>
+          <w:tcPr>
+            <w:tcW w:type="dxa" w:w="3600"/>
+            <w:vAlign w:val="center"/>
+            <w:tcMar>
+              <w:top w:w="80" w:type="dxa"/>
+              <w:bottom w:w="80" w:type="dxa"/>
+              <w:start w:w="120" w:type="dxa"/>
+              <w:end w:w="120" w:type="dxa"/>
+            </w:tcMar>
+            <w:tcBorders>
+              <w:top w:val="nil"/>
+              <w:left w:val="nil"/>
+              <w:bottom w:val="nil"/>
+              <w:right w:val="nil"/>
+              <w:insideH w:val="nil"/>
+              <w:insideV w:val="nil"/>
+            </w:tcBorders>
+          </w:tcPr>
+          <w:p>
+            <w:pPr>
+              <w:spacing w:line="264" w:lineRule="auto" w:after="0"/>
+              <w:jc w:val="left"/>
+            </w:pPr>
+            <w:r/>
+            <w:r>
+              <w:rPr>
+                <w:rFonts w:ascii="Times New Roman" w:hAnsi="Times New Roman" w:eastAsia="SimSun"/>
+                <w:b w:val="0"/>
+                <w:sz w:val="17"/>
+              </w:rPr>
+              <w:t>360 条；drop=130, breakdown=86, build-up=65, intro=36, loop=25, outro=18</w:t>
+            </w:r>
+          </w:p>
+        </w:tc>
+        <w:tc>
+          <w:tcPr>
+            <w:tcW w:type="dxa" w:w="3860"/>
+            <w:vAlign w:val="center"/>
+            <w:tcMar>
+              <w:top w:w="80" w:type="dxa"/>
+              <w:bottom w:w="80" w:type="dxa"/>
+              <w:start w:w="120" w:type="dxa"/>
+              <w:end w:w="120" w:type="dxa"/>
+            </w:tcMar>
+            <w:tcBorders>
+              <w:top w:val="nil"/>
+              <w:left w:val="nil"/>
+              <w:bottom w:val="nil"/>
+              <w:right w:val="nil"/>
+              <w:insideH w:val="nil"/>
+              <w:insideV w:val="nil"/>
+            </w:tcBorders>
+          </w:tcPr>
+          <w:p>
+            <w:pPr>
+              <w:spacing w:line="264" w:lineRule="auto" w:after="0"/>
+              <w:jc w:val="left"/>
+            </w:pPr>
+            <w:r/>
+            <w:r>
+              <w:rPr>
+                <w:rFonts w:ascii="Times New Roman" w:hAnsi="Times New Roman" w:eastAsia="SimSun"/>
+                <w:b w:val="0"/>
+                <w:sz w:val="17"/>
+              </w:rPr>
+              <w:t>补充段落推进、drop 进入、build-up 铺垫和结构标签条件</w:t>
+            </w:r>
+          </w:p>
+        </w:tc>
+      </w:tr>
+      <w:tr>
+        <w:trPr>
+          <w:cantSplit/>
+        </w:trPr>
+        <w:tc>
+          <w:tcPr>
+            <w:tcW w:type="dxa" w:w="1900"/>
+            <w:vAlign w:val="center"/>
+            <w:tcMar>
+              <w:top w:w="80" w:type="dxa"/>
+              <w:bottom w:w="80" w:type="dxa"/>
+              <w:start w:w="120" w:type="dxa"/>
+              <w:end w:w="120" w:type="dxa"/>
+            </w:tcMar>
+            <w:tcBorders>
+              <w:top w:val="nil"/>
+              <w:left w:val="nil"/>
+              <w:bottom w:val="single" w:sz="12" w:color="000000"/>
+              <w:right w:val="nil"/>
+              <w:insideH w:val="nil"/>
+              <w:insideV w:val="nil"/>
+            </w:tcBorders>
+          </w:tcPr>
+          <w:p>
+            <w:pPr>
+              <w:spacing w:line="264" w:lineRule="auto" w:after="0"/>
+              <w:jc w:val="center"/>
+            </w:pPr>
+            <w:r/>
+            <w:r>
+              <w:rPr>
+                <w:rFonts w:ascii="Times New Roman" w:hAnsi="Times New Roman" w:eastAsia="SimSun"/>
+                <w:b w:val="0"/>
+                <w:sz w:val="17"/>
+              </w:rPr>
+              <w:t>授权音色样例</w:t>
+            </w:r>
+          </w:p>
+        </w:tc>
+        <w:tc>
+          <w:tcPr>
+            <w:tcW w:type="dxa" w:w="3600"/>
+            <w:vAlign w:val="center"/>
+            <w:tcMar>
+              <w:top w:w="80" w:type="dxa"/>
+              <w:bottom w:w="80" w:type="dxa"/>
+              <w:start w:w="120" w:type="dxa"/>
+              <w:end w:w="120" w:type="dxa"/>
+            </w:tcMar>
+            <w:tcBorders>
+              <w:top w:val="nil"/>
+              <w:left w:val="nil"/>
+              <w:bottom w:val="single" w:sz="12" w:color="000000"/>
+              <w:right w:val="nil"/>
+              <w:insideH w:val="nil"/>
+              <w:insideV w:val="nil"/>
+            </w:tcBorders>
+          </w:tcPr>
+          <w:p>
+            <w:pPr>
+              <w:spacing w:line="264" w:lineRule="auto" w:after="0"/>
+              <w:jc w:val="left"/>
+            </w:pPr>
+            <w:r/>
+            <w:r>
+              <w:rPr>
+                <w:rFonts w:ascii="Times New Roman" w:hAnsi="Times New Roman" w:eastAsia="SimSun"/>
+                <w:b w:val="0"/>
+                <w:sz w:val="17"/>
+              </w:rPr>
+              <w:t>匿名样例 E-VC-01；任务级记录</w:t>
+            </w:r>
+          </w:p>
+        </w:tc>
+        <w:tc>
+          <w:tcPr>
+            <w:tcW w:type="dxa" w:w="3860"/>
+            <w:vAlign w:val="center"/>
+            <w:tcMar>
+              <w:top w:w="80" w:type="dxa"/>
+              <w:bottom w:w="80" w:type="dxa"/>
+              <w:start w:w="120" w:type="dxa"/>
+              <w:end w:w="120" w:type="dxa"/>
+            </w:tcMar>
+            <w:tcBorders>
+              <w:top w:val="nil"/>
+              <w:left w:val="nil"/>
+              <w:bottom w:val="single" w:sz="12" w:color="000000"/>
+              <w:right w:val="nil"/>
+              <w:insideH w:val="nil"/>
+              <w:insideV w:val="nil"/>
+            </w:tcBorders>
+          </w:tcPr>
+          <w:p>
+            <w:pPr>
+              <w:spacing w:line="264" w:lineRule="auto" w:after="0"/>
+              <w:jc w:val="left"/>
+            </w:pPr>
+            <w:r/>
+            <w:r>
+              <w:rPr>
+                <w:rFonts w:ascii="Times New Roman" w:hAnsi="Times New Roman" w:eastAsia="SimSun"/>
+                <w:b w:val="0"/>
+                <w:sz w:val="17"/>
+              </w:rPr>
+              <w:t>验证源人声内容、目标音色、分轨伴奏和重混链路是否可复核</w:t>
+            </w:r>
+          </w:p>
+        </w:tc>
+      </w:tr>
+    </w:tbl>
+    <w:p>
+      <w:pPr>
+        <w:keepNext w:val="0"/>
+        <w:keepLines w:val="0"/>
+        <w:spacing w:line="276" w:lineRule="auto" w:after="80"/>
+      </w:pPr>
+      <w:r>
+        <w:rPr>
+          <w:rFonts w:ascii="Times New Roman" w:hAnsi="Times New Roman" w:eastAsia="SimSun"/>
+          <w:b w:val="0"/>
+          <w:sz w:val="4"/>
+        </w:rPr>
+      </w:r>
+    </w:p>
+    <w:p>
+      <w:pPr>
         <w:keepNext w:val="0"/>
         <w:keepLines w:val="0"/>
         <w:spacing w:line="276" w:lineRule="auto" w:after="80"/>
@@ -5115,7 +7027,7 @@
           <w:b/>
           <w:sz w:val="19"/>
         </w:rPr>
-        <w:t>表6 实验变量与控制条件</w:t>
+        <w:t>表9 实验变量与控制条件</w:t>
       </w:r>
     </w:p>
     <w:tbl>
@@ -5709,7 +7621,7 @@
           <w:b/>
           <w:sz w:val="19"/>
         </w:rPr>
-        <w:t>表7 客观指标与解释</w:t>
+        <w:t>表10 客观指标与解释</w:t>
       </w:r>
     </w:p>
     <w:tbl>
@@ -6681,7 +8593,7 @@
           <w:b w:val="0"/>
           <w:sz w:val="21"/>
         </w:rPr>
-        <w:t>在授权音色转换实验 E-VC-01 中，系统保存了从输入音频到最终重混结果的完整证据链。输出音频时长为 30.0 秒，采样率为 44100 Hz，BPM=136.0，RMS=0.0949，低频比例=0.0736，起音密度=2.40/s。这些指标不直接等价于主观音质，但可以用于判断分轨、重混和高频伪影是否出现明显异常。</w:t>
+        <w:t>在授权音色转换实验 E-VC-01 中，系统保存了从输入音频到最终重混结果的完整证据链。输出音频时长为 183.4 秒，采样率为 44100 Hz，BPM=110.0，RMS=0.1392，低频比例=0.4498，起音密度=3.97/s。这些指标不直接等价于主观音质，但可以用于判断分轨、重混和高频伪影是否出现明显异常。</w:t>
       </w:r>
     </w:p>
     <w:p>
@@ -6816,7 +8728,7 @@
           <w:b/>
           <w:sz w:val="19"/>
         </w:rPr>
-        <w:t>表8 授权音色转换实验记录</w:t>
+        <w:t>表11 授权音色转换实验记录</w:t>
       </w:r>
     </w:p>
     <w:tbl>
@@ -7157,7 +9069,7 @@
                 <w:b w:val="0"/>
                 <w:sz w:val="17"/>
               </w:rPr>
-              <w:t>30.0s / 44100Hz</w:t>
+              <w:t>183.4s / 44100Hz</w:t>
             </w:r>
           </w:p>
         </w:tc>
@@ -7342,7 +9254,7 @@
                 <w:b w:val="0"/>
                 <w:sz w:val="17"/>
               </w:rPr>
-              <w:t>BPM=136.0, RMS=0.0949</w:t>
+              <w:t>BPM=110.0, RMS=0.1392</w:t>
             </w:r>
           </w:p>
         </w:tc>
@@ -7377,7 +9289,7 @@
                 <w:b w:val="0"/>
                 <w:sz w:val="17"/>
               </w:rPr>
-              <w:t>低频比例=0.0736, onset=2.40/s</w:t>
+              <w:t>低频比例=0.4498, onset=3.97/s</w:t>
             </w:r>
           </w:p>
         </w:tc>
@@ -7487,7 +9399,7 @@
                 <w:b w:val="0"/>
                 <w:sz w:val="17"/>
               </w:rPr>
-              <w:t>RTF=19.12</w:t>
+              <w:t>RTF=20.71</w:t>
             </w:r>
           </w:p>
         </w:tc>
@@ -7566,7 +9478,7 @@
           <w:b/>
           <w:sz w:val="19"/>
         </w:rPr>
-        <w:t>表9 秒段落级 LoRA 二次微调方案</w:t>
+        <w:t>表12 秒段落级 LoRA 二次微调方案</w:t>
       </w:r>
     </w:p>
     <w:tbl>
@@ -8398,7 +10310,7 @@
           <w:b w:val="0"/>
           <w:sz w:val="21"/>
         </w:rPr>
-        <w:t>针对长音频任务，系统记录了输入时长约 279.7 秒、扩散步数 30、CFG=0.75、去沙哑强度 0.95、情感保持 1.00 和预计耗时约 230.3 分钟。整曲转换更适合作为离线实验执行，交互式系统适合先用短片段筛选转调量、CFG、扩散步数和后处理参数。</w:t>
+        <w:t>针对长音频任务，系统记录了输入时长约 183.4 秒、扩散步数 30、CFG=0.75、去沙哑强度 0.40、情感保持 0.55 和预计耗时约 152.1 分钟。整曲转换更适合作为离线实验执行，交互式系统适合先用短片段筛选转调量、CFG、扩散步数和后处理参数。</w:t>
       </w:r>
     </w:p>
     <w:p>
@@ -8647,7 +10559,7 @@
           <w:b/>
           <w:sz w:val="19"/>
         </w:rPr>
-        <w:t>表10 局限性与后续改进</w:t>
+        <w:t>表13 局限性与后续改进</w:t>
       </w:r>
     </w:p>
     <w:tbl>
@@ -9314,7 +11226,7 @@
           <w:b w:val="0"/>
           <w:sz w:val="21"/>
         </w:rPr>
-        <w:t>[3] Copet J, Kreuk F, Gat I, et al. Simple and Controllable Music Generation[C]//Advances in Neural Information Processing Systems. 2023.</w:t>
+        <w:t>[3] Agostinelli A, Denk T I, Borsos Z, et al. MusicLM: Generating Music From Text[J/OL]. arXiv:2301.11325, 2023.</w:t>
       </w:r>
     </w:p>
     <w:p>
@@ -9329,7 +11241,7 @@
           <w:b w:val="0"/>
           <w:sz w:val="21"/>
         </w:rPr>
-        <w:t>[4] Gong J, Zhao W, Wang S, Xu S, Guo J. ACE-Step: A Step Towards Music Generation Foundation Model[J/OL]. arXiv:2506.00045, 2025.</w:t>
+        <w:t>[4] Copet J, Kreuk F, Gat I, et al. Simple and Controllable Music Generation[C]//Advances in Neural Information Processing Systems. 2023.</w:t>
       </w:r>
     </w:p>
     <w:p>
@@ -9344,7 +11256,7 @@
           <w:b w:val="0"/>
           <w:sz w:val="21"/>
         </w:rPr>
-        <w:t>[5] Hu E J, Shen Y, Wallis P, et al. LoRA: Low-Rank Adaptation of Large Language Models[C]//International Conference on Learning Representations. 2022.</w:t>
+        <w:t>[5] Liu H, Chen Z, Yuan Y, et al. AudioLDM: Text-to-Audio Generation with Latent Diffusion Models[C]//International Conference on Machine Learning. 2023.</w:t>
       </w:r>
     </w:p>
     <w:p>
@@ -9359,7 +11271,7 @@
           <w:b w:val="0"/>
           <w:sz w:val="21"/>
         </w:rPr>
-        <w:t>[6] Qian K, Zhang Y, Chang S, Yang X, Hasegawa-Johnson M. AutoVC: Zero-Shot Voice Style Transfer with Only Autoencoder Loss[C]//International Conference on Machine Learning. 2019.</w:t>
+        <w:t>[6] Liu H, Tian Q, Yuan Y, et al. AudioLDM 2: Learning Holistic Audio Generation with Self-supervised Pretraining[C]//International Conference on Learning Representations. 2024.</w:t>
       </w:r>
     </w:p>
     <w:p>
@@ -9374,7 +11286,7 @@
           <w:b w:val="0"/>
           <w:sz w:val="21"/>
         </w:rPr>
-        <w:t>[7] Défossez A, Synnaeve G, Adi Y. Hybrid Spectrogram and Waveform Source Separation[C]//ISMIR Workshop, 2021.</w:t>
+        <w:t>[7] Gong J, Zhao W, Wang S, Xu S, Guo J. ACE-Step: A Step Towards Music Generation Foundation Model[J/OL]. arXiv:2506.00045, 2025.</w:t>
       </w:r>
     </w:p>
     <w:p>
@@ -9389,7 +11301,7 @@
           <w:b w:val="0"/>
           <w:sz w:val="21"/>
         </w:rPr>
-        <w:t>[8] Plachtaa. Seed-VC: zero-shot singing voice conversion toolkit[EB/OL]. GitHub repository.</w:t>
+        <w:t>[8] Hu E J, Shen Y, Wallis P, et al. LoRA: Low-Rank Adaptation of Large Language Models[C]//International Conference on Learning Representations. 2022.</w:t>
       </w:r>
     </w:p>
     <w:p>
@@ -9404,7 +11316,7 @@
           <w:b w:val="0"/>
           <w:sz w:val="21"/>
         </w:rPr>
-        <w:t>[9] Lee S, Ping W, Ginsburg B, Catanzaro B, Yoon S. BigVGAN: A Universal Neural Vocoder with Large-Scale Training[C]//International Conference on Learning Representations. 2023.</w:t>
+        <w:t>[9] Défossez A, Synnaeve G, Adi Y. Hybrid Spectrogram and Waveform Source Separation[C]//ISMIR Workshop, 2021.</w:t>
       </w:r>
     </w:p>
     <w:p>
@@ -9419,7 +11331,7 @@
           <w:b w:val="0"/>
           <w:sz w:val="21"/>
         </w:rPr>
-        <w:t>[10] McFee B, Raffel C, Liang D, et al. librosa: Audio and Music Signal Analysis in Python[C]//Proceedings of the 14th Python in Science Conference. 2015.</w:t>
+        <w:t>[10] Qian K, Zhang Y, Chang S, Yang X, Hasegawa-Johnson M. AutoVC: Zero-Shot Voice Style Transfer with Only Autoencoder Loss[C]//International Conference on Machine Learning. 2019.</w:t>
       </w:r>
     </w:p>
     <w:p>
@@ -9434,7 +11346,67 @@
           <w:b w:val="0"/>
           <w:sz w:val="21"/>
         </w:rPr>
-        <w:t>[11] Kilgour K, Zuluaga M, Roblek D, Sharifi M. Fréchet Audio Distance: A Reference-Free Metric for Evaluating Music Enhancement Algorithms[C]//Interspeech. 2019.</w:t>
+        <w:t>[11] Plachtaa. Seed-VC: zero-shot voice and singing voice conversion toolkit[EB/OL]. GitHub repository.</w:t>
+      </w:r>
+    </w:p>
+    <w:p>
+      <w:pPr>
+        <w:keepNext w:val="0"/>
+        <w:keepLines w:val="0"/>
+        <w:spacing w:line="276" w:lineRule="auto" w:after="80"/>
+      </w:pPr>
+      <w:r>
+        <w:rPr>
+          <w:rFonts w:ascii="Times New Roman" w:hAnsi="Times New Roman" w:eastAsia="SimSun"/>
+          <w:b w:val="0"/>
+          <w:sz w:val="21"/>
+        </w:rPr>
+        <w:t>[12] Lee S, Ping W, Ginsburg B, Catanzaro B, Yoon S. BigVGAN: A Universal Neural Vocoder with Large-Scale Training[C]//International Conference on Learning Representations. 2023.</w:t>
+      </w:r>
+    </w:p>
+    <w:p>
+      <w:pPr>
+        <w:keepNext w:val="0"/>
+        <w:keepLines w:val="0"/>
+        <w:spacing w:line="276" w:lineRule="auto" w:after="80"/>
+      </w:pPr>
+      <w:r>
+        <w:rPr>
+          <w:rFonts w:ascii="Times New Roman" w:hAnsi="Times New Roman" w:eastAsia="SimSun"/>
+          <w:b w:val="0"/>
+          <w:sz w:val="21"/>
+        </w:rPr>
+        <w:t>[13] Li Y, Yuan R, Zhang G, et al. MERT: Acoustic Music Understanding Model with Large-Scale Self-supervised Training[J/OL]. arXiv:2306.00107, 2023.</w:t>
+      </w:r>
+    </w:p>
+    <w:p>
+      <w:pPr>
+        <w:keepNext w:val="0"/>
+        <w:keepLines w:val="0"/>
+        <w:spacing w:line="276" w:lineRule="auto" w:after="80"/>
+      </w:pPr>
+      <w:r>
+        <w:rPr>
+          <w:rFonts w:ascii="Times New Roman" w:hAnsi="Times New Roman" w:eastAsia="SimSun"/>
+          <w:b w:val="0"/>
+          <w:sz w:val="21"/>
+        </w:rPr>
+        <w:t>[14] McFee B, Raffel C, Liang D, et al. librosa: Audio and Music Signal Analysis in Python[C]//Proceedings of the 14th Python in Science Conference. 2015.</w:t>
+      </w:r>
+    </w:p>
+    <w:p>
+      <w:pPr>
+        <w:keepNext w:val="0"/>
+        <w:keepLines w:val="0"/>
+        <w:spacing w:line="276" w:lineRule="auto" w:after="80"/>
+      </w:pPr>
+      <w:r>
+        <w:rPr>
+          <w:rFonts w:ascii="Times New Roman" w:hAnsi="Times New Roman" w:eastAsia="SimSun"/>
+          <w:b w:val="0"/>
+          <w:sz w:val="21"/>
+        </w:rPr>
+        <w:t>[15] Kilgour K, Zuluaga M, Roblek D, Sharifi M. Fréchet Audio Distance: A Reference-Free Metric for Evaluating Music Enhancement Algorithms[C]//Interspeech. 2019.</w:t>
       </w:r>
     </w:p>
     <w:sectPr>

</xml_diff>